<commit_message>
docs(module3): apply in/out/sub attribute convention to BCE analysis diagrams
Update II.3 BCE class diagrams and narratives to use the prefix convention
from the analysis class diagram reference:
- in: input fields (inClassSection, inSession, inSemester)
- out: display-only components (outAttendanceList, outGradeDetail)
- sub: submit/action buttons (subGenerateQr, subDeactivateQr, subSaveManual, subSubmitGrades)
- outsub: display + clickable (outsubListClass, outsubAttendance, outsubCourseList)
- inout: editable table showing existing data (inoutGrades)

Co-Authored-By: Claude Sonnet 4.6 <noreply@anthropic.com>
</commit_message>
<xml_diff>
--- a/report/module3_attendance_grades.docx
+++ b/report/module3_attendance_grades.docx
@@ -4986,49 +4986,13 @@
           <w:sz w:val="28"/>
           <w:szCs w:val="28"/>
         </w:rPr>
-        <w:t xml:space="preserve"> với ô tìm lớp, nút </w:t>
-      </w:r>
-      <w:r>
-        <w:rPr>
-          <w:rFonts w:ascii="Times New Roman" w:cs="Times New Roman" w:eastAsia="Times New Roman" w:hAnsi="Times New Roman"/>
-          <w:b/>
-          <w:bCs/>
-          <w:sz w:val="28"/>
-          <w:szCs w:val="28"/>
-        </w:rPr>
-        <w:t xml:space="preserve">Tạo mã QR</w:t>
-      </w:r>
-      <w:r>
-        <w:rPr>
-          <w:rFonts w:ascii="Times New Roman" w:cs="Times New Roman" w:eastAsia="Times New Roman" w:hAnsi="Times New Roman"/>
-          <w:sz w:val="28"/>
-          <w:szCs w:val="28"/>
-        </w:rPr>
-        <w:t xml:space="preserve">, nút </w:t>
-      </w:r>
-      <w:r>
-        <w:rPr>
-          <w:rFonts w:ascii="Times New Roman" w:cs="Times New Roman" w:eastAsia="Times New Roman" w:hAnsi="Times New Roman"/>
-          <w:b/>
-          <w:bCs/>
-          <w:sz w:val="28"/>
-          <w:szCs w:val="28"/>
-        </w:rPr>
-        <w:t xml:space="preserve">Tắt mã QR</w:t>
-      </w:r>
-      <w:r>
-        <w:rPr>
-          <w:rFonts w:ascii="Times New Roman" w:cs="Times New Roman" w:eastAsia="Times New Roman" w:hAnsi="Times New Roman"/>
-          <w:sz w:val="28"/>
-          <w:szCs w:val="28"/>
-        </w:rPr>
-        <w:t xml:space="preserve"> và bảng danh sách điểm danh.</w:t>
+        <w:t xml:space="preserve"> với:</w:t>
       </w:r>
     </w:p>
     <w:p>
       <w:pPr>
         <w:spacing w:after="0" w:before="60" w:line="360" w:lineRule="auto"/>
-        <w:ind w:left="566"/>
+        <w:ind w:left="963"/>
       </w:pPr>
       <w:r>
         <w:rPr>
@@ -5040,11 +5004,161 @@
       </w:r>
       <w:r>
         <w:rPr>
-          <w:rFonts w:ascii="Times New Roman" w:cs="Times New Roman" w:eastAsia="Times New Roman" w:hAnsi="Times New Roman"/>
-          <w:sz w:val="28"/>
-          <w:szCs w:val="28"/>
-        </w:rPr>
-        <w:t xml:space="preserve">GV tìm và chọn lớp học phần → </w:t>
+          <w:rFonts w:ascii="Courier New" w:cs="Courier New" w:eastAsia="Courier New" w:hAnsi="Courier New"/>
+          <w:sz w:val="22"/>
+          <w:szCs w:val="22"/>
+        </w:rPr>
+        <w:t xml:space="preserve">inClassSection</w:t>
+      </w:r>
+      <w:r>
+        <w:rPr>
+          <w:rFonts w:ascii="Times New Roman" w:cs="Times New Roman" w:eastAsia="Times New Roman" w:hAnsi="Times New Roman"/>
+          <w:sz w:val="28"/>
+          <w:szCs w:val="28"/>
+        </w:rPr>
+        <w:t xml:space="preserve"> — ô nhập từ khóa tìm lớp học phần</w:t>
+      </w:r>
+    </w:p>
+    <w:p>
+      <w:pPr>
+        <w:spacing w:after="0" w:before="60" w:line="360" w:lineRule="auto"/>
+        <w:ind w:left="963"/>
+      </w:pPr>
+      <w:r>
+        <w:rPr>
+          <w:rFonts w:ascii="Times New Roman" w:cs="Times New Roman" w:eastAsia="Times New Roman" w:hAnsi="Times New Roman"/>
+          <w:sz w:val="28"/>
+          <w:szCs w:val="28"/>
+        </w:rPr>
+        <w:t xml:space="preserve">• </w:t>
+      </w:r>
+      <w:r>
+        <w:rPr>
+          <w:rFonts w:ascii="Courier New" w:cs="Courier New" w:eastAsia="Courier New" w:hAnsi="Courier New"/>
+          <w:sz w:val="22"/>
+          <w:szCs w:val="22"/>
+        </w:rPr>
+        <w:t xml:space="preserve">outsubListClass</w:t>
+      </w:r>
+      <w:r>
+        <w:rPr>
+          <w:rFonts w:ascii="Times New Roman" w:cs="Times New Roman" w:eastAsia="Times New Roman" w:hAnsi="Times New Roman"/>
+          <w:sz w:val="28"/>
+          <w:szCs w:val="28"/>
+        </w:rPr>
+        <w:t xml:space="preserve"> — bảng kết quả lớp học phần (hiển thị và chọn)</w:t>
+      </w:r>
+    </w:p>
+    <w:p>
+      <w:pPr>
+        <w:spacing w:after="0" w:before="60" w:line="360" w:lineRule="auto"/>
+        <w:ind w:left="963"/>
+      </w:pPr>
+      <w:r>
+        <w:rPr>
+          <w:rFonts w:ascii="Times New Roman" w:cs="Times New Roman" w:eastAsia="Times New Roman" w:hAnsi="Times New Roman"/>
+          <w:sz w:val="28"/>
+          <w:szCs w:val="28"/>
+        </w:rPr>
+        <w:t xml:space="preserve">• </w:t>
+      </w:r>
+      <w:r>
+        <w:rPr>
+          <w:rFonts w:ascii="Courier New" w:cs="Courier New" w:eastAsia="Courier New" w:hAnsi="Courier New"/>
+          <w:sz w:val="22"/>
+          <w:szCs w:val="22"/>
+        </w:rPr>
+        <w:t xml:space="preserve">subGenerateQr</w:t>
+      </w:r>
+      <w:r>
+        <w:rPr>
+          <w:rFonts w:ascii="Times New Roman" w:cs="Times New Roman" w:eastAsia="Times New Roman" w:hAnsi="Times New Roman"/>
+          <w:sz w:val="28"/>
+          <w:szCs w:val="28"/>
+        </w:rPr>
+        <w:t xml:space="preserve"> — nút "Tạo mã QR"</w:t>
+      </w:r>
+    </w:p>
+    <w:p>
+      <w:pPr>
+        <w:spacing w:after="0" w:before="60" w:line="360" w:lineRule="auto"/>
+        <w:ind w:left="963"/>
+      </w:pPr>
+      <w:r>
+        <w:rPr>
+          <w:rFonts w:ascii="Times New Roman" w:cs="Times New Roman" w:eastAsia="Times New Roman" w:hAnsi="Times New Roman"/>
+          <w:sz w:val="28"/>
+          <w:szCs w:val="28"/>
+        </w:rPr>
+        <w:t xml:space="preserve">• </w:t>
+      </w:r>
+      <w:r>
+        <w:rPr>
+          <w:rFonts w:ascii="Courier New" w:cs="Courier New" w:eastAsia="Courier New" w:hAnsi="Courier New"/>
+          <w:sz w:val="22"/>
+          <w:szCs w:val="22"/>
+        </w:rPr>
+        <w:t xml:space="preserve">subDeactivateQr</w:t>
+      </w:r>
+      <w:r>
+        <w:rPr>
+          <w:rFonts w:ascii="Times New Roman" w:cs="Times New Roman" w:eastAsia="Times New Roman" w:hAnsi="Times New Roman"/>
+          <w:sz w:val="28"/>
+          <w:szCs w:val="28"/>
+        </w:rPr>
+        <w:t xml:space="preserve"> — nút "Tắt mã QR"</w:t>
+      </w:r>
+    </w:p>
+    <w:p>
+      <w:pPr>
+        <w:spacing w:after="0" w:before="60" w:line="360" w:lineRule="auto"/>
+        <w:ind w:left="963"/>
+      </w:pPr>
+      <w:r>
+        <w:rPr>
+          <w:rFonts w:ascii="Times New Roman" w:cs="Times New Roman" w:eastAsia="Times New Roman" w:hAnsi="Times New Roman"/>
+          <w:sz w:val="28"/>
+          <w:szCs w:val="28"/>
+        </w:rPr>
+        <w:t xml:space="preserve">• </w:t>
+      </w:r>
+      <w:r>
+        <w:rPr>
+          <w:rFonts w:ascii="Courier New" w:cs="Courier New" w:eastAsia="Courier New" w:hAnsi="Courier New"/>
+          <w:sz w:val="22"/>
+          <w:szCs w:val="22"/>
+        </w:rPr>
+        <w:t xml:space="preserve">outAttendanceList</w:t>
+      </w:r>
+      <w:r>
+        <w:rPr>
+          <w:rFonts w:ascii="Times New Roman" w:cs="Times New Roman" w:eastAsia="Times New Roman" w:hAnsi="Times New Roman"/>
+          <w:sz w:val="28"/>
+          <w:szCs w:val="28"/>
+        </w:rPr>
+        <w:t xml:space="preserve"> — bảng danh sách sinh viên kèm trạng thái điểm danh</w:t>
+      </w:r>
+    </w:p>
+    <w:p>
+      <w:pPr>
+        <w:spacing w:after="0" w:before="60" w:line="360" w:lineRule="auto"/>
+        <w:ind w:left="566"/>
+      </w:pPr>
+      <w:r>
+        <w:rPr>
+          <w:rFonts w:ascii="Times New Roman" w:cs="Times New Roman" w:eastAsia="Times New Roman" w:hAnsi="Times New Roman"/>
+          <w:sz w:val="28"/>
+          <w:szCs w:val="28"/>
+        </w:rPr>
+        <w:t xml:space="preserve">• </w:t>
+      </w:r>
+      <w:r>
+        <w:rPr>
+          <w:rFonts w:ascii="Times New Roman" w:cs="Times New Roman" w:eastAsia="Times New Roman" w:hAnsi="Times New Roman"/>
+          <w:sz w:val="28"/>
+          <w:szCs w:val="28"/>
+        </w:rPr>
+        <w:t xml:space="preserve">GV nhập từ khóa và nhấn tìm → </w:t>
       </w:r>
       <w:r>
         <w:rPr>
@@ -5092,6 +5206,22 @@
           <w:sz w:val="28"/>
           <w:szCs w:val="28"/>
         </w:rPr>
+        <w:t xml:space="preserve">; kết quả hiển thị ở </w:t>
+      </w:r>
+      <w:r>
+        <w:rPr>
+          <w:rFonts w:ascii="Courier New" w:cs="Courier New" w:eastAsia="Courier New" w:hAnsi="Courier New"/>
+          <w:sz w:val="22"/>
+          <w:szCs w:val="22"/>
+        </w:rPr>
+        <w:t xml:space="preserve">outsubListClass</w:t>
+      </w:r>
+      <w:r>
+        <w:rPr>
+          <w:rFonts w:ascii="Times New Roman" w:cs="Times New Roman" w:eastAsia="Times New Roman" w:hAnsi="Times New Roman"/>
+          <w:sz w:val="28"/>
+          <w:szCs w:val="28"/>
+        </w:rPr>
         <w:t xml:space="preserve">.</w:t>
       </w:r>
     </w:p>
@@ -5114,7 +5244,23 @@
           <w:sz w:val="28"/>
           <w:szCs w:val="28"/>
         </w:rPr>
-        <w:t xml:space="preserve">GV chọn buổi học và nhấn "Tạo mã QR" → </w:t>
+        <w:t xml:space="preserve">GV chọn lớp, chọn buổi học và nhấn </w:t>
+      </w:r>
+      <w:r>
+        <w:rPr>
+          <w:rFonts w:ascii="Courier New" w:cs="Courier New" w:eastAsia="Courier New" w:hAnsi="Courier New"/>
+          <w:sz w:val="22"/>
+          <w:szCs w:val="22"/>
+        </w:rPr>
+        <w:t xml:space="preserve">subGenerateQr</w:t>
+      </w:r>
+      <w:r>
+        <w:rPr>
+          <w:rFonts w:ascii="Times New Roman" w:cs="Times New Roman" w:eastAsia="Times New Roman" w:hAnsi="Times New Roman"/>
+          <w:sz w:val="28"/>
+          <w:szCs w:val="28"/>
+        </w:rPr>
+        <w:t xml:space="preserve"> → </w:t>
       </w:r>
       <w:r>
         <w:rPr>
@@ -5200,7 +5346,7 @@
           <w:sz w:val="28"/>
           <w:szCs w:val="28"/>
         </w:rPr>
-        <w:t xml:space="preserve"> cập nhật giao diện với mã QR.</w:t>
+        <w:t xml:space="preserve"> cập nhật giao diện.</w:t>
       </w:r>
     </w:p>
     <w:p>
@@ -5222,7 +5368,23 @@
           <w:sz w:val="28"/>
           <w:szCs w:val="28"/>
         </w:rPr>
-        <w:t xml:space="preserve">GV nhấn "Tắt mã QR" → </w:t>
+        <w:t xml:space="preserve">GV nhấn </w:t>
+      </w:r>
+      <w:r>
+        <w:rPr>
+          <w:rFonts w:ascii="Courier New" w:cs="Courier New" w:eastAsia="Courier New" w:hAnsi="Courier New"/>
+          <w:sz w:val="22"/>
+          <w:szCs w:val="22"/>
+        </w:rPr>
+        <w:t xml:space="preserve">subDeactivateQr</w:t>
+      </w:r>
+      <w:r>
+        <w:rPr>
+          <w:rFonts w:ascii="Times New Roman" w:cs="Times New Roman" w:eastAsia="Times New Roman" w:hAnsi="Times New Roman"/>
+          <w:sz w:val="28"/>
+          <w:szCs w:val="28"/>
+        </w:rPr>
+        <w:t xml:space="preserve"> → </w:t>
       </w:r>
       <w:r>
         <w:rPr>
@@ -5300,15 +5462,15 @@
           <w:sz w:val="22"/>
           <w:szCs w:val="22"/>
         </w:rPr>
-        <w:t xml:space="preserve">QRSessionView</w:t>
-      </w:r>
-      <w:r>
-        <w:rPr>
-          <w:rFonts w:ascii="Times New Roman" w:cs="Times New Roman" w:eastAsia="Times New Roman" w:hAnsi="Times New Roman"/>
-          <w:sz w:val="28"/>
-          <w:szCs w:val="28"/>
-        </w:rPr>
-        <w:t xml:space="preserve"> cập nhật danh sách.</w:t>
+        <w:t xml:space="preserve">outAttendanceList</w:t>
+      </w:r>
+      <w:r>
+        <w:rPr>
+          <w:rFonts w:ascii="Times New Roman" w:cs="Times New Roman" w:eastAsia="Times New Roman" w:hAnsi="Times New Roman"/>
+          <w:sz w:val="28"/>
+          <w:szCs w:val="28"/>
+        </w:rPr>
+        <w:t xml:space="preserve"> cập nhật trạng thái.</w:t>
       </w:r>
     </w:p>
     <w:p>
@@ -5324,7 +5486,7 @@
       <w:r>
         <w:drawing>
           <wp:inline distT="0" distB="0" distL="0" distR="0">
-            <wp:extent cx="5048250" cy="3333750"/>
+            <wp:extent cx="5048250" cy="3305175"/>
             <wp:effectExtent t="0" r="0" b="0" l="0"/>
             <wp:docPr id="1" name="" descr="" title=""/>
             <wp:cNvGraphicFramePr>
@@ -5349,7 +5511,7 @@
                   <pic:spPr bwMode="auto">
                     <a:xfrm>
                       <a:off x="0" y="0"/>
-                      <a:ext cx="5048250" cy="3333750"/>
+                      <a:ext cx="5048250" cy="3305175"/>
                     </a:xfrm>
                     <a:prstGeom prst="rect">
                       <a:avLst/>
@@ -5466,13 +5628,13 @@
           <w:sz w:val="28"/>
           <w:szCs w:val="28"/>
         </w:rPr>
-        <w:t xml:space="preserve"> với dropdown chọn buổi học và bảng danh sách SV kèm trạng thái.</w:t>
+        <w:t xml:space="preserve"> với:</w:t>
       </w:r>
     </w:p>
     <w:p>
       <w:pPr>
         <w:spacing w:after="0" w:before="60" w:line="360" w:lineRule="auto"/>
-        <w:ind w:left="566"/>
+        <w:ind w:left="963"/>
       </w:pPr>
       <w:r>
         <w:rPr>
@@ -5484,11 +5646,117 @@
       </w:r>
       <w:r>
         <w:rPr>
-          <w:rFonts w:ascii="Times New Roman" w:cs="Times New Roman" w:eastAsia="Times New Roman" w:hAnsi="Times New Roman"/>
-          <w:sz w:val="28"/>
-          <w:szCs w:val="28"/>
-        </w:rPr>
-        <w:t xml:space="preserve">GV chọn buổi học → </w:t>
+          <w:rFonts w:ascii="Courier New" w:cs="Courier New" w:eastAsia="Courier New" w:hAnsi="Courier New"/>
+          <w:sz w:val="22"/>
+          <w:szCs w:val="22"/>
+        </w:rPr>
+        <w:t xml:space="preserve">inSession</w:t>
+      </w:r>
+      <w:r>
+        <w:rPr>
+          <w:rFonts w:ascii="Times New Roman" w:cs="Times New Roman" w:eastAsia="Times New Roman" w:hAnsi="Times New Roman"/>
+          <w:sz w:val="28"/>
+          <w:szCs w:val="28"/>
+        </w:rPr>
+        <w:t xml:space="preserve"> — dropdown chọn buổi học</w:t>
+      </w:r>
+    </w:p>
+    <w:p>
+      <w:pPr>
+        <w:spacing w:after="0" w:before="60" w:line="360" w:lineRule="auto"/>
+        <w:ind w:left="963"/>
+      </w:pPr>
+      <w:r>
+        <w:rPr>
+          <w:rFonts w:ascii="Times New Roman" w:cs="Times New Roman" w:eastAsia="Times New Roman" w:hAnsi="Times New Roman"/>
+          <w:sz w:val="28"/>
+          <w:szCs w:val="28"/>
+        </w:rPr>
+        <w:t xml:space="preserve">• </w:t>
+      </w:r>
+      <w:r>
+        <w:rPr>
+          <w:rFonts w:ascii="Courier New" w:cs="Courier New" w:eastAsia="Courier New" w:hAnsi="Courier New"/>
+          <w:sz w:val="22"/>
+          <w:szCs w:val="22"/>
+        </w:rPr>
+        <w:t xml:space="preserve">outsubAttendance</w:t>
+      </w:r>
+      <w:r>
+        <w:rPr>
+          <w:rFonts w:ascii="Times New Roman" w:cs="Times New Roman" w:eastAsia="Times New Roman" w:hAnsi="Times New Roman"/>
+          <w:sz w:val="28"/>
+          <w:szCs w:val="28"/>
+        </w:rPr>
+        <w:t xml:space="preserve"> — bảng danh sách SV kèm trạng thái điểm danh (hiển thị và chọn để sửa)</w:t>
+      </w:r>
+    </w:p>
+    <w:p>
+      <w:pPr>
+        <w:spacing w:after="0" w:before="60" w:line="360" w:lineRule="auto"/>
+        <w:ind w:left="963"/>
+      </w:pPr>
+      <w:r>
+        <w:rPr>
+          <w:rFonts w:ascii="Times New Roman" w:cs="Times New Roman" w:eastAsia="Times New Roman" w:hAnsi="Times New Roman"/>
+          <w:sz w:val="28"/>
+          <w:szCs w:val="28"/>
+        </w:rPr>
+        <w:t xml:space="preserve">• </w:t>
+      </w:r>
+      <w:r>
+        <w:rPr>
+          <w:rFonts w:ascii="Courier New" w:cs="Courier New" w:eastAsia="Courier New" w:hAnsi="Courier New"/>
+          <w:sz w:val="22"/>
+          <w:szCs w:val="22"/>
+        </w:rPr>
+        <w:t xml:space="preserve">subSaveManual</w:t>
+      </w:r>
+      <w:r>
+        <w:rPr>
+          <w:rFonts w:ascii="Times New Roman" w:cs="Times New Roman" w:eastAsia="Times New Roman" w:hAnsi="Times New Roman"/>
+          <w:sz w:val="28"/>
+          <w:szCs w:val="28"/>
+        </w:rPr>
+        <w:t xml:space="preserve"> — nút "Lưu" trạng thái điểm danh thủ công</w:t>
+      </w:r>
+    </w:p>
+    <w:p>
+      <w:pPr>
+        <w:spacing w:after="0" w:before="60" w:line="360" w:lineRule="auto"/>
+        <w:ind w:left="566"/>
+      </w:pPr>
+      <w:r>
+        <w:rPr>
+          <w:rFonts w:ascii="Times New Roman" w:cs="Times New Roman" w:eastAsia="Times New Roman" w:hAnsi="Times New Roman"/>
+          <w:sz w:val="28"/>
+          <w:szCs w:val="28"/>
+        </w:rPr>
+        <w:t xml:space="preserve">• </w:t>
+      </w:r>
+      <w:r>
+        <w:rPr>
+          <w:rFonts w:ascii="Times New Roman" w:cs="Times New Roman" w:eastAsia="Times New Roman" w:hAnsi="Times New Roman"/>
+          <w:sz w:val="28"/>
+          <w:szCs w:val="28"/>
+        </w:rPr>
+        <w:t xml:space="preserve">GV chọn buổi học qua </w:t>
+      </w:r>
+      <w:r>
+        <w:rPr>
+          <w:rFonts w:ascii="Courier New" w:cs="Courier New" w:eastAsia="Courier New" w:hAnsi="Courier New"/>
+          <w:sz w:val="22"/>
+          <w:szCs w:val="22"/>
+        </w:rPr>
+        <w:t xml:space="preserve">inSession</w:t>
+      </w:r>
+      <w:r>
+        <w:rPr>
+          <w:rFonts w:ascii="Times New Roman" w:cs="Times New Roman" w:eastAsia="Times New Roman" w:hAnsi="Times New Roman"/>
+          <w:sz w:val="28"/>
+          <w:szCs w:val="28"/>
+        </w:rPr>
+        <w:t xml:space="preserve"> → </w:t>
       </w:r>
       <w:r>
         <w:rPr>
@@ -5536,6 +5804,22 @@
           <w:sz w:val="28"/>
           <w:szCs w:val="28"/>
         </w:rPr>
+        <w:t xml:space="preserve">; kết quả hiển thị ở </w:t>
+      </w:r>
+      <w:r>
+        <w:rPr>
+          <w:rFonts w:ascii="Courier New" w:cs="Courier New" w:eastAsia="Courier New" w:hAnsi="Courier New"/>
+          <w:sz w:val="22"/>
+          <w:szCs w:val="22"/>
+        </w:rPr>
+        <w:t xml:space="preserve">outsubAttendance</w:t>
+      </w:r>
+      <w:r>
+        <w:rPr>
+          <w:rFonts w:ascii="Times New Roman" w:cs="Times New Roman" w:eastAsia="Times New Roman" w:hAnsi="Times New Roman"/>
+          <w:sz w:val="28"/>
+          <w:szCs w:val="28"/>
+        </w:rPr>
         <w:t xml:space="preserve">.</w:t>
       </w:r>
     </w:p>
@@ -5558,7 +5842,39 @@
           <w:sz w:val="28"/>
           <w:szCs w:val="28"/>
         </w:rPr>
-        <w:t xml:space="preserve">Hệ thống hiển thị danh sách SV với trạng thái, giờ điểm danh và hình thức → </w:t>
+        <w:t xml:space="preserve">GV chọn SV trong </w:t>
+      </w:r>
+      <w:r>
+        <w:rPr>
+          <w:rFonts w:ascii="Courier New" w:cs="Courier New" w:eastAsia="Courier New" w:hAnsi="Courier New"/>
+          <w:sz w:val="22"/>
+          <w:szCs w:val="22"/>
+        </w:rPr>
+        <w:t xml:space="preserve">outsubAttendance</w:t>
+      </w:r>
+      <w:r>
+        <w:rPr>
+          <w:rFonts w:ascii="Times New Roman" w:cs="Times New Roman" w:eastAsia="Times New Roman" w:hAnsi="Times New Roman"/>
+          <w:sz w:val="28"/>
+          <w:szCs w:val="28"/>
+        </w:rPr>
+        <w:t xml:space="preserve"> và chỉnh trạng thái → nhấn </w:t>
+      </w:r>
+      <w:r>
+        <w:rPr>
+          <w:rFonts w:ascii="Courier New" w:cs="Courier New" w:eastAsia="Courier New" w:hAnsi="Courier New"/>
+          <w:sz w:val="22"/>
+          <w:szCs w:val="22"/>
+        </w:rPr>
+        <w:t xml:space="preserve">subSaveManual</w:t>
+      </w:r>
+      <w:r>
+        <w:rPr>
+          <w:rFonts w:ascii="Times New Roman" w:cs="Times New Roman" w:eastAsia="Times New Roman" w:hAnsi="Times New Roman"/>
+          <w:sz w:val="28"/>
+          <w:szCs w:val="28"/>
+        </w:rPr>
+        <w:t xml:space="preserve"> → </w:t>
       </w:r>
       <w:r>
         <w:rPr>
@@ -5574,7 +5890,39 @@
           <w:sz w:val="28"/>
           <w:szCs w:val="28"/>
         </w:rPr>
-        <w:t xml:space="preserve"> cập nhật bảng.</w:t>
+        <w:t xml:space="preserve"> gọi </w:t>
+      </w:r>
+      <w:r>
+        <w:rPr>
+          <w:rFonts w:ascii="Courier New" w:cs="Courier New" w:eastAsia="Courier New" w:hAnsi="Courier New"/>
+          <w:sz w:val="22"/>
+          <w:szCs w:val="22"/>
+        </w:rPr>
+        <w:t xml:space="preserve">markManualAttendance()</w:t>
+      </w:r>
+      <w:r>
+        <w:rPr>
+          <w:rFonts w:ascii="Times New Roman" w:cs="Times New Roman" w:eastAsia="Times New Roman" w:hAnsi="Times New Roman"/>
+          <w:sz w:val="28"/>
+          <w:szCs w:val="28"/>
+        </w:rPr>
+        <w:t xml:space="preserve"> của lớp </w:t>
+      </w:r>
+      <w:r>
+        <w:rPr>
+          <w:rFonts w:ascii="Courier New" w:cs="Courier New" w:eastAsia="Courier New" w:hAnsi="Courier New"/>
+          <w:sz w:val="22"/>
+          <w:szCs w:val="22"/>
+        </w:rPr>
+        <w:t xml:space="preserve">Attendance</w:t>
+      </w:r>
+      <w:r>
+        <w:rPr>
+          <w:rFonts w:ascii="Times New Roman" w:cs="Times New Roman" w:eastAsia="Times New Roman" w:hAnsi="Times New Roman"/>
+          <w:sz w:val="28"/>
+          <w:szCs w:val="28"/>
+        </w:rPr>
+        <w:t xml:space="preserve">.</w:t>
       </w:r>
     </w:p>
     <w:p>
@@ -5596,76 +5944,6 @@
           <w:sz w:val="28"/>
           <w:szCs w:val="28"/>
         </w:rPr>
-        <w:t xml:space="preserve">GV chọn SV và chỉnh trạng thái → </w:t>
-      </w:r>
-      <w:r>
-        <w:rPr>
-          <w:rFonts w:ascii="Courier New" w:cs="Courier New" w:eastAsia="Courier New" w:hAnsi="Courier New"/>
-          <w:sz w:val="22"/>
-          <w:szCs w:val="22"/>
-        </w:rPr>
-        <w:t xml:space="preserve">AttendanceManageView</w:t>
-      </w:r>
-      <w:r>
-        <w:rPr>
-          <w:rFonts w:ascii="Times New Roman" w:cs="Times New Roman" w:eastAsia="Times New Roman" w:hAnsi="Times New Roman"/>
-          <w:sz w:val="28"/>
-          <w:szCs w:val="28"/>
-        </w:rPr>
-        <w:t xml:space="preserve"> gọi </w:t>
-      </w:r>
-      <w:r>
-        <w:rPr>
-          <w:rFonts w:ascii="Courier New" w:cs="Courier New" w:eastAsia="Courier New" w:hAnsi="Courier New"/>
-          <w:sz w:val="22"/>
-          <w:szCs w:val="22"/>
-        </w:rPr>
-        <w:t xml:space="preserve">markManualAttendance()</w:t>
-      </w:r>
-      <w:r>
-        <w:rPr>
-          <w:rFonts w:ascii="Times New Roman" w:cs="Times New Roman" w:eastAsia="Times New Roman" w:hAnsi="Times New Roman"/>
-          <w:sz w:val="28"/>
-          <w:szCs w:val="28"/>
-        </w:rPr>
-        <w:t xml:space="preserve"> của lớp </w:t>
-      </w:r>
-      <w:r>
-        <w:rPr>
-          <w:rFonts w:ascii="Courier New" w:cs="Courier New" w:eastAsia="Courier New" w:hAnsi="Courier New"/>
-          <w:sz w:val="22"/>
-          <w:szCs w:val="22"/>
-        </w:rPr>
-        <w:t xml:space="preserve">Attendance</w:t>
-      </w:r>
-      <w:r>
-        <w:rPr>
-          <w:rFonts w:ascii="Times New Roman" w:cs="Times New Roman" w:eastAsia="Times New Roman" w:hAnsi="Times New Roman"/>
-          <w:sz w:val="28"/>
-          <w:szCs w:val="28"/>
-        </w:rPr>
-        <w:t xml:space="preserve">.</w:t>
-      </w:r>
-    </w:p>
-    <w:p>
-      <w:pPr>
-        <w:spacing w:after="0" w:before="60" w:line="360" w:lineRule="auto"/>
-        <w:ind w:left="566"/>
-      </w:pPr>
-      <w:r>
-        <w:rPr>
-          <w:rFonts w:ascii="Times New Roman" w:cs="Times New Roman" w:eastAsia="Times New Roman" w:hAnsi="Times New Roman"/>
-          <w:sz w:val="28"/>
-          <w:szCs w:val="28"/>
-        </w:rPr>
-        <w:t xml:space="preserve">• </w:t>
-      </w:r>
-      <w:r>
-        <w:rPr>
-          <w:rFonts w:ascii="Times New Roman" w:cs="Times New Roman" w:eastAsia="Times New Roman" w:hAnsi="Times New Roman"/>
-          <w:sz w:val="28"/>
-          <w:szCs w:val="28"/>
-        </w:rPr>
         <w:t xml:space="preserve">Hệ thống lưu và thông báo cập nhật thành công → </w:t>
       </w:r>
       <w:r>
@@ -5674,15 +5952,15 @@
           <w:sz w:val="22"/>
           <w:szCs w:val="22"/>
         </w:rPr>
-        <w:t xml:space="preserve">AttendanceManageView</w:t>
-      </w:r>
-      <w:r>
-        <w:rPr>
-          <w:rFonts w:ascii="Times New Roman" w:cs="Times New Roman" w:eastAsia="Times New Roman" w:hAnsi="Times New Roman"/>
-          <w:sz w:val="28"/>
-          <w:szCs w:val="28"/>
-        </w:rPr>
-        <w:t xml:space="preserve"> hiển thị trạng thái mới.</w:t>
+        <w:t xml:space="preserve">outsubAttendance</w:t>
+      </w:r>
+      <w:r>
+        <w:rPr>
+          <w:rFonts w:ascii="Times New Roman" w:cs="Times New Roman" w:eastAsia="Times New Roman" w:hAnsi="Times New Roman"/>
+          <w:sz w:val="28"/>
+          <w:szCs w:val="28"/>
+        </w:rPr>
+        <w:t xml:space="preserve"> làm mới trạng thái.</w:t>
       </w:r>
     </w:p>
     <w:p>
@@ -5698,7 +5976,7 @@
       <w:r>
         <w:drawing>
           <wp:inline distT="0" distB="0" distL="0" distR="0">
-            <wp:extent cx="5048250" cy="1828800"/>
+            <wp:extent cx="5048250" cy="1990725"/>
             <wp:effectExtent t="0" r="0" b="0" l="0"/>
             <wp:docPr id="1" name="" descr="" title=""/>
             <wp:cNvGraphicFramePr>
@@ -5723,7 +6001,7 @@
                   <pic:spPr bwMode="auto">
                     <a:xfrm>
                       <a:off x="0" y="0"/>
-                      <a:ext cx="5048250" cy="1828800"/>
+                      <a:ext cx="5048250" cy="1990725"/>
                     </a:xfrm>
                     <a:prstGeom prst="rect">
                       <a:avLst/>
@@ -5840,13 +6118,13 @@
           <w:sz w:val="28"/>
           <w:szCs w:val="28"/>
         </w:rPr>
-        <w:t xml:space="preserve"> với danh sách lớp đã đăng ký kèm điểm tổng kết và bộ lọc học kỳ.</w:t>
+        <w:t xml:space="preserve"> với:</w:t>
       </w:r>
     </w:p>
     <w:p>
       <w:pPr>
         <w:spacing w:after="0" w:before="60" w:line="360" w:lineRule="auto"/>
-        <w:ind w:left="566"/>
+        <w:ind w:left="963"/>
       </w:pPr>
       <w:r>
         <w:rPr>
@@ -5858,11 +6136,101 @@
       </w:r>
       <w:r>
         <w:rPr>
-          <w:rFonts w:ascii="Times New Roman" w:cs="Times New Roman" w:eastAsia="Times New Roman" w:hAnsi="Times New Roman"/>
-          <w:sz w:val="28"/>
-          <w:szCs w:val="28"/>
-        </w:rPr>
-        <w:t xml:space="preserve">SV xem tổng quan điểm → </w:t>
+          <w:rFonts w:ascii="Courier New" w:cs="Courier New" w:eastAsia="Courier New" w:hAnsi="Courier New"/>
+          <w:sz w:val="22"/>
+          <w:szCs w:val="22"/>
+        </w:rPr>
+        <w:t xml:space="preserve">outsubCourseList</w:t>
+      </w:r>
+      <w:r>
+        <w:rPr>
+          <w:rFonts w:ascii="Times New Roman" w:cs="Times New Roman" w:eastAsia="Times New Roman" w:hAnsi="Times New Roman"/>
+          <w:sz w:val="28"/>
+          <w:szCs w:val="28"/>
+        </w:rPr>
+        <w:t xml:space="preserve"> — danh sách lớp học phần đã đăng ký kèm điểm tổng kết (hiển thị và chọn để xem chi tiết)</w:t>
+      </w:r>
+    </w:p>
+    <w:p>
+      <w:pPr>
+        <w:spacing w:after="0" w:before="60" w:line="360" w:lineRule="auto"/>
+        <w:ind w:left="963"/>
+      </w:pPr>
+      <w:r>
+        <w:rPr>
+          <w:rFonts w:ascii="Times New Roman" w:cs="Times New Roman" w:eastAsia="Times New Roman" w:hAnsi="Times New Roman"/>
+          <w:sz w:val="28"/>
+          <w:szCs w:val="28"/>
+        </w:rPr>
+        <w:t xml:space="preserve">• </w:t>
+      </w:r>
+      <w:r>
+        <w:rPr>
+          <w:rFonts w:ascii="Courier New" w:cs="Courier New" w:eastAsia="Courier New" w:hAnsi="Courier New"/>
+          <w:sz w:val="22"/>
+          <w:szCs w:val="22"/>
+        </w:rPr>
+        <w:t xml:space="preserve">inSemester</w:t>
+      </w:r>
+      <w:r>
+        <w:rPr>
+          <w:rFonts w:ascii="Times New Roman" w:cs="Times New Roman" w:eastAsia="Times New Roman" w:hAnsi="Times New Roman"/>
+          <w:sz w:val="28"/>
+          <w:szCs w:val="28"/>
+        </w:rPr>
+        <w:t xml:space="preserve"> — bộ lọc học kỳ (dropdown)</w:t>
+      </w:r>
+    </w:p>
+    <w:p>
+      <w:pPr>
+        <w:spacing w:after="0" w:before="60" w:line="360" w:lineRule="auto"/>
+        <w:ind w:left="963"/>
+      </w:pPr>
+      <w:r>
+        <w:rPr>
+          <w:rFonts w:ascii="Times New Roman" w:cs="Times New Roman" w:eastAsia="Times New Roman" w:hAnsi="Times New Roman"/>
+          <w:sz w:val="28"/>
+          <w:szCs w:val="28"/>
+        </w:rPr>
+        <w:t xml:space="preserve">• </w:t>
+      </w:r>
+      <w:r>
+        <w:rPr>
+          <w:rFonts w:ascii="Courier New" w:cs="Courier New" w:eastAsia="Courier New" w:hAnsi="Courier New"/>
+          <w:sz w:val="22"/>
+          <w:szCs w:val="22"/>
+        </w:rPr>
+        <w:t xml:space="preserve">outGradeDetail</w:t>
+      </w:r>
+      <w:r>
+        <w:rPr>
+          <w:rFonts w:ascii="Times New Roman" w:cs="Times New Roman" w:eastAsia="Times New Roman" w:hAnsi="Times New Roman"/>
+          <w:sz w:val="28"/>
+          <w:szCs w:val="28"/>
+        </w:rPr>
+        <w:t xml:space="preserve"> — bảng chi tiết các đầu điểm theo kỳ học</w:t>
+      </w:r>
+    </w:p>
+    <w:p>
+      <w:pPr>
+        <w:spacing w:after="0" w:before="60" w:line="360" w:lineRule="auto"/>
+        <w:ind w:left="566"/>
+      </w:pPr>
+      <w:r>
+        <w:rPr>
+          <w:rFonts w:ascii="Times New Roman" w:cs="Times New Roman" w:eastAsia="Times New Roman" w:hAnsi="Times New Roman"/>
+          <w:sz w:val="28"/>
+          <w:szCs w:val="28"/>
+        </w:rPr>
+        <w:t xml:space="preserve">• </w:t>
+      </w:r>
+      <w:r>
+        <w:rPr>
+          <w:rFonts w:ascii="Times New Roman" w:cs="Times New Roman" w:eastAsia="Times New Roman" w:hAnsi="Times New Roman"/>
+          <w:sz w:val="28"/>
+          <w:szCs w:val="28"/>
+        </w:rPr>
+        <w:t xml:space="preserve">SV mở trang → </w:t>
       </w:r>
       <w:r>
         <w:rPr>
@@ -5910,6 +6278,22 @@
           <w:sz w:val="28"/>
           <w:szCs w:val="28"/>
         </w:rPr>
+        <w:t xml:space="preserve">; kết quả hiển thị ở </w:t>
+      </w:r>
+      <w:r>
+        <w:rPr>
+          <w:rFonts w:ascii="Courier New" w:cs="Courier New" w:eastAsia="Courier New" w:hAnsi="Courier New"/>
+          <w:sz w:val="22"/>
+          <w:szCs w:val="22"/>
+        </w:rPr>
+        <w:t xml:space="preserve">outsubCourseList</w:t>
+      </w:r>
+      <w:r>
+        <w:rPr>
+          <w:rFonts w:ascii="Times New Roman" w:cs="Times New Roman" w:eastAsia="Times New Roman" w:hAnsi="Times New Roman"/>
+          <w:sz w:val="28"/>
+          <w:szCs w:val="28"/>
+        </w:rPr>
         <w:t xml:space="preserve">.</w:t>
       </w:r>
     </w:p>
@@ -5932,7 +6316,23 @@
           <w:sz w:val="28"/>
           <w:szCs w:val="28"/>
         </w:rPr>
-        <w:t xml:space="preserve">Hệ thống hiển thị danh sách lớp đã đăng ký và trạng thái điểm → </w:t>
+        <w:t xml:space="preserve">SV chọn học kỳ qua </w:t>
+      </w:r>
+      <w:r>
+        <w:rPr>
+          <w:rFonts w:ascii="Courier New" w:cs="Courier New" w:eastAsia="Courier New" w:hAnsi="Courier New"/>
+          <w:sz w:val="22"/>
+          <w:szCs w:val="22"/>
+        </w:rPr>
+        <w:t xml:space="preserve">inSemester</w:t>
+      </w:r>
+      <w:r>
+        <w:rPr>
+          <w:rFonts w:ascii="Times New Roman" w:cs="Times New Roman" w:eastAsia="Times New Roman" w:hAnsi="Times New Roman"/>
+          <w:sz w:val="28"/>
+          <w:szCs w:val="28"/>
+        </w:rPr>
+        <w:t xml:space="preserve"> → </w:t>
       </w:r>
       <w:r>
         <w:rPr>
@@ -5948,44 +6348,6 @@
           <w:sz w:val="28"/>
           <w:szCs w:val="28"/>
         </w:rPr>
-        <w:t xml:space="preserve"> hiển thị danh sách.</w:t>
-      </w:r>
-    </w:p>
-    <w:p>
-      <w:pPr>
-        <w:spacing w:after="0" w:before="60" w:line="360" w:lineRule="auto"/>
-        <w:ind w:left="566"/>
-      </w:pPr>
-      <w:r>
-        <w:rPr>
-          <w:rFonts w:ascii="Times New Roman" w:cs="Times New Roman" w:eastAsia="Times New Roman" w:hAnsi="Times New Roman"/>
-          <w:sz w:val="28"/>
-          <w:szCs w:val="28"/>
-        </w:rPr>
-        <w:t xml:space="preserve">• </w:t>
-      </w:r>
-      <w:r>
-        <w:rPr>
-          <w:rFonts w:ascii="Times New Roman" w:cs="Times New Roman" w:eastAsia="Times New Roman" w:hAnsi="Times New Roman"/>
-          <w:sz w:val="28"/>
-          <w:szCs w:val="28"/>
-        </w:rPr>
-        <w:t xml:space="preserve">SV chọn học kỳ để xem chi tiết → </w:t>
-      </w:r>
-      <w:r>
-        <w:rPr>
-          <w:rFonts w:ascii="Courier New" w:cs="Courier New" w:eastAsia="Courier New" w:hAnsi="Courier New"/>
-          <w:sz w:val="22"/>
-          <w:szCs w:val="22"/>
-        </w:rPr>
-        <w:t xml:space="preserve">GradeView</w:t>
-      </w:r>
-      <w:r>
-        <w:rPr>
-          <w:rFonts w:ascii="Times New Roman" w:cs="Times New Roman" w:eastAsia="Times New Roman" w:hAnsi="Times New Roman"/>
-          <w:sz w:val="28"/>
-          <w:szCs w:val="28"/>
-        </w:rPr>
         <w:t xml:space="preserve"> gọi </w:t>
       </w:r>
       <w:r>
@@ -6018,45 +6380,23 @@
           <w:sz w:val="28"/>
           <w:szCs w:val="28"/>
         </w:rPr>
+        <w:t xml:space="preserve">; kết quả hiển thị ở </w:t>
+      </w:r>
+      <w:r>
+        <w:rPr>
+          <w:rFonts w:ascii="Courier New" w:cs="Courier New" w:eastAsia="Courier New" w:hAnsi="Courier New"/>
+          <w:sz w:val="22"/>
+          <w:szCs w:val="22"/>
+        </w:rPr>
+        <w:t xml:space="preserve">outGradeDetail</w:t>
+      </w:r>
+      <w:r>
+        <w:rPr>
+          <w:rFonts w:ascii="Times New Roman" w:cs="Times New Roman" w:eastAsia="Times New Roman" w:hAnsi="Times New Roman"/>
+          <w:sz w:val="28"/>
+          <w:szCs w:val="28"/>
+        </w:rPr>
         <w:t xml:space="preserve">.</w:t>
-      </w:r>
-    </w:p>
-    <w:p>
-      <w:pPr>
-        <w:spacing w:after="0" w:before="60" w:line="360" w:lineRule="auto"/>
-        <w:ind w:left="566"/>
-      </w:pPr>
-      <w:r>
-        <w:rPr>
-          <w:rFonts w:ascii="Times New Roman" w:cs="Times New Roman" w:eastAsia="Times New Roman" w:hAnsi="Times New Roman"/>
-          <w:sz w:val="28"/>
-          <w:szCs w:val="28"/>
-        </w:rPr>
-        <w:t xml:space="preserve">• </w:t>
-      </w:r>
-      <w:r>
-        <w:rPr>
-          <w:rFonts w:ascii="Times New Roman" w:cs="Times New Roman" w:eastAsia="Times New Roman" w:hAnsi="Times New Roman"/>
-          <w:sz w:val="28"/>
-          <w:szCs w:val="28"/>
-        </w:rPr>
-        <w:t xml:space="preserve">Hệ thống hiển thị bảng chi tiết điểm theo kỳ → </w:t>
-      </w:r>
-      <w:r>
-        <w:rPr>
-          <w:rFonts w:ascii="Courier New" w:cs="Courier New" w:eastAsia="Courier New" w:hAnsi="Courier New"/>
-          <w:sz w:val="22"/>
-          <w:szCs w:val="22"/>
-        </w:rPr>
-        <w:t xml:space="preserve">GradeView</w:t>
-      </w:r>
-      <w:r>
-        <w:rPr>
-          <w:rFonts w:ascii="Times New Roman" w:cs="Times New Roman" w:eastAsia="Times New Roman" w:hAnsi="Times New Roman"/>
-          <w:sz w:val="28"/>
-          <w:szCs w:val="28"/>
-        </w:rPr>
-        <w:t xml:space="preserve"> hiển thị bảng chi tiết.</w:t>
       </w:r>
     </w:p>
     <w:p>
@@ -6072,7 +6412,7 @@
       <w:r>
         <w:drawing>
           <wp:inline distT="0" distB="0" distL="0" distR="0">
-            <wp:extent cx="5048250" cy="2181225"/>
+            <wp:extent cx="5048250" cy="2266950"/>
             <wp:effectExtent t="0" r="0" b="0" l="0"/>
             <wp:docPr id="1" name="" descr="" title=""/>
             <wp:cNvGraphicFramePr>
@@ -6097,7 +6437,7 @@
                   <pic:spPr bwMode="auto">
                     <a:xfrm>
                       <a:off x="0" y="0"/>
-                      <a:ext cx="5048250" cy="2181225"/>
+                      <a:ext cx="5048250" cy="2266950"/>
                     </a:xfrm>
                     <a:prstGeom prst="rect">
                       <a:avLst/>
@@ -6214,13 +6554,13 @@
           <w:sz w:val="28"/>
           <w:szCs w:val="28"/>
         </w:rPr>
-        <w:t xml:space="preserve"> với ô tìm lớp, bảng nhập điểm và nút xác nhận.</w:t>
+        <w:t xml:space="preserve"> với:</w:t>
       </w:r>
     </w:p>
     <w:p>
       <w:pPr>
         <w:spacing w:after="0" w:before="60" w:line="360" w:lineRule="auto"/>
-        <w:ind w:left="566"/>
+        <w:ind w:left="963"/>
       </w:pPr>
       <w:r>
         <w:rPr>
@@ -6232,11 +6572,147 @@
       </w:r>
       <w:r>
         <w:rPr>
-          <w:rFonts w:ascii="Times New Roman" w:cs="Times New Roman" w:eastAsia="Times New Roman" w:hAnsi="Times New Roman"/>
-          <w:sz w:val="28"/>
-          <w:szCs w:val="28"/>
-        </w:rPr>
-        <w:t xml:space="preserve">GV tìm và chọn lớp học phần → </w:t>
+          <w:rFonts w:ascii="Courier New" w:cs="Courier New" w:eastAsia="Courier New" w:hAnsi="Courier New"/>
+          <w:sz w:val="22"/>
+          <w:szCs w:val="22"/>
+        </w:rPr>
+        <w:t xml:space="preserve">inClassSection</w:t>
+      </w:r>
+      <w:r>
+        <w:rPr>
+          <w:rFonts w:ascii="Times New Roman" w:cs="Times New Roman" w:eastAsia="Times New Roman" w:hAnsi="Times New Roman"/>
+          <w:sz w:val="28"/>
+          <w:szCs w:val="28"/>
+        </w:rPr>
+        <w:t xml:space="preserve"> — ô nhập từ khóa tìm lớp học phần</w:t>
+      </w:r>
+    </w:p>
+    <w:p>
+      <w:pPr>
+        <w:spacing w:after="0" w:before="60" w:line="360" w:lineRule="auto"/>
+        <w:ind w:left="963"/>
+      </w:pPr>
+      <w:r>
+        <w:rPr>
+          <w:rFonts w:ascii="Times New Roman" w:cs="Times New Roman" w:eastAsia="Times New Roman" w:hAnsi="Times New Roman"/>
+          <w:sz w:val="28"/>
+          <w:szCs w:val="28"/>
+        </w:rPr>
+        <w:t xml:space="preserve">• </w:t>
+      </w:r>
+      <w:r>
+        <w:rPr>
+          <w:rFonts w:ascii="Courier New" w:cs="Courier New" w:eastAsia="Courier New" w:hAnsi="Courier New"/>
+          <w:sz w:val="22"/>
+          <w:szCs w:val="22"/>
+        </w:rPr>
+        <w:t xml:space="preserve">outsubListClass</w:t>
+      </w:r>
+      <w:r>
+        <w:rPr>
+          <w:rFonts w:ascii="Times New Roman" w:cs="Times New Roman" w:eastAsia="Times New Roman" w:hAnsi="Times New Roman"/>
+          <w:sz w:val="28"/>
+          <w:szCs w:val="28"/>
+        </w:rPr>
+        <w:t xml:space="preserve"> — bảng kết quả lớp học phần (hiển thị và chọn)</w:t>
+      </w:r>
+    </w:p>
+    <w:p>
+      <w:pPr>
+        <w:spacing w:after="0" w:before="60" w:line="360" w:lineRule="auto"/>
+        <w:ind w:left="963"/>
+      </w:pPr>
+      <w:r>
+        <w:rPr>
+          <w:rFonts w:ascii="Times New Roman" w:cs="Times New Roman" w:eastAsia="Times New Roman" w:hAnsi="Times New Roman"/>
+          <w:sz w:val="28"/>
+          <w:szCs w:val="28"/>
+        </w:rPr>
+        <w:t xml:space="preserve">• </w:t>
+      </w:r>
+      <w:r>
+        <w:rPr>
+          <w:rFonts w:ascii="Courier New" w:cs="Courier New" w:eastAsia="Courier New" w:hAnsi="Courier New"/>
+          <w:sz w:val="22"/>
+          <w:szCs w:val="22"/>
+        </w:rPr>
+        <w:t xml:space="preserve">inoutGrades</w:t>
+      </w:r>
+      <w:r>
+        <w:rPr>
+          <w:rFonts w:ascii="Times New Roman" w:cs="Times New Roman" w:eastAsia="Times New Roman" w:hAnsi="Times New Roman"/>
+          <w:sz w:val="28"/>
+          <w:szCs w:val="28"/>
+        </w:rPr>
+        <w:t xml:space="preserve"> — bảng nhập điểm (hiển thị điểm hiện tại và cho phép nhập/sửa inline)</w:t>
+      </w:r>
+    </w:p>
+    <w:p>
+      <w:pPr>
+        <w:spacing w:after="0" w:before="60" w:line="360" w:lineRule="auto"/>
+        <w:ind w:left="963"/>
+      </w:pPr>
+      <w:r>
+        <w:rPr>
+          <w:rFonts w:ascii="Times New Roman" w:cs="Times New Roman" w:eastAsia="Times New Roman" w:hAnsi="Times New Roman"/>
+          <w:sz w:val="28"/>
+          <w:szCs w:val="28"/>
+        </w:rPr>
+        <w:t xml:space="preserve">• </w:t>
+      </w:r>
+      <w:r>
+        <w:rPr>
+          <w:rFonts w:ascii="Courier New" w:cs="Courier New" w:eastAsia="Courier New" w:hAnsi="Courier New"/>
+          <w:sz w:val="22"/>
+          <w:szCs w:val="22"/>
+        </w:rPr>
+        <w:t xml:space="preserve">subSubmitGrades</w:t>
+      </w:r>
+      <w:r>
+        <w:rPr>
+          <w:rFonts w:ascii="Times New Roman" w:cs="Times New Roman" w:eastAsia="Times New Roman" w:hAnsi="Times New Roman"/>
+          <w:sz w:val="28"/>
+          <w:szCs w:val="28"/>
+        </w:rPr>
+        <w:t xml:space="preserve"> — nút "Xác nhận nộp điểm"</w:t>
+      </w:r>
+    </w:p>
+    <w:p>
+      <w:pPr>
+        <w:spacing w:after="0" w:before="60" w:line="360" w:lineRule="auto"/>
+        <w:ind w:left="566"/>
+      </w:pPr>
+      <w:r>
+        <w:rPr>
+          <w:rFonts w:ascii="Times New Roman" w:cs="Times New Roman" w:eastAsia="Times New Roman" w:hAnsi="Times New Roman"/>
+          <w:sz w:val="28"/>
+          <w:szCs w:val="28"/>
+        </w:rPr>
+        <w:t xml:space="preserve">• </w:t>
+      </w:r>
+      <w:r>
+        <w:rPr>
+          <w:rFonts w:ascii="Times New Roman" w:cs="Times New Roman" w:eastAsia="Times New Roman" w:hAnsi="Times New Roman"/>
+          <w:sz w:val="28"/>
+          <w:szCs w:val="28"/>
+        </w:rPr>
+        <w:t xml:space="preserve">GV nhập từ khóa vào </w:t>
+      </w:r>
+      <w:r>
+        <w:rPr>
+          <w:rFonts w:ascii="Courier New" w:cs="Courier New" w:eastAsia="Courier New" w:hAnsi="Courier New"/>
+          <w:sz w:val="22"/>
+          <w:szCs w:val="22"/>
+        </w:rPr>
+        <w:t xml:space="preserve">inClassSection</w:t>
+      </w:r>
+      <w:r>
+        <w:rPr>
+          <w:rFonts w:ascii="Times New Roman" w:cs="Times New Roman" w:eastAsia="Times New Roman" w:hAnsi="Times New Roman"/>
+          <w:sz w:val="28"/>
+          <w:szCs w:val="28"/>
+        </w:rPr>
+        <w:t xml:space="preserve"> và nhấn tìm → </w:t>
       </w:r>
       <w:r>
         <w:rPr>
@@ -6284,6 +6760,22 @@
           <w:sz w:val="28"/>
           <w:szCs w:val="28"/>
         </w:rPr>
+        <w:t xml:space="preserve">; kết quả hiển thị ở </w:t>
+      </w:r>
+      <w:r>
+        <w:rPr>
+          <w:rFonts w:ascii="Courier New" w:cs="Courier New" w:eastAsia="Courier New" w:hAnsi="Courier New"/>
+          <w:sz w:val="22"/>
+          <w:szCs w:val="22"/>
+        </w:rPr>
+        <w:t xml:space="preserve">outsubListClass</w:t>
+      </w:r>
+      <w:r>
+        <w:rPr>
+          <w:rFonts w:ascii="Times New Roman" w:cs="Times New Roman" w:eastAsia="Times New Roman" w:hAnsi="Times New Roman"/>
+          <w:sz w:val="28"/>
+          <w:szCs w:val="28"/>
+        </w:rPr>
         <w:t xml:space="preserve">.</w:t>
       </w:r>
     </w:p>
@@ -6306,7 +6798,77 @@
           <w:sz w:val="28"/>
           <w:szCs w:val="28"/>
         </w:rPr>
-        <w:t xml:space="preserve">Hệ thống hiển thị bảng SV với ô nhập điểm → </w:t>
+        <w:t xml:space="preserve">GV chọn lớp → hệ thống tải bảng SV vào </w:t>
+      </w:r>
+      <w:r>
+        <w:rPr>
+          <w:rFonts w:ascii="Courier New" w:cs="Courier New" w:eastAsia="Courier New" w:hAnsi="Courier New"/>
+          <w:sz w:val="22"/>
+          <w:szCs w:val="22"/>
+        </w:rPr>
+        <w:t xml:space="preserve">inoutGrades</w:t>
+      </w:r>
+      <w:r>
+        <w:rPr>
+          <w:rFonts w:ascii="Times New Roman" w:cs="Times New Roman" w:eastAsia="Times New Roman" w:hAnsi="Times New Roman"/>
+          <w:sz w:val="28"/>
+          <w:szCs w:val="28"/>
+        </w:rPr>
+        <w:t xml:space="preserve">.</w:t>
+      </w:r>
+    </w:p>
+    <w:p>
+      <w:pPr>
+        <w:spacing w:after="0" w:before="60" w:line="360" w:lineRule="auto"/>
+        <w:ind w:left="566"/>
+      </w:pPr>
+      <w:r>
+        <w:rPr>
+          <w:rFonts w:ascii="Times New Roman" w:cs="Times New Roman" w:eastAsia="Times New Roman" w:hAnsi="Times New Roman"/>
+          <w:sz w:val="28"/>
+          <w:szCs w:val="28"/>
+        </w:rPr>
+        <w:t xml:space="preserve">• </w:t>
+      </w:r>
+      <w:r>
+        <w:rPr>
+          <w:rFonts w:ascii="Times New Roman" w:cs="Times New Roman" w:eastAsia="Times New Roman" w:hAnsi="Times New Roman"/>
+          <w:sz w:val="28"/>
+          <w:szCs w:val="28"/>
+        </w:rPr>
+        <w:t xml:space="preserve">GV nhập/sửa điểm trong </w:t>
+      </w:r>
+      <w:r>
+        <w:rPr>
+          <w:rFonts w:ascii="Courier New" w:cs="Courier New" w:eastAsia="Courier New" w:hAnsi="Courier New"/>
+          <w:sz w:val="22"/>
+          <w:szCs w:val="22"/>
+        </w:rPr>
+        <w:t xml:space="preserve">inoutGrades</w:t>
+      </w:r>
+      <w:r>
+        <w:rPr>
+          <w:rFonts w:ascii="Times New Roman" w:cs="Times New Roman" w:eastAsia="Times New Roman" w:hAnsi="Times New Roman"/>
+          <w:sz w:val="28"/>
+          <w:szCs w:val="28"/>
+        </w:rPr>
+        <w:t xml:space="preserve"> và nhấn </w:t>
+      </w:r>
+      <w:r>
+        <w:rPr>
+          <w:rFonts w:ascii="Courier New" w:cs="Courier New" w:eastAsia="Courier New" w:hAnsi="Courier New"/>
+          <w:sz w:val="22"/>
+          <w:szCs w:val="22"/>
+        </w:rPr>
+        <w:t xml:space="preserve">subSubmitGrades</w:t>
+      </w:r>
+      <w:r>
+        <w:rPr>
+          <w:rFonts w:ascii="Times New Roman" w:cs="Times New Roman" w:eastAsia="Times New Roman" w:hAnsi="Times New Roman"/>
+          <w:sz w:val="28"/>
+          <w:szCs w:val="28"/>
+        </w:rPr>
+        <w:t xml:space="preserve"> → </w:t>
       </w:r>
       <w:r>
         <w:rPr>
@@ -6322,7 +6884,55 @@
           <w:sz w:val="28"/>
           <w:szCs w:val="28"/>
         </w:rPr>
-        <w:t xml:space="preserve"> hiển thị bảng chỉnh sửa.</w:t>
+        <w:t xml:space="preserve"> gọi </w:t>
+      </w:r>
+      <w:r>
+        <w:rPr>
+          <w:rFonts w:ascii="Courier New" w:cs="Courier New" w:eastAsia="Courier New" w:hAnsi="Courier New"/>
+          <w:sz w:val="22"/>
+          <w:szCs w:val="22"/>
+        </w:rPr>
+        <w:t xml:space="preserve">enterGrade()</w:t>
+      </w:r>
+      <w:r>
+        <w:rPr>
+          <w:rFonts w:ascii="Times New Roman" w:cs="Times New Roman" w:eastAsia="Times New Roman" w:hAnsi="Times New Roman"/>
+          <w:sz w:val="28"/>
+          <w:szCs w:val="28"/>
+        </w:rPr>
+        <w:t xml:space="preserve"> hoặc </w:t>
+      </w:r>
+      <w:r>
+        <w:rPr>
+          <w:rFonts w:ascii="Courier New" w:cs="Courier New" w:eastAsia="Courier New" w:hAnsi="Courier New"/>
+          <w:sz w:val="22"/>
+          <w:szCs w:val="22"/>
+        </w:rPr>
+        <w:t xml:space="preserve">editGrade()</w:t>
+      </w:r>
+      <w:r>
+        <w:rPr>
+          <w:rFonts w:ascii="Times New Roman" w:cs="Times New Roman" w:eastAsia="Times New Roman" w:hAnsi="Times New Roman"/>
+          <w:sz w:val="28"/>
+          <w:szCs w:val="28"/>
+        </w:rPr>
+        <w:t xml:space="preserve"> của lớp </w:t>
+      </w:r>
+      <w:r>
+        <w:rPr>
+          <w:rFonts w:ascii="Courier New" w:cs="Courier New" w:eastAsia="Courier New" w:hAnsi="Courier New"/>
+          <w:sz w:val="22"/>
+          <w:szCs w:val="22"/>
+        </w:rPr>
+        <w:t xml:space="preserve">Grade</w:t>
+      </w:r>
+      <w:r>
+        <w:rPr>
+          <w:rFonts w:ascii="Times New Roman" w:cs="Times New Roman" w:eastAsia="Times New Roman" w:hAnsi="Times New Roman"/>
+          <w:sz w:val="28"/>
+          <w:szCs w:val="28"/>
+        </w:rPr>
+        <w:t xml:space="preserve">.</w:t>
       </w:r>
     </w:p>
     <w:p>
@@ -6344,163 +6954,7 @@
           <w:sz w:val="28"/>
           <w:szCs w:val="28"/>
         </w:rPr>
-        <w:t xml:space="preserve">GV nhập điểm và nhấn "Xác nhận nộp điểm" → </w:t>
-      </w:r>
-      <w:r>
-        <w:rPr>
-          <w:rFonts w:ascii="Courier New" w:cs="Courier New" w:eastAsia="Courier New" w:hAnsi="Courier New"/>
-          <w:sz w:val="22"/>
-          <w:szCs w:val="22"/>
-        </w:rPr>
-        <w:t xml:space="preserve">GradeEntryView</w:t>
-      </w:r>
-      <w:r>
-        <w:rPr>
-          <w:rFonts w:ascii="Times New Roman" w:cs="Times New Roman" w:eastAsia="Times New Roman" w:hAnsi="Times New Roman"/>
-          <w:sz w:val="28"/>
-          <w:szCs w:val="28"/>
-        </w:rPr>
-        <w:t xml:space="preserve"> gọi </w:t>
-      </w:r>
-      <w:r>
-        <w:rPr>
-          <w:rFonts w:ascii="Courier New" w:cs="Courier New" w:eastAsia="Courier New" w:hAnsi="Courier New"/>
-          <w:sz w:val="22"/>
-          <w:szCs w:val="22"/>
-        </w:rPr>
-        <w:t xml:space="preserve">enterGrade()</w:t>
-      </w:r>
-      <w:r>
-        <w:rPr>
-          <w:rFonts w:ascii="Times New Roman" w:cs="Times New Roman" w:eastAsia="Times New Roman" w:hAnsi="Times New Roman"/>
-          <w:sz w:val="28"/>
-          <w:szCs w:val="28"/>
-        </w:rPr>
-        <w:t xml:space="preserve"> của lớp </w:t>
-      </w:r>
-      <w:r>
-        <w:rPr>
-          <w:rFonts w:ascii="Courier New" w:cs="Courier New" w:eastAsia="Courier New" w:hAnsi="Courier New"/>
-          <w:sz w:val="22"/>
-          <w:szCs w:val="22"/>
-        </w:rPr>
-        <w:t xml:space="preserve">Grade</w:t>
-      </w:r>
-      <w:r>
-        <w:rPr>
-          <w:rFonts w:ascii="Times New Roman" w:cs="Times New Roman" w:eastAsia="Times New Roman" w:hAnsi="Times New Roman"/>
-          <w:sz w:val="28"/>
-          <w:szCs w:val="28"/>
-        </w:rPr>
-        <w:t xml:space="preserve">.</w:t>
-      </w:r>
-    </w:p>
-    <w:p>
-      <w:pPr>
-        <w:spacing w:after="0" w:before="60" w:line="360" w:lineRule="auto"/>
-        <w:ind w:left="566"/>
-      </w:pPr>
-      <w:r>
-        <w:rPr>
-          <w:rFonts w:ascii="Times New Roman" w:cs="Times New Roman" w:eastAsia="Times New Roman" w:hAnsi="Times New Roman"/>
-          <w:sz w:val="28"/>
-          <w:szCs w:val="28"/>
-        </w:rPr>
-        <w:t xml:space="preserve">• </w:t>
-      </w:r>
-      <w:r>
-        <w:rPr>
-          <w:rFonts w:ascii="Times New Roman" w:cs="Times New Roman" w:eastAsia="Times New Roman" w:hAnsi="Times New Roman"/>
-          <w:sz w:val="28"/>
-          <w:szCs w:val="28"/>
-        </w:rPr>
-        <w:t xml:space="preserve">GV sửa điểm đã nộp → </w:t>
-      </w:r>
-      <w:r>
-        <w:rPr>
-          <w:rFonts w:ascii="Courier New" w:cs="Courier New" w:eastAsia="Courier New" w:hAnsi="Courier New"/>
-          <w:sz w:val="22"/>
-          <w:szCs w:val="22"/>
-        </w:rPr>
-        <w:t xml:space="preserve">GradeEntryView</w:t>
-      </w:r>
-      <w:r>
-        <w:rPr>
-          <w:rFonts w:ascii="Times New Roman" w:cs="Times New Roman" w:eastAsia="Times New Roman" w:hAnsi="Times New Roman"/>
-          <w:sz w:val="28"/>
-          <w:szCs w:val="28"/>
-        </w:rPr>
-        <w:t xml:space="preserve"> gọi </w:t>
-      </w:r>
-      <w:r>
-        <w:rPr>
-          <w:rFonts w:ascii="Courier New" w:cs="Courier New" w:eastAsia="Courier New" w:hAnsi="Courier New"/>
-          <w:sz w:val="22"/>
-          <w:szCs w:val="22"/>
-        </w:rPr>
-        <w:t xml:space="preserve">editGrade()</w:t>
-      </w:r>
-      <w:r>
-        <w:rPr>
-          <w:rFonts w:ascii="Times New Roman" w:cs="Times New Roman" w:eastAsia="Times New Roman" w:hAnsi="Times New Roman"/>
-          <w:sz w:val="28"/>
-          <w:szCs w:val="28"/>
-        </w:rPr>
-        <w:t xml:space="preserve"> của lớp </w:t>
-      </w:r>
-      <w:r>
-        <w:rPr>
-          <w:rFonts w:ascii="Courier New" w:cs="Courier New" w:eastAsia="Courier New" w:hAnsi="Courier New"/>
-          <w:sz w:val="22"/>
-          <w:szCs w:val="22"/>
-        </w:rPr>
-        <w:t xml:space="preserve">Grade</w:t>
-      </w:r>
-      <w:r>
-        <w:rPr>
-          <w:rFonts w:ascii="Times New Roman" w:cs="Times New Roman" w:eastAsia="Times New Roman" w:hAnsi="Times New Roman"/>
-          <w:sz w:val="28"/>
-          <w:szCs w:val="28"/>
-        </w:rPr>
-        <w:t xml:space="preserve">.</w:t>
-      </w:r>
-    </w:p>
-    <w:p>
-      <w:pPr>
-        <w:spacing w:after="0" w:before="60" w:line="360" w:lineRule="auto"/>
-        <w:ind w:left="566"/>
-      </w:pPr>
-      <w:r>
-        <w:rPr>
-          <w:rFonts w:ascii="Times New Roman" w:cs="Times New Roman" w:eastAsia="Times New Roman" w:hAnsi="Times New Roman"/>
-          <w:sz w:val="28"/>
-          <w:szCs w:val="28"/>
-        </w:rPr>
-        <w:t xml:space="preserve">• </w:t>
-      </w:r>
-      <w:r>
-        <w:rPr>
-          <w:rFonts w:ascii="Times New Roman" w:cs="Times New Roman" w:eastAsia="Times New Roman" w:hAnsi="Times New Roman"/>
-          <w:sz w:val="28"/>
-          <w:szCs w:val="28"/>
-        </w:rPr>
-        <w:t xml:space="preserve">Hệ thống lưu và thông báo thành công → </w:t>
-      </w:r>
-      <w:r>
-        <w:rPr>
-          <w:rFonts w:ascii="Courier New" w:cs="Courier New" w:eastAsia="Courier New" w:hAnsi="Courier New"/>
-          <w:sz w:val="22"/>
-          <w:szCs w:val="22"/>
-        </w:rPr>
-        <w:t xml:space="preserve">GradeEntryView</w:t>
-      </w:r>
-      <w:r>
-        <w:rPr>
-          <w:rFonts w:ascii="Times New Roman" w:cs="Times New Roman" w:eastAsia="Times New Roman" w:hAnsi="Times New Roman"/>
-          <w:sz w:val="28"/>
-          <w:szCs w:val="28"/>
-        </w:rPr>
-        <w:t xml:space="preserve"> hiển thị thông báo.</w:t>
+        <w:t xml:space="preserve">Hệ thống lưu và thông báo thành công.</w:t>
       </w:r>
     </w:p>
     <w:p>
@@ -6516,7 +6970,7 @@
       <w:r>
         <w:drawing>
           <wp:inline distT="0" distB="0" distL="0" distR="0">
-            <wp:extent cx="5048250" cy="3343275"/>
+            <wp:extent cx="5048250" cy="3333750"/>
             <wp:effectExtent t="0" r="0" b="0" l="0"/>
             <wp:docPr id="1" name="" descr="" title=""/>
             <wp:cNvGraphicFramePr>
@@ -6541,7 +6995,7 @@
                   <pic:spPr bwMode="auto">
                     <a:xfrm>
                       <a:off x="0" y="0"/>
-                      <a:ext cx="5048250" cy="3343275"/>
+                      <a:ext cx="5048250" cy="3333750"/>
                     </a:xfrm>
                     <a:prstGeom prst="rect">
                       <a:avLst/>

</xml_diff>

<commit_message>
docs(module3): add HomeView entry points, full attribute lists, and entity attribute justification in BCE narratives
Co-Authored-By: Claude Sonnet 4.6 <noreply@anthropic.com>
</commit_message>
<xml_diff>
--- a/report/module3_attendance_grades.docx
+++ b/report/module3_attendance_grades.docx
@@ -4970,7 +4970,77 @@
           <w:sz w:val="28"/>
           <w:szCs w:val="28"/>
         </w:rPr>
-        <w:t xml:space="preserve">GV vào giao diện → đề xuất lớp </w:t>
+        <w:t xml:space="preserve">Sau khi đăng nhập thành công, hệ thống hiển thị giao diện chính của giảng viên → đề xuất lớp </w:t>
+      </w:r>
+      <w:r>
+        <w:rPr>
+          <w:rFonts w:ascii="Courier New" w:cs="Courier New" w:eastAsia="Courier New" w:hAnsi="Courier New"/>
+          <w:sz w:val="22"/>
+          <w:szCs w:val="22"/>
+        </w:rPr>
+        <w:t xml:space="preserve">LecturerHomeView</w:t>
+      </w:r>
+      <w:r>
+        <w:rPr>
+          <w:rFonts w:ascii="Times New Roman" w:cs="Times New Roman" w:eastAsia="Times New Roman" w:hAnsi="Times New Roman"/>
+          <w:sz w:val="28"/>
+          <w:szCs w:val="28"/>
+        </w:rPr>
+        <w:t xml:space="preserve">, có ít nhất nút chọn điểm danh (</w:t>
+      </w:r>
+      <w:r>
+        <w:rPr>
+          <w:rFonts w:ascii="Courier New" w:cs="Courier New" w:eastAsia="Courier New" w:hAnsi="Courier New"/>
+          <w:sz w:val="22"/>
+          <w:szCs w:val="22"/>
+        </w:rPr>
+        <w:t xml:space="preserve">-subAttendance</w:t>
+      </w:r>
+      <w:r>
+        <w:rPr>
+          <w:rFonts w:ascii="Times New Roman" w:cs="Times New Roman" w:eastAsia="Times New Roman" w:hAnsi="Times New Roman"/>
+          <w:sz w:val="28"/>
+          <w:szCs w:val="28"/>
+        </w:rPr>
+        <w:t xml:space="preserve">).</w:t>
+      </w:r>
+    </w:p>
+    <w:p>
+      <w:pPr>
+        <w:spacing w:after="0" w:before="60" w:line="360" w:lineRule="auto"/>
+        <w:ind w:left="566"/>
+      </w:pPr>
+      <w:r>
+        <w:rPr>
+          <w:rFonts w:ascii="Times New Roman" w:cs="Times New Roman" w:eastAsia="Times New Roman" w:hAnsi="Times New Roman"/>
+          <w:sz w:val="28"/>
+          <w:szCs w:val="28"/>
+        </w:rPr>
+        <w:t xml:space="preserve">• </w:t>
+      </w:r>
+      <w:r>
+        <w:rPr>
+          <w:rFonts w:ascii="Times New Roman" w:cs="Times New Roman" w:eastAsia="Times New Roman" w:hAnsi="Times New Roman"/>
+          <w:sz w:val="28"/>
+          <w:szCs w:val="28"/>
+        </w:rPr>
+        <w:t xml:space="preserve">GV click vào </w:t>
+      </w:r>
+      <w:r>
+        <w:rPr>
+          <w:rFonts w:ascii="Courier New" w:cs="Courier New" w:eastAsia="Courier New" w:hAnsi="Courier New"/>
+          <w:sz w:val="22"/>
+          <w:szCs w:val="22"/>
+        </w:rPr>
+        <w:t xml:space="preserve">subAttendance</w:t>
+      </w:r>
+      <w:r>
+        <w:rPr>
+          <w:rFonts w:ascii="Times New Roman" w:cs="Times New Roman" w:eastAsia="Times New Roman" w:hAnsi="Times New Roman"/>
+          <w:sz w:val="28"/>
+          <w:szCs w:val="28"/>
+        </w:rPr>
+        <w:t xml:space="preserve"> → giao diện tạo/tắt mã QR hiện lên → đề xuất lớp </w:t>
       </w:r>
       <w:r>
         <w:rPr>
@@ -4986,13 +5056,141 @@
           <w:sz w:val="28"/>
           <w:szCs w:val="28"/>
         </w:rPr>
-        <w:t xml:space="preserve"> với:</w:t>
+        <w:t xml:space="preserve">, giao diện này chứa: ô nhập từ khóa tìm lớp học phần (</w:t>
+      </w:r>
+      <w:r>
+        <w:rPr>
+          <w:rFonts w:ascii="Courier New" w:cs="Courier New" w:eastAsia="Courier New" w:hAnsi="Courier New"/>
+          <w:sz w:val="22"/>
+          <w:szCs w:val="22"/>
+        </w:rPr>
+        <w:t xml:space="preserve">-inClassSection</w:t>
+      </w:r>
+      <w:r>
+        <w:rPr>
+          <w:rFonts w:ascii="Times New Roman" w:cs="Times New Roman" w:eastAsia="Times New Roman" w:hAnsi="Times New Roman"/>
+          <w:sz w:val="28"/>
+          <w:szCs w:val="28"/>
+        </w:rPr>
+        <w:t xml:space="preserve">), nút tìm kiếm (</w:t>
+      </w:r>
+      <w:r>
+        <w:rPr>
+          <w:rFonts w:ascii="Courier New" w:cs="Courier New" w:eastAsia="Courier New" w:hAnsi="Courier New"/>
+          <w:sz w:val="22"/>
+          <w:szCs w:val="22"/>
+        </w:rPr>
+        <w:t xml:space="preserve">-subSearch</w:t>
+      </w:r>
+      <w:r>
+        <w:rPr>
+          <w:rFonts w:ascii="Times New Roman" w:cs="Times New Roman" w:eastAsia="Times New Roman" w:hAnsi="Times New Roman"/>
+          <w:sz w:val="28"/>
+          <w:szCs w:val="28"/>
+        </w:rPr>
+        <w:t xml:space="preserve">), bảng kết quả lớp học phần có thể chọn (</w:t>
+      </w:r>
+      <w:r>
+        <w:rPr>
+          <w:rFonts w:ascii="Courier New" w:cs="Courier New" w:eastAsia="Courier New" w:hAnsi="Courier New"/>
+          <w:sz w:val="22"/>
+          <w:szCs w:val="22"/>
+        </w:rPr>
+        <w:t xml:space="preserve">-outsubListClass</w:t>
+      </w:r>
+      <w:r>
+        <w:rPr>
+          <w:rFonts w:ascii="Times New Roman" w:cs="Times New Roman" w:eastAsia="Times New Roman" w:hAnsi="Times New Roman"/>
+          <w:sz w:val="28"/>
+          <w:szCs w:val="28"/>
+        </w:rPr>
+        <w:t xml:space="preserve">), danh sách buổi học của lớp đã chọn (</w:t>
+      </w:r>
+      <w:r>
+        <w:rPr>
+          <w:rFonts w:ascii="Courier New" w:cs="Courier New" w:eastAsia="Courier New" w:hAnsi="Courier New"/>
+          <w:sz w:val="22"/>
+          <w:szCs w:val="22"/>
+        </w:rPr>
+        <w:t xml:space="preserve">-outsubListSession</w:t>
+      </w:r>
+      <w:r>
+        <w:rPr>
+          <w:rFonts w:ascii="Times New Roman" w:cs="Times New Roman" w:eastAsia="Times New Roman" w:hAnsi="Times New Roman"/>
+          <w:sz w:val="28"/>
+          <w:szCs w:val="28"/>
+        </w:rPr>
+        <w:t xml:space="preserve">), vùng hiển thị mã QR (</w:t>
+      </w:r>
+      <w:r>
+        <w:rPr>
+          <w:rFonts w:ascii="Courier New" w:cs="Courier New" w:eastAsia="Courier New" w:hAnsi="Courier New"/>
+          <w:sz w:val="22"/>
+          <w:szCs w:val="22"/>
+        </w:rPr>
+        <w:t xml:space="preserve">-outQRCode</w:t>
+      </w:r>
+      <w:r>
+        <w:rPr>
+          <w:rFonts w:ascii="Times New Roman" w:cs="Times New Roman" w:eastAsia="Times New Roman" w:hAnsi="Times New Roman"/>
+          <w:sz w:val="28"/>
+          <w:szCs w:val="28"/>
+        </w:rPr>
+        <w:t xml:space="preserve">), nút tạo mã QR (</w:t>
+      </w:r>
+      <w:r>
+        <w:rPr>
+          <w:rFonts w:ascii="Courier New" w:cs="Courier New" w:eastAsia="Courier New" w:hAnsi="Courier New"/>
+          <w:sz w:val="22"/>
+          <w:szCs w:val="22"/>
+        </w:rPr>
+        <w:t xml:space="preserve">-subGenerateQr</w:t>
+      </w:r>
+      <w:r>
+        <w:rPr>
+          <w:rFonts w:ascii="Times New Roman" w:cs="Times New Roman" w:eastAsia="Times New Roman" w:hAnsi="Times New Roman"/>
+          <w:sz w:val="28"/>
+          <w:szCs w:val="28"/>
+        </w:rPr>
+        <w:t xml:space="preserve">), nút tắt mã QR (</w:t>
+      </w:r>
+      <w:r>
+        <w:rPr>
+          <w:rFonts w:ascii="Courier New" w:cs="Courier New" w:eastAsia="Courier New" w:hAnsi="Courier New"/>
+          <w:sz w:val="22"/>
+          <w:szCs w:val="22"/>
+        </w:rPr>
+        <w:t xml:space="preserve">-subDeactivateQr</w:t>
+      </w:r>
+      <w:r>
+        <w:rPr>
+          <w:rFonts w:ascii="Times New Roman" w:cs="Times New Roman" w:eastAsia="Times New Roman" w:hAnsi="Times New Roman"/>
+          <w:sz w:val="28"/>
+          <w:szCs w:val="28"/>
+        </w:rPr>
+        <w:t xml:space="preserve">) và bảng danh sách sinh viên kèm trạng thái điểm danh (</w:t>
+      </w:r>
+      <w:r>
+        <w:rPr>
+          <w:rFonts w:ascii="Courier New" w:cs="Courier New" w:eastAsia="Courier New" w:hAnsi="Courier New"/>
+          <w:sz w:val="22"/>
+          <w:szCs w:val="22"/>
+        </w:rPr>
+        <w:t xml:space="preserve">-outAttendanceList</w:t>
+      </w:r>
+      <w:r>
+        <w:rPr>
+          <w:rFonts w:ascii="Times New Roman" w:cs="Times New Roman" w:eastAsia="Times New Roman" w:hAnsi="Times New Roman"/>
+          <w:sz w:val="28"/>
+          <w:szCs w:val="28"/>
+        </w:rPr>
+        <w:t xml:space="preserve">).</w:t>
       </w:r>
     </w:p>
     <w:p>
       <w:pPr>
         <w:spacing w:after="0" w:before="60" w:line="360" w:lineRule="auto"/>
-        <w:ind w:left="963"/>
+        <w:ind w:left="566"/>
       </w:pPr>
       <w:r>
         <w:rPr>
@@ -5004,6 +5202,14 @@
       </w:r>
       <w:r>
         <w:rPr>
+          <w:rFonts w:ascii="Times New Roman" w:cs="Times New Roman" w:eastAsia="Times New Roman" w:hAnsi="Times New Roman"/>
+          <w:sz w:val="28"/>
+          <w:szCs w:val="28"/>
+        </w:rPr>
+        <w:t xml:space="preserve">GV nhập từ khóa vào </w:t>
+      </w:r>
+      <w:r>
+        <w:rPr>
           <w:rFonts w:ascii="Courier New" w:cs="Courier New" w:eastAsia="Courier New" w:hAnsi="Courier New"/>
           <w:sz w:val="22"/>
           <w:szCs w:val="22"/>
@@ -5016,13 +5222,109 @@
           <w:sz w:val="28"/>
           <w:szCs w:val="28"/>
         </w:rPr>
-        <w:t xml:space="preserve"> — ô nhập từ khóa tìm lớp học phần</w:t>
+        <w:t xml:space="preserve"> và click </w:t>
+      </w:r>
+      <w:r>
+        <w:rPr>
+          <w:rFonts w:ascii="Courier New" w:cs="Courier New" w:eastAsia="Courier New" w:hAnsi="Courier New"/>
+          <w:sz w:val="22"/>
+          <w:szCs w:val="22"/>
+        </w:rPr>
+        <w:t xml:space="preserve">subSearch</w:t>
+      </w:r>
+      <w:r>
+        <w:rPr>
+          <w:rFonts w:ascii="Times New Roman" w:cs="Times New Roman" w:eastAsia="Times New Roman" w:hAnsi="Times New Roman"/>
+          <w:sz w:val="28"/>
+          <w:szCs w:val="28"/>
+        </w:rPr>
+        <w:t xml:space="preserve"> → hệ thống tra cứu lớp học phần → cần chức năng </w:t>
+      </w:r>
+      <w:r>
+        <w:rPr>
+          <w:rFonts w:ascii="Courier New" w:cs="Courier New" w:eastAsia="Courier New" w:hAnsi="Courier New"/>
+          <w:sz w:val="22"/>
+          <w:szCs w:val="22"/>
+        </w:rPr>
+        <w:t xml:space="preserve">searchClassSection()</w:t>
+      </w:r>
+      <w:r>
+        <w:rPr>
+          <w:rFonts w:ascii="Times New Roman" w:cs="Times New Roman" w:eastAsia="Times New Roman" w:hAnsi="Times New Roman"/>
+          <w:sz w:val="28"/>
+          <w:szCs w:val="28"/>
+        </w:rPr>
+        <w:t xml:space="preserve"> → chức năng này là hành động của đối tượng thực thể </w:t>
+      </w:r>
+      <w:r>
+        <w:rPr>
+          <w:rFonts w:ascii="Courier New" w:cs="Courier New" w:eastAsia="Courier New" w:hAnsi="Courier New"/>
+          <w:sz w:val="22"/>
+          <w:szCs w:val="22"/>
+        </w:rPr>
+        <w:t xml:space="preserve">Class</w:t>
+      </w:r>
+      <w:r>
+        <w:rPr>
+          <w:rFonts w:ascii="Times New Roman" w:cs="Times New Roman" w:eastAsia="Times New Roman" w:hAnsi="Times New Roman"/>
+          <w:sz w:val="28"/>
+          <w:szCs w:val="28"/>
+        </w:rPr>
+        <w:t xml:space="preserve"> (lớp này sở hữu các thuộc tính </w:t>
+      </w:r>
+      <w:r>
+        <w:rPr>
+          <w:rFonts w:ascii="Courier New" w:cs="Courier New" w:eastAsia="Courier New" w:hAnsi="Courier New"/>
+          <w:sz w:val="22"/>
+          <w:szCs w:val="22"/>
+        </w:rPr>
+        <w:t xml:space="preserve">-classId</w:t>
+      </w:r>
+      <w:r>
+        <w:rPr>
+          <w:rFonts w:ascii="Times New Roman" w:cs="Times New Roman" w:eastAsia="Times New Roman" w:hAnsi="Times New Roman"/>
+          <w:sz w:val="28"/>
+          <w:szCs w:val="28"/>
+        </w:rPr>
+        <w:t xml:space="preserve">, </w:t>
+      </w:r>
+      <w:r>
+        <w:rPr>
+          <w:rFonts w:ascii="Courier New" w:cs="Courier New" w:eastAsia="Courier New" w:hAnsi="Courier New"/>
+          <w:sz w:val="22"/>
+          <w:szCs w:val="22"/>
+        </w:rPr>
+        <w:t xml:space="preserve">-name</w:t>
+      </w:r>
+      <w:r>
+        <w:rPr>
+          <w:rFonts w:ascii="Times New Roman" w:cs="Times New Roman" w:eastAsia="Times New Roman" w:hAnsi="Times New Roman"/>
+          <w:sz w:val="28"/>
+          <w:szCs w:val="28"/>
+        </w:rPr>
+        <w:t xml:space="preserve">, </w:t>
+      </w:r>
+      <w:r>
+        <w:rPr>
+          <w:rFonts w:ascii="Courier New" w:cs="Courier New" w:eastAsia="Courier New" w:hAnsi="Courier New"/>
+          <w:sz w:val="22"/>
+          <w:szCs w:val="22"/>
+        </w:rPr>
+        <w:t xml:space="preserve">-courseId</w:t>
+      </w:r>
+      <w:r>
+        <w:rPr>
+          <w:rFonts w:ascii="Times New Roman" w:cs="Times New Roman" w:eastAsia="Times New Roman" w:hAnsi="Times New Roman"/>
+          <w:sz w:val="28"/>
+          <w:szCs w:val="28"/>
+        </w:rPr>
+        <w:t xml:space="preserve">).</w:t>
       </w:r>
     </w:p>
     <w:p>
       <w:pPr>
         <w:spacing w:after="0" w:before="60" w:line="360" w:lineRule="auto"/>
-        <w:ind w:left="963"/>
+        <w:ind w:left="566"/>
       </w:pPr>
       <w:r>
         <w:rPr>
@@ -5034,6 +5336,14 @@
       </w:r>
       <w:r>
         <w:rPr>
+          <w:rFonts w:ascii="Times New Roman" w:cs="Times New Roman" w:eastAsia="Times New Roman" w:hAnsi="Times New Roman"/>
+          <w:sz w:val="28"/>
+          <w:szCs w:val="28"/>
+        </w:rPr>
+        <w:t xml:space="preserve">Hệ thống trả về kết quả → </w:t>
+      </w:r>
+      <w:r>
+        <w:rPr>
           <w:rFonts w:ascii="Courier New" w:cs="Courier New" w:eastAsia="Courier New" w:hAnsi="Courier New"/>
           <w:sz w:val="22"/>
           <w:szCs w:val="22"/>
@@ -5046,13 +5356,29 @@
           <w:sz w:val="28"/>
           <w:szCs w:val="28"/>
         </w:rPr>
-        <w:t xml:space="preserve"> — bảng kết quả lớp học phần (hiển thị và chọn)</w:t>
+        <w:t xml:space="preserve"> hiển thị danh sách lớp; GV chọn một lớp → </w:t>
+      </w:r>
+      <w:r>
+        <w:rPr>
+          <w:rFonts w:ascii="Courier New" w:cs="Courier New" w:eastAsia="Courier New" w:hAnsi="Courier New"/>
+          <w:sz w:val="22"/>
+          <w:szCs w:val="22"/>
+        </w:rPr>
+        <w:t xml:space="preserve">outsubListSession</w:t>
+      </w:r>
+      <w:r>
+        <w:rPr>
+          <w:rFonts w:ascii="Times New Roman" w:cs="Times New Roman" w:eastAsia="Times New Roman" w:hAnsi="Times New Roman"/>
+          <w:sz w:val="28"/>
+          <w:szCs w:val="28"/>
+        </w:rPr>
+        <w:t xml:space="preserve"> hiển thị danh sách buổi học.</w:t>
       </w:r>
     </w:p>
     <w:p>
       <w:pPr>
         <w:spacing w:after="0" w:before="60" w:line="360" w:lineRule="auto"/>
-        <w:ind w:left="963"/>
+        <w:ind w:left="566"/>
       </w:pPr>
       <w:r>
         <w:rPr>
@@ -5064,6 +5390,30 @@
       </w:r>
       <w:r>
         <w:rPr>
+          <w:rFonts w:ascii="Times New Roman" w:cs="Times New Roman" w:eastAsia="Times New Roman" w:hAnsi="Times New Roman"/>
+          <w:sz w:val="28"/>
+          <w:szCs w:val="28"/>
+        </w:rPr>
+        <w:t xml:space="preserve">GV chọn buổi học trong </w:t>
+      </w:r>
+      <w:r>
+        <w:rPr>
+          <w:rFonts w:ascii="Courier New" w:cs="Courier New" w:eastAsia="Courier New" w:hAnsi="Courier New"/>
+          <w:sz w:val="22"/>
+          <w:szCs w:val="22"/>
+        </w:rPr>
+        <w:t xml:space="preserve">outsubListSession</w:t>
+      </w:r>
+      <w:r>
+        <w:rPr>
+          <w:rFonts w:ascii="Times New Roman" w:cs="Times New Roman" w:eastAsia="Times New Roman" w:hAnsi="Times New Roman"/>
+          <w:sz w:val="28"/>
+          <w:szCs w:val="28"/>
+        </w:rPr>
+        <w:t xml:space="preserve"> và click </w:t>
+      </w:r>
+      <w:r>
+        <w:rPr>
           <w:rFonts w:ascii="Courier New" w:cs="Courier New" w:eastAsia="Courier New" w:hAnsi="Courier New"/>
           <w:sz w:val="22"/>
           <w:szCs w:val="22"/>
@@ -5076,13 +5426,109 @@
           <w:sz w:val="28"/>
           <w:szCs w:val="28"/>
         </w:rPr>
-        <w:t xml:space="preserve"> — nút "Tạo mã QR"</w:t>
+        <w:t xml:space="preserve"> → hệ thống tạo mã QR điểm danh cho buổi học → cần chức năng </w:t>
+      </w:r>
+      <w:r>
+        <w:rPr>
+          <w:rFonts w:ascii="Courier New" w:cs="Courier New" w:eastAsia="Courier New" w:hAnsi="Courier New"/>
+          <w:sz w:val="22"/>
+          <w:szCs w:val="22"/>
+        </w:rPr>
+        <w:t xml:space="preserve">generateQr()</w:t>
+      </w:r>
+      <w:r>
+        <w:rPr>
+          <w:rFonts w:ascii="Times New Roman" w:cs="Times New Roman" w:eastAsia="Times New Roman" w:hAnsi="Times New Roman"/>
+          <w:sz w:val="28"/>
+          <w:szCs w:val="28"/>
+        </w:rPr>
+        <w:t xml:space="preserve"> → chức năng này là hành động của đối tượng thực thể </w:t>
+      </w:r>
+      <w:r>
+        <w:rPr>
+          <w:rFonts w:ascii="Courier New" w:cs="Courier New" w:eastAsia="Courier New" w:hAnsi="Courier New"/>
+          <w:sz w:val="22"/>
+          <w:szCs w:val="22"/>
+        </w:rPr>
+        <w:t xml:space="preserve">Attendance</w:t>
+      </w:r>
+      <w:r>
+        <w:rPr>
+          <w:rFonts w:ascii="Times New Roman" w:cs="Times New Roman" w:eastAsia="Times New Roman" w:hAnsi="Times New Roman"/>
+          <w:sz w:val="28"/>
+          <w:szCs w:val="28"/>
+        </w:rPr>
+        <w:t xml:space="preserve"> (lớp này sở hữu các thuộc tính </w:t>
+      </w:r>
+      <w:r>
+        <w:rPr>
+          <w:rFonts w:ascii="Courier New" w:cs="Courier New" w:eastAsia="Courier New" w:hAnsi="Courier New"/>
+          <w:sz w:val="22"/>
+          <w:szCs w:val="22"/>
+        </w:rPr>
+        <w:t xml:space="preserve">-classSessionId</w:t>
+      </w:r>
+      <w:r>
+        <w:rPr>
+          <w:rFonts w:ascii="Times New Roman" w:cs="Times New Roman" w:eastAsia="Times New Roman" w:hAnsi="Times New Roman"/>
+          <w:sz w:val="28"/>
+          <w:szCs w:val="28"/>
+        </w:rPr>
+        <w:t xml:space="preserve">, </w:t>
+      </w:r>
+      <w:r>
+        <w:rPr>
+          <w:rFonts w:ascii="Courier New" w:cs="Courier New" w:eastAsia="Courier New" w:hAnsi="Courier New"/>
+          <w:sz w:val="22"/>
+          <w:szCs w:val="22"/>
+        </w:rPr>
+        <w:t xml:space="preserve">-studentId</w:t>
+      </w:r>
+      <w:r>
+        <w:rPr>
+          <w:rFonts w:ascii="Times New Roman" w:cs="Times New Roman" w:eastAsia="Times New Roman" w:hAnsi="Times New Roman"/>
+          <w:sz w:val="28"/>
+          <w:szCs w:val="28"/>
+        </w:rPr>
+        <w:t xml:space="preserve">, </w:t>
+      </w:r>
+      <w:r>
+        <w:rPr>
+          <w:rFonts w:ascii="Courier New" w:cs="Courier New" w:eastAsia="Courier New" w:hAnsi="Courier New"/>
+          <w:sz w:val="22"/>
+          <w:szCs w:val="22"/>
+        </w:rPr>
+        <w:t xml:space="preserve">-status</w:t>
+      </w:r>
+      <w:r>
+        <w:rPr>
+          <w:rFonts w:ascii="Times New Roman" w:cs="Times New Roman" w:eastAsia="Times New Roman" w:hAnsi="Times New Roman"/>
+          <w:sz w:val="28"/>
+          <w:szCs w:val="28"/>
+        </w:rPr>
+        <w:t xml:space="preserve">, </w:t>
+      </w:r>
+      <w:r>
+        <w:rPr>
+          <w:rFonts w:ascii="Courier New" w:cs="Courier New" w:eastAsia="Courier New" w:hAnsi="Courier New"/>
+          <w:sz w:val="22"/>
+          <w:szCs w:val="22"/>
+        </w:rPr>
+        <w:t xml:space="preserve">-method</w:t>
+      </w:r>
+      <w:r>
+        <w:rPr>
+          <w:rFonts w:ascii="Times New Roman" w:cs="Times New Roman" w:eastAsia="Times New Roman" w:hAnsi="Times New Roman"/>
+          <w:sz w:val="28"/>
+          <w:szCs w:val="28"/>
+        </w:rPr>
+        <w:t xml:space="preserve">).</w:t>
       </w:r>
     </w:p>
     <w:p>
       <w:pPr>
         <w:spacing w:after="0" w:before="60" w:line="360" w:lineRule="auto"/>
-        <w:ind w:left="963"/>
+        <w:ind w:left="566"/>
       </w:pPr>
       <w:r>
         <w:rPr>
@@ -5094,6 +5540,68 @@
       </w:r>
       <w:r>
         <w:rPr>
+          <w:rFonts w:ascii="Times New Roman" w:cs="Times New Roman" w:eastAsia="Times New Roman" w:hAnsi="Times New Roman"/>
+          <w:sz w:val="28"/>
+          <w:szCs w:val="28"/>
+        </w:rPr>
+        <w:t xml:space="preserve">Hệ thống trả về mã QR → </w:t>
+      </w:r>
+      <w:r>
+        <w:rPr>
+          <w:rFonts w:ascii="Courier New" w:cs="Courier New" w:eastAsia="Courier New" w:hAnsi="Courier New"/>
+          <w:sz w:val="22"/>
+          <w:szCs w:val="22"/>
+        </w:rPr>
+        <w:t xml:space="preserve">outQRCode</w:t>
+      </w:r>
+      <w:r>
+        <w:rPr>
+          <w:rFonts w:ascii="Times New Roman" w:cs="Times New Roman" w:eastAsia="Times New Roman" w:hAnsi="Times New Roman"/>
+          <w:sz w:val="28"/>
+          <w:szCs w:val="28"/>
+        </w:rPr>
+        <w:t xml:space="preserve"> hiển thị mã; </w:t>
+      </w:r>
+      <w:r>
+        <w:rPr>
+          <w:rFonts w:ascii="Courier New" w:cs="Courier New" w:eastAsia="Courier New" w:hAnsi="Courier New"/>
+          <w:sz w:val="22"/>
+          <w:szCs w:val="22"/>
+        </w:rPr>
+        <w:t xml:space="preserve">outAttendanceList</w:t>
+      </w:r>
+      <w:r>
+        <w:rPr>
+          <w:rFonts w:ascii="Times New Roman" w:cs="Times New Roman" w:eastAsia="Times New Roman" w:hAnsi="Times New Roman"/>
+          <w:sz w:val="28"/>
+          <w:szCs w:val="28"/>
+        </w:rPr>
+        <w:t xml:space="preserve"> hiển thị danh sách SV với trạng thái điểm danh ban đầu.</w:t>
+      </w:r>
+    </w:p>
+    <w:p>
+      <w:pPr>
+        <w:spacing w:after="0" w:before="60" w:line="360" w:lineRule="auto"/>
+        <w:ind w:left="566"/>
+      </w:pPr>
+      <w:r>
+        <w:rPr>
+          <w:rFonts w:ascii="Times New Roman" w:cs="Times New Roman" w:eastAsia="Times New Roman" w:hAnsi="Times New Roman"/>
+          <w:sz w:val="28"/>
+          <w:szCs w:val="28"/>
+        </w:rPr>
+        <w:t xml:space="preserve">• </w:t>
+      </w:r>
+      <w:r>
+        <w:rPr>
+          <w:rFonts w:ascii="Times New Roman" w:cs="Times New Roman" w:eastAsia="Times New Roman" w:hAnsi="Times New Roman"/>
+          <w:sz w:val="28"/>
+          <w:szCs w:val="28"/>
+        </w:rPr>
+        <w:t xml:space="preserve">GV click </w:t>
+      </w:r>
+      <w:r>
+        <w:rPr>
           <w:rFonts w:ascii="Courier New" w:cs="Courier New" w:eastAsia="Courier New" w:hAnsi="Courier New"/>
           <w:sz w:val="22"/>
           <w:szCs w:val="22"/>
@@ -5106,13 +5614,45 @@
           <w:sz w:val="28"/>
           <w:szCs w:val="28"/>
         </w:rPr>
-        <w:t xml:space="preserve"> — nút "Tắt mã QR"</w:t>
+        <w:t xml:space="preserve"> sau khi kết thúc điểm danh → hệ thống đóng điểm danh và ghi vắng cho SV chưa điểm danh → cần chức năng </w:t>
+      </w:r>
+      <w:r>
+        <w:rPr>
+          <w:rFonts w:ascii="Courier New" w:cs="Courier New" w:eastAsia="Courier New" w:hAnsi="Courier New"/>
+          <w:sz w:val="22"/>
+          <w:szCs w:val="22"/>
+        </w:rPr>
+        <w:t xml:space="preserve">deactivateQr()</w:t>
+      </w:r>
+      <w:r>
+        <w:rPr>
+          <w:rFonts w:ascii="Times New Roman" w:cs="Times New Roman" w:eastAsia="Times New Roman" w:hAnsi="Times New Roman"/>
+          <w:sz w:val="28"/>
+          <w:szCs w:val="28"/>
+        </w:rPr>
+        <w:t xml:space="preserve"> của đối tượng thực thể </w:t>
+      </w:r>
+      <w:r>
+        <w:rPr>
+          <w:rFonts w:ascii="Courier New" w:cs="Courier New" w:eastAsia="Courier New" w:hAnsi="Courier New"/>
+          <w:sz w:val="22"/>
+          <w:szCs w:val="22"/>
+        </w:rPr>
+        <w:t xml:space="preserve">Attendance</w:t>
+      </w:r>
+      <w:r>
+        <w:rPr>
+          <w:rFonts w:ascii="Times New Roman" w:cs="Times New Roman" w:eastAsia="Times New Roman" w:hAnsi="Times New Roman"/>
+          <w:sz w:val="28"/>
+          <w:szCs w:val="28"/>
+        </w:rPr>
+        <w:t xml:space="preserve">.</w:t>
       </w:r>
     </w:p>
     <w:p>
       <w:pPr>
         <w:spacing w:after="0" w:before="60" w:line="360" w:lineRule="auto"/>
-        <w:ind w:left="963"/>
+        <w:ind w:left="566"/>
       </w:pPr>
       <w:r>
         <w:rPr>
@@ -5124,6 +5664,14 @@
       </w:r>
       <w:r>
         <w:rPr>
+          <w:rFonts w:ascii="Times New Roman" w:cs="Times New Roman" w:eastAsia="Times New Roman" w:hAnsi="Times New Roman"/>
+          <w:sz w:val="28"/>
+          <w:szCs w:val="28"/>
+        </w:rPr>
+        <w:t xml:space="preserve">Hệ thống thông báo đóng điểm danh thành công, đồng thời tải lại </w:t>
+      </w:r>
+      <w:r>
+        <w:rPr>
           <w:rFonts w:ascii="Courier New" w:cs="Courier New" w:eastAsia="Courier New" w:hAnsi="Courier New"/>
           <w:sz w:val="22"/>
           <w:szCs w:val="22"/>
@@ -5136,29 +5684,7 @@
           <w:sz w:val="28"/>
           <w:szCs w:val="28"/>
         </w:rPr>
-        <w:t xml:space="preserve"> — bảng danh sách sinh viên kèm trạng thái điểm danh</w:t>
-      </w:r>
-    </w:p>
-    <w:p>
-      <w:pPr>
-        <w:spacing w:after="0" w:before="60" w:line="360" w:lineRule="auto"/>
-        <w:ind w:left="566"/>
-      </w:pPr>
-      <w:r>
-        <w:rPr>
-          <w:rFonts w:ascii="Times New Roman" w:cs="Times New Roman" w:eastAsia="Times New Roman" w:hAnsi="Times New Roman"/>
-          <w:sz w:val="28"/>
-          <w:szCs w:val="28"/>
-        </w:rPr>
-        <w:t xml:space="preserve">• </w:t>
-      </w:r>
-      <w:r>
-        <w:rPr>
-          <w:rFonts w:ascii="Times New Roman" w:cs="Times New Roman" w:eastAsia="Times New Roman" w:hAnsi="Times New Roman"/>
-          <w:sz w:val="28"/>
-          <w:szCs w:val="28"/>
-        </w:rPr>
-        <w:t xml:space="preserve">GV nhập từ khóa và nhấn tìm → </w:t>
+        <w:t xml:space="preserve"> và quay về </w:t>
       </w:r>
       <w:r>
         <w:rPr>
@@ -5174,303 +5700,7 @@
           <w:sz w:val="28"/>
           <w:szCs w:val="28"/>
         </w:rPr>
-        <w:t xml:space="preserve"> gọi </w:t>
-      </w:r>
-      <w:r>
-        <w:rPr>
-          <w:rFonts w:ascii="Courier New" w:cs="Courier New" w:eastAsia="Courier New" w:hAnsi="Courier New"/>
-          <w:sz w:val="22"/>
-          <w:szCs w:val="22"/>
-        </w:rPr>
-        <w:t xml:space="preserve">searchClassSection()</w:t>
-      </w:r>
-      <w:r>
-        <w:rPr>
-          <w:rFonts w:ascii="Times New Roman" w:cs="Times New Roman" w:eastAsia="Times New Roman" w:hAnsi="Times New Roman"/>
-          <w:sz w:val="28"/>
-          <w:szCs w:val="28"/>
-        </w:rPr>
-        <w:t xml:space="preserve"> của lớp </w:t>
-      </w:r>
-      <w:r>
-        <w:rPr>
-          <w:rFonts w:ascii="Courier New" w:cs="Courier New" w:eastAsia="Courier New" w:hAnsi="Courier New"/>
-          <w:sz w:val="22"/>
-          <w:szCs w:val="22"/>
-        </w:rPr>
-        <w:t xml:space="preserve">Class</w:t>
-      </w:r>
-      <w:r>
-        <w:rPr>
-          <w:rFonts w:ascii="Times New Roman" w:cs="Times New Roman" w:eastAsia="Times New Roman" w:hAnsi="Times New Roman"/>
-          <w:sz w:val="28"/>
-          <w:szCs w:val="28"/>
-        </w:rPr>
-        <w:t xml:space="preserve">; kết quả hiển thị ở </w:t>
-      </w:r>
-      <w:r>
-        <w:rPr>
-          <w:rFonts w:ascii="Courier New" w:cs="Courier New" w:eastAsia="Courier New" w:hAnsi="Courier New"/>
-          <w:sz w:val="22"/>
-          <w:szCs w:val="22"/>
-        </w:rPr>
-        <w:t xml:space="preserve">outsubListClass</w:t>
-      </w:r>
-      <w:r>
-        <w:rPr>
-          <w:rFonts w:ascii="Times New Roman" w:cs="Times New Roman" w:eastAsia="Times New Roman" w:hAnsi="Times New Roman"/>
-          <w:sz w:val="28"/>
-          <w:szCs w:val="28"/>
-        </w:rPr>
         <w:t xml:space="preserve">.</w:t>
-      </w:r>
-    </w:p>
-    <w:p>
-      <w:pPr>
-        <w:spacing w:after="0" w:before="60" w:line="360" w:lineRule="auto"/>
-        <w:ind w:left="566"/>
-      </w:pPr>
-      <w:r>
-        <w:rPr>
-          <w:rFonts w:ascii="Times New Roman" w:cs="Times New Roman" w:eastAsia="Times New Roman" w:hAnsi="Times New Roman"/>
-          <w:sz w:val="28"/>
-          <w:szCs w:val="28"/>
-        </w:rPr>
-        <w:t xml:space="preserve">• </w:t>
-      </w:r>
-      <w:r>
-        <w:rPr>
-          <w:rFonts w:ascii="Times New Roman" w:cs="Times New Roman" w:eastAsia="Times New Roman" w:hAnsi="Times New Roman"/>
-          <w:sz w:val="28"/>
-          <w:szCs w:val="28"/>
-        </w:rPr>
-        <w:t xml:space="preserve">GV chọn lớp, chọn buổi học và nhấn </w:t>
-      </w:r>
-      <w:r>
-        <w:rPr>
-          <w:rFonts w:ascii="Courier New" w:cs="Courier New" w:eastAsia="Courier New" w:hAnsi="Courier New"/>
-          <w:sz w:val="22"/>
-          <w:szCs w:val="22"/>
-        </w:rPr>
-        <w:t xml:space="preserve">subGenerateQr</w:t>
-      </w:r>
-      <w:r>
-        <w:rPr>
-          <w:rFonts w:ascii="Times New Roman" w:cs="Times New Roman" w:eastAsia="Times New Roman" w:hAnsi="Times New Roman"/>
-          <w:sz w:val="28"/>
-          <w:szCs w:val="28"/>
-        </w:rPr>
-        <w:t xml:space="preserve"> → </w:t>
-      </w:r>
-      <w:r>
-        <w:rPr>
-          <w:rFonts w:ascii="Courier New" w:cs="Courier New" w:eastAsia="Courier New" w:hAnsi="Courier New"/>
-          <w:sz w:val="22"/>
-          <w:szCs w:val="22"/>
-        </w:rPr>
-        <w:t xml:space="preserve">QRSessionView</w:t>
-      </w:r>
-      <w:r>
-        <w:rPr>
-          <w:rFonts w:ascii="Times New Roman" w:cs="Times New Roman" w:eastAsia="Times New Roman" w:hAnsi="Times New Roman"/>
-          <w:sz w:val="28"/>
-          <w:szCs w:val="28"/>
-        </w:rPr>
-        <w:t xml:space="preserve"> gọi </w:t>
-      </w:r>
-      <w:r>
-        <w:rPr>
-          <w:rFonts w:ascii="Courier New" w:cs="Courier New" w:eastAsia="Courier New" w:hAnsi="Courier New"/>
-          <w:sz w:val="22"/>
-          <w:szCs w:val="22"/>
-        </w:rPr>
-        <w:t xml:space="preserve">generateQr()</w:t>
-      </w:r>
-      <w:r>
-        <w:rPr>
-          <w:rFonts w:ascii="Times New Roman" w:cs="Times New Roman" w:eastAsia="Times New Roman" w:hAnsi="Times New Roman"/>
-          <w:sz w:val="28"/>
-          <w:szCs w:val="28"/>
-        </w:rPr>
-        <w:t xml:space="preserve"> của lớp </w:t>
-      </w:r>
-      <w:r>
-        <w:rPr>
-          <w:rFonts w:ascii="Courier New" w:cs="Courier New" w:eastAsia="Courier New" w:hAnsi="Courier New"/>
-          <w:sz w:val="22"/>
-          <w:szCs w:val="22"/>
-        </w:rPr>
-        <w:t xml:space="preserve">Attendance</w:t>
-      </w:r>
-      <w:r>
-        <w:rPr>
-          <w:rFonts w:ascii="Times New Roman" w:cs="Times New Roman" w:eastAsia="Times New Roman" w:hAnsi="Times New Roman"/>
-          <w:sz w:val="28"/>
-          <w:szCs w:val="28"/>
-        </w:rPr>
-        <w:t xml:space="preserve">.</w:t>
-      </w:r>
-    </w:p>
-    <w:p>
-      <w:pPr>
-        <w:spacing w:after="0" w:before="60" w:line="360" w:lineRule="auto"/>
-        <w:ind w:left="566"/>
-      </w:pPr>
-      <w:r>
-        <w:rPr>
-          <w:rFonts w:ascii="Times New Roman" w:cs="Times New Roman" w:eastAsia="Times New Roman" w:hAnsi="Times New Roman"/>
-          <w:sz w:val="28"/>
-          <w:szCs w:val="28"/>
-        </w:rPr>
-        <w:t xml:space="preserve">• </w:t>
-      </w:r>
-      <w:r>
-        <w:rPr>
-          <w:rFonts w:ascii="Times New Roman" w:cs="Times New Roman" w:eastAsia="Times New Roman" w:hAnsi="Times New Roman"/>
-          <w:sz w:val="28"/>
-          <w:szCs w:val="28"/>
-        </w:rPr>
-        <w:t xml:space="preserve">Hệ thống hiển thị mã QR điểm danh → </w:t>
-      </w:r>
-      <w:r>
-        <w:rPr>
-          <w:rFonts w:ascii="Courier New" w:cs="Courier New" w:eastAsia="Courier New" w:hAnsi="Courier New"/>
-          <w:sz w:val="22"/>
-          <w:szCs w:val="22"/>
-        </w:rPr>
-        <w:t xml:space="preserve">QRSessionView</w:t>
-      </w:r>
-      <w:r>
-        <w:rPr>
-          <w:rFonts w:ascii="Times New Roman" w:cs="Times New Roman" w:eastAsia="Times New Roman" w:hAnsi="Times New Roman"/>
-          <w:sz w:val="28"/>
-          <w:szCs w:val="28"/>
-        </w:rPr>
-        <w:t xml:space="preserve"> cập nhật giao diện.</w:t>
-      </w:r>
-    </w:p>
-    <w:p>
-      <w:pPr>
-        <w:spacing w:after="0" w:before="60" w:line="360" w:lineRule="auto"/>
-        <w:ind w:left="566"/>
-      </w:pPr>
-      <w:r>
-        <w:rPr>
-          <w:rFonts w:ascii="Times New Roman" w:cs="Times New Roman" w:eastAsia="Times New Roman" w:hAnsi="Times New Roman"/>
-          <w:sz w:val="28"/>
-          <w:szCs w:val="28"/>
-        </w:rPr>
-        <w:t xml:space="preserve">• </w:t>
-      </w:r>
-      <w:r>
-        <w:rPr>
-          <w:rFonts w:ascii="Times New Roman" w:cs="Times New Roman" w:eastAsia="Times New Roman" w:hAnsi="Times New Roman"/>
-          <w:sz w:val="28"/>
-          <w:szCs w:val="28"/>
-        </w:rPr>
-        <w:t xml:space="preserve">GV nhấn </w:t>
-      </w:r>
-      <w:r>
-        <w:rPr>
-          <w:rFonts w:ascii="Courier New" w:cs="Courier New" w:eastAsia="Courier New" w:hAnsi="Courier New"/>
-          <w:sz w:val="22"/>
-          <w:szCs w:val="22"/>
-        </w:rPr>
-        <w:t xml:space="preserve">subDeactivateQr</w:t>
-      </w:r>
-      <w:r>
-        <w:rPr>
-          <w:rFonts w:ascii="Times New Roman" w:cs="Times New Roman" w:eastAsia="Times New Roman" w:hAnsi="Times New Roman"/>
-          <w:sz w:val="28"/>
-          <w:szCs w:val="28"/>
-        </w:rPr>
-        <w:t xml:space="preserve"> → </w:t>
-      </w:r>
-      <w:r>
-        <w:rPr>
-          <w:rFonts w:ascii="Courier New" w:cs="Courier New" w:eastAsia="Courier New" w:hAnsi="Courier New"/>
-          <w:sz w:val="22"/>
-          <w:szCs w:val="22"/>
-        </w:rPr>
-        <w:t xml:space="preserve">QRSessionView</w:t>
-      </w:r>
-      <w:r>
-        <w:rPr>
-          <w:rFonts w:ascii="Times New Roman" w:cs="Times New Roman" w:eastAsia="Times New Roman" w:hAnsi="Times New Roman"/>
-          <w:sz w:val="28"/>
-          <w:szCs w:val="28"/>
-        </w:rPr>
-        <w:t xml:space="preserve"> gọi </w:t>
-      </w:r>
-      <w:r>
-        <w:rPr>
-          <w:rFonts w:ascii="Courier New" w:cs="Courier New" w:eastAsia="Courier New" w:hAnsi="Courier New"/>
-          <w:sz w:val="22"/>
-          <w:szCs w:val="22"/>
-        </w:rPr>
-        <w:t xml:space="preserve">deactivateQr()</w:t>
-      </w:r>
-      <w:r>
-        <w:rPr>
-          <w:rFonts w:ascii="Times New Roman" w:cs="Times New Roman" w:eastAsia="Times New Roman" w:hAnsi="Times New Roman"/>
-          <w:sz w:val="28"/>
-          <w:szCs w:val="28"/>
-        </w:rPr>
-        <w:t xml:space="preserve"> của lớp </w:t>
-      </w:r>
-      <w:r>
-        <w:rPr>
-          <w:rFonts w:ascii="Courier New" w:cs="Courier New" w:eastAsia="Courier New" w:hAnsi="Courier New"/>
-          <w:sz w:val="22"/>
-          <w:szCs w:val="22"/>
-        </w:rPr>
-        <w:t xml:space="preserve">Attendance</w:t>
-      </w:r>
-      <w:r>
-        <w:rPr>
-          <w:rFonts w:ascii="Times New Roman" w:cs="Times New Roman" w:eastAsia="Times New Roman" w:hAnsi="Times New Roman"/>
-          <w:sz w:val="28"/>
-          <w:szCs w:val="28"/>
-        </w:rPr>
-        <w:t xml:space="preserve">.</w:t>
-      </w:r>
-    </w:p>
-    <w:p>
-      <w:pPr>
-        <w:spacing w:after="0" w:before="60" w:line="360" w:lineRule="auto"/>
-        <w:ind w:left="566"/>
-      </w:pPr>
-      <w:r>
-        <w:rPr>
-          <w:rFonts w:ascii="Times New Roman" w:cs="Times New Roman" w:eastAsia="Times New Roman" w:hAnsi="Times New Roman"/>
-          <w:sz w:val="28"/>
-          <w:szCs w:val="28"/>
-        </w:rPr>
-        <w:t xml:space="preserve">• </w:t>
-      </w:r>
-      <w:r>
-        <w:rPr>
-          <w:rFonts w:ascii="Times New Roman" w:cs="Times New Roman" w:eastAsia="Times New Roman" w:hAnsi="Times New Roman"/>
-          <w:sz w:val="28"/>
-          <w:szCs w:val="28"/>
-        </w:rPr>
-        <w:t xml:space="preserve">Hệ thống đóng điểm danh, ghi vắng cho SV chưa điểm danh → </w:t>
-      </w:r>
-      <w:r>
-        <w:rPr>
-          <w:rFonts w:ascii="Courier New" w:cs="Courier New" w:eastAsia="Courier New" w:hAnsi="Courier New"/>
-          <w:sz w:val="22"/>
-          <w:szCs w:val="22"/>
-        </w:rPr>
-        <w:t xml:space="preserve">outAttendanceList</w:t>
-      </w:r>
-      <w:r>
-        <w:rPr>
-          <w:rFonts w:ascii="Times New Roman" w:cs="Times New Roman" w:eastAsia="Times New Roman" w:hAnsi="Times New Roman"/>
-          <w:sz w:val="28"/>
-          <w:szCs w:val="28"/>
-        </w:rPr>
-        <w:t xml:space="preserve"> cập nhật trạng thái.</w:t>
       </w:r>
     </w:p>
     <w:p>
@@ -5486,7 +5716,7 @@
       <w:r>
         <w:drawing>
           <wp:inline distT="0" distB="0" distL="0" distR="0">
-            <wp:extent cx="5048250" cy="3305175"/>
+            <wp:extent cx="5048250" cy="3057525"/>
             <wp:effectExtent t="0" r="0" b="0" l="0"/>
             <wp:docPr id="1" name="" descr="" title=""/>
             <wp:cNvGraphicFramePr>
@@ -5511,7 +5741,7 @@
                   <pic:spPr bwMode="auto">
                     <a:xfrm>
                       <a:off x="0" y="0"/>
-                      <a:ext cx="5048250" cy="3305175"/>
+                      <a:ext cx="5048250" cy="3057525"/>
                     </a:xfrm>
                     <a:prstGeom prst="rect">
                       <a:avLst/>
@@ -5612,7 +5842,77 @@
           <w:sz w:val="28"/>
           <w:szCs w:val="28"/>
         </w:rPr>
-        <w:t xml:space="preserve">GV vào giao diện → đề xuất lớp </w:t>
+        <w:t xml:space="preserve">Sau khi đăng nhập thành công, hệ thống hiển thị giao diện chính của giảng viên → đề xuất lớp </w:t>
+      </w:r>
+      <w:r>
+        <w:rPr>
+          <w:rFonts w:ascii="Courier New" w:cs="Courier New" w:eastAsia="Courier New" w:hAnsi="Courier New"/>
+          <w:sz w:val="22"/>
+          <w:szCs w:val="22"/>
+        </w:rPr>
+        <w:t xml:space="preserve">LecturerHomeView</w:t>
+      </w:r>
+      <w:r>
+        <w:rPr>
+          <w:rFonts w:ascii="Times New Roman" w:cs="Times New Roman" w:eastAsia="Times New Roman" w:hAnsi="Times New Roman"/>
+          <w:sz w:val="28"/>
+          <w:szCs w:val="28"/>
+        </w:rPr>
+        <w:t xml:space="preserve">, có ít nhất nút quản lý điểm danh (</w:t>
+      </w:r>
+      <w:r>
+        <w:rPr>
+          <w:rFonts w:ascii="Courier New" w:cs="Courier New" w:eastAsia="Courier New" w:hAnsi="Courier New"/>
+          <w:sz w:val="22"/>
+          <w:szCs w:val="22"/>
+        </w:rPr>
+        <w:t xml:space="preserve">-subManageAttendance</w:t>
+      </w:r>
+      <w:r>
+        <w:rPr>
+          <w:rFonts w:ascii="Times New Roman" w:cs="Times New Roman" w:eastAsia="Times New Roman" w:hAnsi="Times New Roman"/>
+          <w:sz w:val="28"/>
+          <w:szCs w:val="28"/>
+        </w:rPr>
+        <w:t xml:space="preserve">).</w:t>
+      </w:r>
+    </w:p>
+    <w:p>
+      <w:pPr>
+        <w:spacing w:after="0" w:before="60" w:line="360" w:lineRule="auto"/>
+        <w:ind w:left="566"/>
+      </w:pPr>
+      <w:r>
+        <w:rPr>
+          <w:rFonts w:ascii="Times New Roman" w:cs="Times New Roman" w:eastAsia="Times New Roman" w:hAnsi="Times New Roman"/>
+          <w:sz w:val="28"/>
+          <w:szCs w:val="28"/>
+        </w:rPr>
+        <w:t xml:space="preserve">• </w:t>
+      </w:r>
+      <w:r>
+        <w:rPr>
+          <w:rFonts w:ascii="Times New Roman" w:cs="Times New Roman" w:eastAsia="Times New Roman" w:hAnsi="Times New Roman"/>
+          <w:sz w:val="28"/>
+          <w:szCs w:val="28"/>
+        </w:rPr>
+        <w:t xml:space="preserve">GV click vào </w:t>
+      </w:r>
+      <w:r>
+        <w:rPr>
+          <w:rFonts w:ascii="Courier New" w:cs="Courier New" w:eastAsia="Courier New" w:hAnsi="Courier New"/>
+          <w:sz w:val="22"/>
+          <w:szCs w:val="22"/>
+        </w:rPr>
+        <w:t xml:space="preserve">subManageAttendance</w:t>
+      </w:r>
+      <w:r>
+        <w:rPr>
+          <w:rFonts w:ascii="Times New Roman" w:cs="Times New Roman" w:eastAsia="Times New Roman" w:hAnsi="Times New Roman"/>
+          <w:sz w:val="28"/>
+          <w:szCs w:val="28"/>
+        </w:rPr>
+        <w:t xml:space="preserve"> → giao diện quản lý điểm danh hiện lên → đề xuất lớp </w:t>
       </w:r>
       <w:r>
         <w:rPr>
@@ -5628,13 +5928,109 @@
           <w:sz w:val="28"/>
           <w:szCs w:val="28"/>
         </w:rPr>
-        <w:t xml:space="preserve"> với:</w:t>
+        <w:t xml:space="preserve">, giao diện này chứa: ô nhập từ khóa tìm lớp học phần (</w:t>
+      </w:r>
+      <w:r>
+        <w:rPr>
+          <w:rFonts w:ascii="Courier New" w:cs="Courier New" w:eastAsia="Courier New" w:hAnsi="Courier New"/>
+          <w:sz w:val="22"/>
+          <w:szCs w:val="22"/>
+        </w:rPr>
+        <w:t xml:space="preserve">-inClassSection</w:t>
+      </w:r>
+      <w:r>
+        <w:rPr>
+          <w:rFonts w:ascii="Times New Roman" w:cs="Times New Roman" w:eastAsia="Times New Roman" w:hAnsi="Times New Roman"/>
+          <w:sz w:val="28"/>
+          <w:szCs w:val="28"/>
+        </w:rPr>
+        <w:t xml:space="preserve">), nút tìm kiếm (</w:t>
+      </w:r>
+      <w:r>
+        <w:rPr>
+          <w:rFonts w:ascii="Courier New" w:cs="Courier New" w:eastAsia="Courier New" w:hAnsi="Courier New"/>
+          <w:sz w:val="22"/>
+          <w:szCs w:val="22"/>
+        </w:rPr>
+        <w:t xml:space="preserve">-subSearch</w:t>
+      </w:r>
+      <w:r>
+        <w:rPr>
+          <w:rFonts w:ascii="Times New Roman" w:cs="Times New Roman" w:eastAsia="Times New Roman" w:hAnsi="Times New Roman"/>
+          <w:sz w:val="28"/>
+          <w:szCs w:val="28"/>
+        </w:rPr>
+        <w:t xml:space="preserve">), bảng kết quả lớp học phần có thể chọn (</w:t>
+      </w:r>
+      <w:r>
+        <w:rPr>
+          <w:rFonts w:ascii="Courier New" w:cs="Courier New" w:eastAsia="Courier New" w:hAnsi="Courier New"/>
+          <w:sz w:val="22"/>
+          <w:szCs w:val="22"/>
+        </w:rPr>
+        <w:t xml:space="preserve">-outsubListClass</w:t>
+      </w:r>
+      <w:r>
+        <w:rPr>
+          <w:rFonts w:ascii="Times New Roman" w:cs="Times New Roman" w:eastAsia="Times New Roman" w:hAnsi="Times New Roman"/>
+          <w:sz w:val="28"/>
+          <w:szCs w:val="28"/>
+        </w:rPr>
+        <w:t xml:space="preserve">), dropdown chọn buổi học (</w:t>
+      </w:r>
+      <w:r>
+        <w:rPr>
+          <w:rFonts w:ascii="Courier New" w:cs="Courier New" w:eastAsia="Courier New" w:hAnsi="Courier New"/>
+          <w:sz w:val="22"/>
+          <w:szCs w:val="22"/>
+        </w:rPr>
+        <w:t xml:space="preserve">-inSession</w:t>
+      </w:r>
+      <w:r>
+        <w:rPr>
+          <w:rFonts w:ascii="Times New Roman" w:cs="Times New Roman" w:eastAsia="Times New Roman" w:hAnsi="Times New Roman"/>
+          <w:sz w:val="28"/>
+          <w:szCs w:val="28"/>
+        </w:rPr>
+        <w:t xml:space="preserve">), bảng danh sách SV kèm trạng thái điểm danh có thể chọn để sửa (</w:t>
+      </w:r>
+      <w:r>
+        <w:rPr>
+          <w:rFonts w:ascii="Courier New" w:cs="Courier New" w:eastAsia="Courier New" w:hAnsi="Courier New"/>
+          <w:sz w:val="22"/>
+          <w:szCs w:val="22"/>
+        </w:rPr>
+        <w:t xml:space="preserve">-outsubAttendance</w:t>
+      </w:r>
+      <w:r>
+        <w:rPr>
+          <w:rFonts w:ascii="Times New Roman" w:cs="Times New Roman" w:eastAsia="Times New Roman" w:hAnsi="Times New Roman"/>
+          <w:sz w:val="28"/>
+          <w:szCs w:val="28"/>
+        </w:rPr>
+        <w:t xml:space="preserve">) và nút lưu trạng thái thủ công (</w:t>
+      </w:r>
+      <w:r>
+        <w:rPr>
+          <w:rFonts w:ascii="Courier New" w:cs="Courier New" w:eastAsia="Courier New" w:hAnsi="Courier New"/>
+          <w:sz w:val="22"/>
+          <w:szCs w:val="22"/>
+        </w:rPr>
+        <w:t xml:space="preserve">-subSaveManual</w:t>
+      </w:r>
+      <w:r>
+        <w:rPr>
+          <w:rFonts w:ascii="Times New Roman" w:cs="Times New Roman" w:eastAsia="Times New Roman" w:hAnsi="Times New Roman"/>
+          <w:sz w:val="28"/>
+          <w:szCs w:val="28"/>
+        </w:rPr>
+        <w:t xml:space="preserve">).</w:t>
       </w:r>
     </w:p>
     <w:p>
       <w:pPr>
         <w:spacing w:after="0" w:before="60" w:line="360" w:lineRule="auto"/>
-        <w:ind w:left="963"/>
+        <w:ind w:left="566"/>
       </w:pPr>
       <w:r>
         <w:rPr>
@@ -5646,6 +6042,148 @@
       </w:r>
       <w:r>
         <w:rPr>
+          <w:rFonts w:ascii="Times New Roman" w:cs="Times New Roman" w:eastAsia="Times New Roman" w:hAnsi="Times New Roman"/>
+          <w:sz w:val="28"/>
+          <w:szCs w:val="28"/>
+        </w:rPr>
+        <w:t xml:space="preserve">GV nhập từ khóa và click </w:t>
+      </w:r>
+      <w:r>
+        <w:rPr>
+          <w:rFonts w:ascii="Courier New" w:cs="Courier New" w:eastAsia="Courier New" w:hAnsi="Courier New"/>
+          <w:sz w:val="22"/>
+          <w:szCs w:val="22"/>
+        </w:rPr>
+        <w:t xml:space="preserve">subSearch</w:t>
+      </w:r>
+      <w:r>
+        <w:rPr>
+          <w:rFonts w:ascii="Times New Roman" w:cs="Times New Roman" w:eastAsia="Times New Roman" w:hAnsi="Times New Roman"/>
+          <w:sz w:val="28"/>
+          <w:szCs w:val="28"/>
+        </w:rPr>
+        <w:t xml:space="preserve"> → hệ thống tra cứu lớp học phần → cần chức năng </w:t>
+      </w:r>
+      <w:r>
+        <w:rPr>
+          <w:rFonts w:ascii="Courier New" w:cs="Courier New" w:eastAsia="Courier New" w:hAnsi="Courier New"/>
+          <w:sz w:val="22"/>
+          <w:szCs w:val="22"/>
+        </w:rPr>
+        <w:t xml:space="preserve">searchClassSection()</w:t>
+      </w:r>
+      <w:r>
+        <w:rPr>
+          <w:rFonts w:ascii="Times New Roman" w:cs="Times New Roman" w:eastAsia="Times New Roman" w:hAnsi="Times New Roman"/>
+          <w:sz w:val="28"/>
+          <w:szCs w:val="28"/>
+        </w:rPr>
+        <w:t xml:space="preserve"> → chức năng này là hành động của đối tượng thực thể </w:t>
+      </w:r>
+      <w:r>
+        <w:rPr>
+          <w:rFonts w:ascii="Courier New" w:cs="Courier New" w:eastAsia="Courier New" w:hAnsi="Courier New"/>
+          <w:sz w:val="22"/>
+          <w:szCs w:val="22"/>
+        </w:rPr>
+        <w:t xml:space="preserve">Class</w:t>
+      </w:r>
+      <w:r>
+        <w:rPr>
+          <w:rFonts w:ascii="Times New Roman" w:cs="Times New Roman" w:eastAsia="Times New Roman" w:hAnsi="Times New Roman"/>
+          <w:sz w:val="28"/>
+          <w:szCs w:val="28"/>
+        </w:rPr>
+        <w:t xml:space="preserve"> (lớp này sở hữu các thuộc tính </w:t>
+      </w:r>
+      <w:r>
+        <w:rPr>
+          <w:rFonts w:ascii="Courier New" w:cs="Courier New" w:eastAsia="Courier New" w:hAnsi="Courier New"/>
+          <w:sz w:val="22"/>
+          <w:szCs w:val="22"/>
+        </w:rPr>
+        <w:t xml:space="preserve">-classId</w:t>
+      </w:r>
+      <w:r>
+        <w:rPr>
+          <w:rFonts w:ascii="Times New Roman" w:cs="Times New Roman" w:eastAsia="Times New Roman" w:hAnsi="Times New Roman"/>
+          <w:sz w:val="28"/>
+          <w:szCs w:val="28"/>
+        </w:rPr>
+        <w:t xml:space="preserve">, </w:t>
+      </w:r>
+      <w:r>
+        <w:rPr>
+          <w:rFonts w:ascii="Courier New" w:cs="Courier New" w:eastAsia="Courier New" w:hAnsi="Courier New"/>
+          <w:sz w:val="22"/>
+          <w:szCs w:val="22"/>
+        </w:rPr>
+        <w:t xml:space="preserve">-name</w:t>
+      </w:r>
+      <w:r>
+        <w:rPr>
+          <w:rFonts w:ascii="Times New Roman" w:cs="Times New Roman" w:eastAsia="Times New Roman" w:hAnsi="Times New Roman"/>
+          <w:sz w:val="28"/>
+          <w:szCs w:val="28"/>
+        </w:rPr>
+        <w:t xml:space="preserve">, </w:t>
+      </w:r>
+      <w:r>
+        <w:rPr>
+          <w:rFonts w:ascii="Courier New" w:cs="Courier New" w:eastAsia="Courier New" w:hAnsi="Courier New"/>
+          <w:sz w:val="22"/>
+          <w:szCs w:val="22"/>
+        </w:rPr>
+        <w:t xml:space="preserve">-courseId</w:t>
+      </w:r>
+      <w:r>
+        <w:rPr>
+          <w:rFonts w:ascii="Times New Roman" w:cs="Times New Roman" w:eastAsia="Times New Roman" w:hAnsi="Times New Roman"/>
+          <w:sz w:val="28"/>
+          <w:szCs w:val="28"/>
+        </w:rPr>
+        <w:t xml:space="preserve">).</w:t>
+      </w:r>
+    </w:p>
+    <w:p>
+      <w:pPr>
+        <w:spacing w:after="0" w:before="60" w:line="360" w:lineRule="auto"/>
+        <w:ind w:left="566"/>
+      </w:pPr>
+      <w:r>
+        <w:rPr>
+          <w:rFonts w:ascii="Times New Roman" w:cs="Times New Roman" w:eastAsia="Times New Roman" w:hAnsi="Times New Roman"/>
+          <w:sz w:val="28"/>
+          <w:szCs w:val="28"/>
+        </w:rPr>
+        <w:t xml:space="preserve">• </w:t>
+      </w:r>
+      <w:r>
+        <w:rPr>
+          <w:rFonts w:ascii="Times New Roman" w:cs="Times New Roman" w:eastAsia="Times New Roman" w:hAnsi="Times New Roman"/>
+          <w:sz w:val="28"/>
+          <w:szCs w:val="28"/>
+        </w:rPr>
+        <w:t xml:space="preserve">GV chọn lớp trong </w:t>
+      </w:r>
+      <w:r>
+        <w:rPr>
+          <w:rFonts w:ascii="Courier New" w:cs="Courier New" w:eastAsia="Courier New" w:hAnsi="Courier New"/>
+          <w:sz w:val="22"/>
+          <w:szCs w:val="22"/>
+        </w:rPr>
+        <w:t xml:space="preserve">outsubListClass</w:t>
+      </w:r>
+      <w:r>
+        <w:rPr>
+          <w:rFonts w:ascii="Times New Roman" w:cs="Times New Roman" w:eastAsia="Times New Roman" w:hAnsi="Times New Roman"/>
+          <w:sz w:val="28"/>
+          <w:szCs w:val="28"/>
+        </w:rPr>
+        <w:t xml:space="preserve"> và chọn buổi học qua </w:t>
+      </w:r>
+      <w:r>
+        <w:rPr>
           <w:rFonts w:ascii="Courier New" w:cs="Courier New" w:eastAsia="Courier New" w:hAnsi="Courier New"/>
           <w:sz w:val="22"/>
           <w:szCs w:val="22"/>
@@ -5658,13 +6196,109 @@
           <w:sz w:val="28"/>
           <w:szCs w:val="28"/>
         </w:rPr>
-        <w:t xml:space="preserve"> — dropdown chọn buổi học</w:t>
+        <w:t xml:space="preserve"> → hệ thống tải danh sách điểm danh → cần chức năng </w:t>
+      </w:r>
+      <w:r>
+        <w:rPr>
+          <w:rFonts w:ascii="Courier New" w:cs="Courier New" w:eastAsia="Courier New" w:hAnsi="Courier New"/>
+          <w:sz w:val="22"/>
+          <w:szCs w:val="22"/>
+        </w:rPr>
+        <w:t xml:space="preserve">viewAttendance()</w:t>
+      </w:r>
+      <w:r>
+        <w:rPr>
+          <w:rFonts w:ascii="Times New Roman" w:cs="Times New Roman" w:eastAsia="Times New Roman" w:hAnsi="Times New Roman"/>
+          <w:sz w:val="28"/>
+          <w:szCs w:val="28"/>
+        </w:rPr>
+        <w:t xml:space="preserve"> → chức năng này là hành động của đối tượng thực thể </w:t>
+      </w:r>
+      <w:r>
+        <w:rPr>
+          <w:rFonts w:ascii="Courier New" w:cs="Courier New" w:eastAsia="Courier New" w:hAnsi="Courier New"/>
+          <w:sz w:val="22"/>
+          <w:szCs w:val="22"/>
+        </w:rPr>
+        <w:t xml:space="preserve">Attendance</w:t>
+      </w:r>
+      <w:r>
+        <w:rPr>
+          <w:rFonts w:ascii="Times New Roman" w:cs="Times New Roman" w:eastAsia="Times New Roman" w:hAnsi="Times New Roman"/>
+          <w:sz w:val="28"/>
+          <w:szCs w:val="28"/>
+        </w:rPr>
+        <w:t xml:space="preserve"> (lớp này sở hữu các thuộc tính </w:t>
+      </w:r>
+      <w:r>
+        <w:rPr>
+          <w:rFonts w:ascii="Courier New" w:cs="Courier New" w:eastAsia="Courier New" w:hAnsi="Courier New"/>
+          <w:sz w:val="22"/>
+          <w:szCs w:val="22"/>
+        </w:rPr>
+        <w:t xml:space="preserve">-classSessionId</w:t>
+      </w:r>
+      <w:r>
+        <w:rPr>
+          <w:rFonts w:ascii="Times New Roman" w:cs="Times New Roman" w:eastAsia="Times New Roman" w:hAnsi="Times New Roman"/>
+          <w:sz w:val="28"/>
+          <w:szCs w:val="28"/>
+        </w:rPr>
+        <w:t xml:space="preserve">, </w:t>
+      </w:r>
+      <w:r>
+        <w:rPr>
+          <w:rFonts w:ascii="Courier New" w:cs="Courier New" w:eastAsia="Courier New" w:hAnsi="Courier New"/>
+          <w:sz w:val="22"/>
+          <w:szCs w:val="22"/>
+        </w:rPr>
+        <w:t xml:space="preserve">-studentId</w:t>
+      </w:r>
+      <w:r>
+        <w:rPr>
+          <w:rFonts w:ascii="Times New Roman" w:cs="Times New Roman" w:eastAsia="Times New Roman" w:hAnsi="Times New Roman"/>
+          <w:sz w:val="28"/>
+          <w:szCs w:val="28"/>
+        </w:rPr>
+        <w:t xml:space="preserve">, </w:t>
+      </w:r>
+      <w:r>
+        <w:rPr>
+          <w:rFonts w:ascii="Courier New" w:cs="Courier New" w:eastAsia="Courier New" w:hAnsi="Courier New"/>
+          <w:sz w:val="22"/>
+          <w:szCs w:val="22"/>
+        </w:rPr>
+        <w:t xml:space="preserve">-status</w:t>
+      </w:r>
+      <w:r>
+        <w:rPr>
+          <w:rFonts w:ascii="Times New Roman" w:cs="Times New Roman" w:eastAsia="Times New Roman" w:hAnsi="Times New Roman"/>
+          <w:sz w:val="28"/>
+          <w:szCs w:val="28"/>
+        </w:rPr>
+        <w:t xml:space="preserve">, </w:t>
+      </w:r>
+      <w:r>
+        <w:rPr>
+          <w:rFonts w:ascii="Courier New" w:cs="Courier New" w:eastAsia="Courier New" w:hAnsi="Courier New"/>
+          <w:sz w:val="22"/>
+          <w:szCs w:val="22"/>
+        </w:rPr>
+        <w:t xml:space="preserve">-method</w:t>
+      </w:r>
+      <w:r>
+        <w:rPr>
+          <w:rFonts w:ascii="Times New Roman" w:cs="Times New Roman" w:eastAsia="Times New Roman" w:hAnsi="Times New Roman"/>
+          <w:sz w:val="28"/>
+          <w:szCs w:val="28"/>
+        </w:rPr>
+        <w:t xml:space="preserve">).</w:t>
       </w:r>
     </w:p>
     <w:p>
       <w:pPr>
         <w:spacing w:after="0" w:before="60" w:line="360" w:lineRule="auto"/>
-        <w:ind w:left="963"/>
+        <w:ind w:left="566"/>
       </w:pPr>
       <w:r>
         <w:rPr>
@@ -5676,6 +6310,14 @@
       </w:r>
       <w:r>
         <w:rPr>
+          <w:rFonts w:ascii="Times New Roman" w:cs="Times New Roman" w:eastAsia="Times New Roman" w:hAnsi="Times New Roman"/>
+          <w:sz w:val="28"/>
+          <w:szCs w:val="28"/>
+        </w:rPr>
+        <w:t xml:space="preserve">Hệ thống trả về danh sách → </w:t>
+      </w:r>
+      <w:r>
+        <w:rPr>
           <w:rFonts w:ascii="Courier New" w:cs="Courier New" w:eastAsia="Courier New" w:hAnsi="Courier New"/>
           <w:sz w:val="22"/>
           <w:szCs w:val="22"/>
@@ -5688,13 +6330,13 @@
           <w:sz w:val="28"/>
           <w:szCs w:val="28"/>
         </w:rPr>
-        <w:t xml:space="preserve"> — bảng danh sách SV kèm trạng thái điểm danh (hiển thị và chọn để sửa)</w:t>
+        <w:t xml:space="preserve"> hiển thị từng SV kèm trạng thái điểm danh hiện tại.</w:t>
       </w:r>
     </w:p>
     <w:p>
       <w:pPr>
         <w:spacing w:after="0" w:before="60" w:line="360" w:lineRule="auto"/>
-        <w:ind w:left="963"/>
+        <w:ind w:left="566"/>
       </w:pPr>
       <w:r>
         <w:rPr>
@@ -5706,6 +6348,30 @@
       </w:r>
       <w:r>
         <w:rPr>
+          <w:rFonts w:ascii="Times New Roman" w:cs="Times New Roman" w:eastAsia="Times New Roman" w:hAnsi="Times New Roman"/>
+          <w:sz w:val="28"/>
+          <w:szCs w:val="28"/>
+        </w:rPr>
+        <w:t xml:space="preserve">GV click vào một SV trong </w:t>
+      </w:r>
+      <w:r>
+        <w:rPr>
+          <w:rFonts w:ascii="Courier New" w:cs="Courier New" w:eastAsia="Courier New" w:hAnsi="Courier New"/>
+          <w:sz w:val="22"/>
+          <w:szCs w:val="22"/>
+        </w:rPr>
+        <w:t xml:space="preserve">outsubAttendance</w:t>
+      </w:r>
+      <w:r>
+        <w:rPr>
+          <w:rFonts w:ascii="Times New Roman" w:cs="Times New Roman" w:eastAsia="Times New Roman" w:hAnsi="Times New Roman"/>
+          <w:sz w:val="28"/>
+          <w:szCs w:val="28"/>
+        </w:rPr>
+        <w:t xml:space="preserve">, chọn trạng thái mới và click </w:t>
+      </w:r>
+      <w:r>
+        <w:rPr>
           <w:rFonts w:ascii="Courier New" w:cs="Courier New" w:eastAsia="Courier New" w:hAnsi="Courier New"/>
           <w:sz w:val="22"/>
           <w:szCs w:val="22"/>
@@ -5718,7 +6384,39 @@
           <w:sz w:val="28"/>
           <w:szCs w:val="28"/>
         </w:rPr>
-        <w:t xml:space="preserve"> — nút "Lưu" trạng thái điểm danh thủ công</w:t>
+        <w:t xml:space="preserve"> → hệ thống ghi nhận điểm danh thủ công → cần chức năng </w:t>
+      </w:r>
+      <w:r>
+        <w:rPr>
+          <w:rFonts w:ascii="Courier New" w:cs="Courier New" w:eastAsia="Courier New" w:hAnsi="Courier New"/>
+          <w:sz w:val="22"/>
+          <w:szCs w:val="22"/>
+        </w:rPr>
+        <w:t xml:space="preserve">markManualAttendance()</w:t>
+      </w:r>
+      <w:r>
+        <w:rPr>
+          <w:rFonts w:ascii="Times New Roman" w:cs="Times New Roman" w:eastAsia="Times New Roman" w:hAnsi="Times New Roman"/>
+          <w:sz w:val="28"/>
+          <w:szCs w:val="28"/>
+        </w:rPr>
+        <w:t xml:space="preserve"> → chức năng này là hành động của đối tượng thực thể </w:t>
+      </w:r>
+      <w:r>
+        <w:rPr>
+          <w:rFonts w:ascii="Courier New" w:cs="Courier New" w:eastAsia="Courier New" w:hAnsi="Courier New"/>
+          <w:sz w:val="22"/>
+          <w:szCs w:val="22"/>
+        </w:rPr>
+        <w:t xml:space="preserve">Attendance</w:t>
+      </w:r>
+      <w:r>
+        <w:rPr>
+          <w:rFonts w:ascii="Times New Roman" w:cs="Times New Roman" w:eastAsia="Times New Roman" w:hAnsi="Times New Roman"/>
+          <w:sz w:val="28"/>
+          <w:szCs w:val="28"/>
+        </w:rPr>
+        <w:t xml:space="preserve">.</w:t>
       </w:r>
     </w:p>
     <w:p>
@@ -5740,23 +6438,39 @@
           <w:sz w:val="28"/>
           <w:szCs w:val="28"/>
         </w:rPr>
-        <w:t xml:space="preserve">GV chọn buổi học qua </w:t>
-      </w:r>
-      <w:r>
-        <w:rPr>
-          <w:rFonts w:ascii="Courier New" w:cs="Courier New" w:eastAsia="Courier New" w:hAnsi="Courier New"/>
-          <w:sz w:val="22"/>
-          <w:szCs w:val="22"/>
-        </w:rPr>
-        <w:t xml:space="preserve">inSession</w:t>
-      </w:r>
-      <w:r>
-        <w:rPr>
-          <w:rFonts w:ascii="Times New Roman" w:cs="Times New Roman" w:eastAsia="Times New Roman" w:hAnsi="Times New Roman"/>
-          <w:sz w:val="28"/>
-          <w:szCs w:val="28"/>
-        </w:rPr>
-        <w:t xml:space="preserve"> → </w:t>
+        <w:t xml:space="preserve">Hệ thống thông báo cập nhật thành công, đồng thời tải lại </w:t>
+      </w:r>
+      <w:r>
+        <w:rPr>
+          <w:rFonts w:ascii="Courier New" w:cs="Courier New" w:eastAsia="Courier New" w:hAnsi="Courier New"/>
+          <w:sz w:val="22"/>
+          <w:szCs w:val="22"/>
+        </w:rPr>
+        <w:t xml:space="preserve">outsubAttendance</w:t>
+      </w:r>
+      <w:r>
+        <w:rPr>
+          <w:rFonts w:ascii="Times New Roman" w:cs="Times New Roman" w:eastAsia="Times New Roman" w:hAnsi="Times New Roman"/>
+          <w:sz w:val="28"/>
+          <w:szCs w:val="28"/>
+        </w:rPr>
+        <w:t xml:space="preserve"> thông qua hàm </w:t>
+      </w:r>
+      <w:r>
+        <w:rPr>
+          <w:rFonts w:ascii="Courier New" w:cs="Courier New" w:eastAsia="Courier New" w:hAnsi="Courier New"/>
+          <w:sz w:val="22"/>
+          <w:szCs w:val="22"/>
+        </w:rPr>
+        <w:t xml:space="preserve">viewAttendance()</w:t>
+      </w:r>
+      <w:r>
+        <w:rPr>
+          <w:rFonts w:ascii="Times New Roman" w:cs="Times New Roman" w:eastAsia="Times New Roman" w:hAnsi="Times New Roman"/>
+          <w:sz w:val="28"/>
+          <w:szCs w:val="28"/>
+        </w:rPr>
+        <w:t xml:space="preserve"> và quay về </w:t>
       </w:r>
       <w:r>
         <w:rPr>
@@ -5772,195 +6486,7 @@
           <w:sz w:val="28"/>
           <w:szCs w:val="28"/>
         </w:rPr>
-        <w:t xml:space="preserve"> gọi </w:t>
-      </w:r>
-      <w:r>
-        <w:rPr>
-          <w:rFonts w:ascii="Courier New" w:cs="Courier New" w:eastAsia="Courier New" w:hAnsi="Courier New"/>
-          <w:sz w:val="22"/>
-          <w:szCs w:val="22"/>
-        </w:rPr>
-        <w:t xml:space="preserve">viewAttendance()</w:t>
-      </w:r>
-      <w:r>
-        <w:rPr>
-          <w:rFonts w:ascii="Times New Roman" w:cs="Times New Roman" w:eastAsia="Times New Roman" w:hAnsi="Times New Roman"/>
-          <w:sz w:val="28"/>
-          <w:szCs w:val="28"/>
-        </w:rPr>
-        <w:t xml:space="preserve"> của lớp </w:t>
-      </w:r>
-      <w:r>
-        <w:rPr>
-          <w:rFonts w:ascii="Courier New" w:cs="Courier New" w:eastAsia="Courier New" w:hAnsi="Courier New"/>
-          <w:sz w:val="22"/>
-          <w:szCs w:val="22"/>
-        </w:rPr>
-        <w:t xml:space="preserve">Attendance</w:t>
-      </w:r>
-      <w:r>
-        <w:rPr>
-          <w:rFonts w:ascii="Times New Roman" w:cs="Times New Roman" w:eastAsia="Times New Roman" w:hAnsi="Times New Roman"/>
-          <w:sz w:val="28"/>
-          <w:szCs w:val="28"/>
-        </w:rPr>
-        <w:t xml:space="preserve">; kết quả hiển thị ở </w:t>
-      </w:r>
-      <w:r>
-        <w:rPr>
-          <w:rFonts w:ascii="Courier New" w:cs="Courier New" w:eastAsia="Courier New" w:hAnsi="Courier New"/>
-          <w:sz w:val="22"/>
-          <w:szCs w:val="22"/>
-        </w:rPr>
-        <w:t xml:space="preserve">outsubAttendance</w:t>
-      </w:r>
-      <w:r>
-        <w:rPr>
-          <w:rFonts w:ascii="Times New Roman" w:cs="Times New Roman" w:eastAsia="Times New Roman" w:hAnsi="Times New Roman"/>
-          <w:sz w:val="28"/>
-          <w:szCs w:val="28"/>
-        </w:rPr>
         <w:t xml:space="preserve">.</w:t>
-      </w:r>
-    </w:p>
-    <w:p>
-      <w:pPr>
-        <w:spacing w:after="0" w:before="60" w:line="360" w:lineRule="auto"/>
-        <w:ind w:left="566"/>
-      </w:pPr>
-      <w:r>
-        <w:rPr>
-          <w:rFonts w:ascii="Times New Roman" w:cs="Times New Roman" w:eastAsia="Times New Roman" w:hAnsi="Times New Roman"/>
-          <w:sz w:val="28"/>
-          <w:szCs w:val="28"/>
-        </w:rPr>
-        <w:t xml:space="preserve">• </w:t>
-      </w:r>
-      <w:r>
-        <w:rPr>
-          <w:rFonts w:ascii="Times New Roman" w:cs="Times New Roman" w:eastAsia="Times New Roman" w:hAnsi="Times New Roman"/>
-          <w:sz w:val="28"/>
-          <w:szCs w:val="28"/>
-        </w:rPr>
-        <w:t xml:space="preserve">GV chọn SV trong </w:t>
-      </w:r>
-      <w:r>
-        <w:rPr>
-          <w:rFonts w:ascii="Courier New" w:cs="Courier New" w:eastAsia="Courier New" w:hAnsi="Courier New"/>
-          <w:sz w:val="22"/>
-          <w:szCs w:val="22"/>
-        </w:rPr>
-        <w:t xml:space="preserve">outsubAttendance</w:t>
-      </w:r>
-      <w:r>
-        <w:rPr>
-          <w:rFonts w:ascii="Times New Roman" w:cs="Times New Roman" w:eastAsia="Times New Roman" w:hAnsi="Times New Roman"/>
-          <w:sz w:val="28"/>
-          <w:szCs w:val="28"/>
-        </w:rPr>
-        <w:t xml:space="preserve"> và chỉnh trạng thái → nhấn </w:t>
-      </w:r>
-      <w:r>
-        <w:rPr>
-          <w:rFonts w:ascii="Courier New" w:cs="Courier New" w:eastAsia="Courier New" w:hAnsi="Courier New"/>
-          <w:sz w:val="22"/>
-          <w:szCs w:val="22"/>
-        </w:rPr>
-        <w:t xml:space="preserve">subSaveManual</w:t>
-      </w:r>
-      <w:r>
-        <w:rPr>
-          <w:rFonts w:ascii="Times New Roman" w:cs="Times New Roman" w:eastAsia="Times New Roman" w:hAnsi="Times New Roman"/>
-          <w:sz w:val="28"/>
-          <w:szCs w:val="28"/>
-        </w:rPr>
-        <w:t xml:space="preserve"> → </w:t>
-      </w:r>
-      <w:r>
-        <w:rPr>
-          <w:rFonts w:ascii="Courier New" w:cs="Courier New" w:eastAsia="Courier New" w:hAnsi="Courier New"/>
-          <w:sz w:val="22"/>
-          <w:szCs w:val="22"/>
-        </w:rPr>
-        <w:t xml:space="preserve">AttendanceManageView</w:t>
-      </w:r>
-      <w:r>
-        <w:rPr>
-          <w:rFonts w:ascii="Times New Roman" w:cs="Times New Roman" w:eastAsia="Times New Roman" w:hAnsi="Times New Roman"/>
-          <w:sz w:val="28"/>
-          <w:szCs w:val="28"/>
-        </w:rPr>
-        <w:t xml:space="preserve"> gọi </w:t>
-      </w:r>
-      <w:r>
-        <w:rPr>
-          <w:rFonts w:ascii="Courier New" w:cs="Courier New" w:eastAsia="Courier New" w:hAnsi="Courier New"/>
-          <w:sz w:val="22"/>
-          <w:szCs w:val="22"/>
-        </w:rPr>
-        <w:t xml:space="preserve">markManualAttendance()</w:t>
-      </w:r>
-      <w:r>
-        <w:rPr>
-          <w:rFonts w:ascii="Times New Roman" w:cs="Times New Roman" w:eastAsia="Times New Roman" w:hAnsi="Times New Roman"/>
-          <w:sz w:val="28"/>
-          <w:szCs w:val="28"/>
-        </w:rPr>
-        <w:t xml:space="preserve"> của lớp </w:t>
-      </w:r>
-      <w:r>
-        <w:rPr>
-          <w:rFonts w:ascii="Courier New" w:cs="Courier New" w:eastAsia="Courier New" w:hAnsi="Courier New"/>
-          <w:sz w:val="22"/>
-          <w:szCs w:val="22"/>
-        </w:rPr>
-        <w:t xml:space="preserve">Attendance</w:t>
-      </w:r>
-      <w:r>
-        <w:rPr>
-          <w:rFonts w:ascii="Times New Roman" w:cs="Times New Roman" w:eastAsia="Times New Roman" w:hAnsi="Times New Roman"/>
-          <w:sz w:val="28"/>
-          <w:szCs w:val="28"/>
-        </w:rPr>
-        <w:t xml:space="preserve">.</w:t>
-      </w:r>
-    </w:p>
-    <w:p>
-      <w:pPr>
-        <w:spacing w:after="0" w:before="60" w:line="360" w:lineRule="auto"/>
-        <w:ind w:left="566"/>
-      </w:pPr>
-      <w:r>
-        <w:rPr>
-          <w:rFonts w:ascii="Times New Roman" w:cs="Times New Roman" w:eastAsia="Times New Roman" w:hAnsi="Times New Roman"/>
-          <w:sz w:val="28"/>
-          <w:szCs w:val="28"/>
-        </w:rPr>
-        <w:t xml:space="preserve">• </w:t>
-      </w:r>
-      <w:r>
-        <w:rPr>
-          <w:rFonts w:ascii="Times New Roman" w:cs="Times New Roman" w:eastAsia="Times New Roman" w:hAnsi="Times New Roman"/>
-          <w:sz w:val="28"/>
-          <w:szCs w:val="28"/>
-        </w:rPr>
-        <w:t xml:space="preserve">Hệ thống lưu và thông báo cập nhật thành công → </w:t>
-      </w:r>
-      <w:r>
-        <w:rPr>
-          <w:rFonts w:ascii="Courier New" w:cs="Courier New" w:eastAsia="Courier New" w:hAnsi="Courier New"/>
-          <w:sz w:val="22"/>
-          <w:szCs w:val="22"/>
-        </w:rPr>
-        <w:t xml:space="preserve">outsubAttendance</w:t>
-      </w:r>
-      <w:r>
-        <w:rPr>
-          <w:rFonts w:ascii="Times New Roman" w:cs="Times New Roman" w:eastAsia="Times New Roman" w:hAnsi="Times New Roman"/>
-          <w:sz w:val="28"/>
-          <w:szCs w:val="28"/>
-        </w:rPr>
-        <w:t xml:space="preserve"> làm mới trạng thái.</w:t>
       </w:r>
     </w:p>
     <w:p>
@@ -5976,7 +6502,7 @@
       <w:r>
         <w:drawing>
           <wp:inline distT="0" distB="0" distL="0" distR="0">
-            <wp:extent cx="5048250" cy="1990725"/>
+            <wp:extent cx="5048250" cy="2657475"/>
             <wp:effectExtent t="0" r="0" b="0" l="0"/>
             <wp:docPr id="1" name="" descr="" title=""/>
             <wp:cNvGraphicFramePr>
@@ -6001,7 +6527,7 @@
                   <pic:spPr bwMode="auto">
                     <a:xfrm>
                       <a:off x="0" y="0"/>
-                      <a:ext cx="5048250" cy="1990725"/>
+                      <a:ext cx="5048250" cy="2657475"/>
                     </a:xfrm>
                     <a:prstGeom prst="rect">
                       <a:avLst/>
@@ -6102,7 +6628,77 @@
           <w:sz w:val="28"/>
           <w:szCs w:val="28"/>
         </w:rPr>
-        <w:t xml:space="preserve">SV vào giao diện xem điểm → đề xuất lớp </w:t>
+        <w:t xml:space="preserve">Sau khi đăng nhập thành công, hệ thống hiển thị giao diện chính của sinh viên → đề xuất lớp </w:t>
+      </w:r>
+      <w:r>
+        <w:rPr>
+          <w:rFonts w:ascii="Courier New" w:cs="Courier New" w:eastAsia="Courier New" w:hAnsi="Courier New"/>
+          <w:sz w:val="22"/>
+          <w:szCs w:val="22"/>
+        </w:rPr>
+        <w:t xml:space="preserve">StudentHomeView</w:t>
+      </w:r>
+      <w:r>
+        <w:rPr>
+          <w:rFonts w:ascii="Times New Roman" w:cs="Times New Roman" w:eastAsia="Times New Roman" w:hAnsi="Times New Roman"/>
+          <w:sz w:val="28"/>
+          <w:szCs w:val="28"/>
+        </w:rPr>
+        <w:t xml:space="preserve">, có ít nhất nút xem điểm (</w:t>
+      </w:r>
+      <w:r>
+        <w:rPr>
+          <w:rFonts w:ascii="Courier New" w:cs="Courier New" w:eastAsia="Courier New" w:hAnsi="Courier New"/>
+          <w:sz w:val="22"/>
+          <w:szCs w:val="22"/>
+        </w:rPr>
+        <w:t xml:space="preserve">-subViewGrade</w:t>
+      </w:r>
+      <w:r>
+        <w:rPr>
+          <w:rFonts w:ascii="Times New Roman" w:cs="Times New Roman" w:eastAsia="Times New Roman" w:hAnsi="Times New Roman"/>
+          <w:sz w:val="28"/>
+          <w:szCs w:val="28"/>
+        </w:rPr>
+        <w:t xml:space="preserve">).</w:t>
+      </w:r>
+    </w:p>
+    <w:p>
+      <w:pPr>
+        <w:spacing w:after="0" w:before="60" w:line="360" w:lineRule="auto"/>
+        <w:ind w:left="566"/>
+      </w:pPr>
+      <w:r>
+        <w:rPr>
+          <w:rFonts w:ascii="Times New Roman" w:cs="Times New Roman" w:eastAsia="Times New Roman" w:hAnsi="Times New Roman"/>
+          <w:sz w:val="28"/>
+          <w:szCs w:val="28"/>
+        </w:rPr>
+        <w:t xml:space="preserve">• </w:t>
+      </w:r>
+      <w:r>
+        <w:rPr>
+          <w:rFonts w:ascii="Times New Roman" w:cs="Times New Roman" w:eastAsia="Times New Roman" w:hAnsi="Times New Roman"/>
+          <w:sz w:val="28"/>
+          <w:szCs w:val="28"/>
+        </w:rPr>
+        <w:t xml:space="preserve">SV click vào </w:t>
+      </w:r>
+      <w:r>
+        <w:rPr>
+          <w:rFonts w:ascii="Courier New" w:cs="Courier New" w:eastAsia="Courier New" w:hAnsi="Courier New"/>
+          <w:sz w:val="22"/>
+          <w:szCs w:val="22"/>
+        </w:rPr>
+        <w:t xml:space="preserve">subViewGrade</w:t>
+      </w:r>
+      <w:r>
+        <w:rPr>
+          <w:rFonts w:ascii="Times New Roman" w:cs="Times New Roman" w:eastAsia="Times New Roman" w:hAnsi="Times New Roman"/>
+          <w:sz w:val="28"/>
+          <w:szCs w:val="28"/>
+        </w:rPr>
+        <w:t xml:space="preserve"> → giao diện xem điểm hiện lên → đề xuất lớp </w:t>
       </w:r>
       <w:r>
         <w:rPr>
@@ -6118,13 +6714,61 @@
           <w:sz w:val="28"/>
           <w:szCs w:val="28"/>
         </w:rPr>
-        <w:t xml:space="preserve"> với:</w:t>
+        <w:t xml:space="preserve">, giao diện này chứa: danh sách lớp học phần đã đăng ký kèm điểm tổng kết (có thể chọn để xem chi tiết) (</w:t>
+      </w:r>
+      <w:r>
+        <w:rPr>
+          <w:rFonts w:ascii="Courier New" w:cs="Courier New" w:eastAsia="Courier New" w:hAnsi="Courier New"/>
+          <w:sz w:val="22"/>
+          <w:szCs w:val="22"/>
+        </w:rPr>
+        <w:t xml:space="preserve">-outsubCourseList</w:t>
+      </w:r>
+      <w:r>
+        <w:rPr>
+          <w:rFonts w:ascii="Times New Roman" w:cs="Times New Roman" w:eastAsia="Times New Roman" w:hAnsi="Times New Roman"/>
+          <w:sz w:val="28"/>
+          <w:szCs w:val="28"/>
+        </w:rPr>
+        <w:t xml:space="preserve">), bộ lọc học kỳ (</w:t>
+      </w:r>
+      <w:r>
+        <w:rPr>
+          <w:rFonts w:ascii="Courier New" w:cs="Courier New" w:eastAsia="Courier New" w:hAnsi="Courier New"/>
+          <w:sz w:val="22"/>
+          <w:szCs w:val="22"/>
+        </w:rPr>
+        <w:t xml:space="preserve">-inSemester</w:t>
+      </w:r>
+      <w:r>
+        <w:rPr>
+          <w:rFonts w:ascii="Times New Roman" w:cs="Times New Roman" w:eastAsia="Times New Roman" w:hAnsi="Times New Roman"/>
+          <w:sz w:val="28"/>
+          <w:szCs w:val="28"/>
+        </w:rPr>
+        <w:t xml:space="preserve">) và bảng chi tiết các đầu điểm theo kỳ học (</w:t>
+      </w:r>
+      <w:r>
+        <w:rPr>
+          <w:rFonts w:ascii="Courier New" w:cs="Courier New" w:eastAsia="Courier New" w:hAnsi="Courier New"/>
+          <w:sz w:val="22"/>
+          <w:szCs w:val="22"/>
+        </w:rPr>
+        <w:t xml:space="preserve">-outGradeDetail</w:t>
+      </w:r>
+      <w:r>
+        <w:rPr>
+          <w:rFonts w:ascii="Times New Roman" w:cs="Times New Roman" w:eastAsia="Times New Roman" w:hAnsi="Times New Roman"/>
+          <w:sz w:val="28"/>
+          <w:szCs w:val="28"/>
+        </w:rPr>
+        <w:t xml:space="preserve">).</w:t>
       </w:r>
     </w:p>
     <w:p>
       <w:pPr>
         <w:spacing w:after="0" w:before="60" w:line="360" w:lineRule="auto"/>
-        <w:ind w:left="963"/>
+        <w:ind w:left="566"/>
       </w:pPr>
       <w:r>
         <w:rPr>
@@ -6136,6 +6780,132 @@
       </w:r>
       <w:r>
         <w:rPr>
+          <w:rFonts w:ascii="Times New Roman" w:cs="Times New Roman" w:eastAsia="Times New Roman" w:hAnsi="Times New Roman"/>
+          <w:sz w:val="28"/>
+          <w:szCs w:val="28"/>
+        </w:rPr>
+        <w:t xml:space="preserve">Hệ thống tải danh sách lớp học phần và điểm tổng kết của SV → cần chức năng </w:t>
+      </w:r>
+      <w:r>
+        <w:rPr>
+          <w:rFonts w:ascii="Courier New" w:cs="Courier New" w:eastAsia="Courier New" w:hAnsi="Courier New"/>
+          <w:sz w:val="22"/>
+          <w:szCs w:val="22"/>
+        </w:rPr>
+        <w:t xml:space="preserve">viewGrade()</w:t>
+      </w:r>
+      <w:r>
+        <w:rPr>
+          <w:rFonts w:ascii="Times New Roman" w:cs="Times New Roman" w:eastAsia="Times New Roman" w:hAnsi="Times New Roman"/>
+          <w:sz w:val="28"/>
+          <w:szCs w:val="28"/>
+        </w:rPr>
+        <w:t xml:space="preserve"> → chức năng này là hành động của đối tượng thực thể </w:t>
+      </w:r>
+      <w:r>
+        <w:rPr>
+          <w:rFonts w:ascii="Courier New" w:cs="Courier New" w:eastAsia="Courier New" w:hAnsi="Courier New"/>
+          <w:sz w:val="22"/>
+          <w:szCs w:val="22"/>
+        </w:rPr>
+        <w:t xml:space="preserve">Grade</w:t>
+      </w:r>
+      <w:r>
+        <w:rPr>
+          <w:rFonts w:ascii="Times New Roman" w:cs="Times New Roman" w:eastAsia="Times New Roman" w:hAnsi="Times New Roman"/>
+          <w:sz w:val="28"/>
+          <w:szCs w:val="28"/>
+        </w:rPr>
+        <w:t xml:space="preserve"> (lớp này sở hữu các thuộc tính </w:t>
+      </w:r>
+      <w:r>
+        <w:rPr>
+          <w:rFonts w:ascii="Courier New" w:cs="Courier New" w:eastAsia="Courier New" w:hAnsi="Courier New"/>
+          <w:sz w:val="22"/>
+          <w:szCs w:val="22"/>
+        </w:rPr>
+        <w:t xml:space="preserve">-enrollmentId</w:t>
+      </w:r>
+      <w:r>
+        <w:rPr>
+          <w:rFonts w:ascii="Times New Roman" w:cs="Times New Roman" w:eastAsia="Times New Roman" w:hAnsi="Times New Roman"/>
+          <w:sz w:val="28"/>
+          <w:szCs w:val="28"/>
+        </w:rPr>
+        <w:t xml:space="preserve">, </w:t>
+      </w:r>
+      <w:r>
+        <w:rPr>
+          <w:rFonts w:ascii="Courier New" w:cs="Courier New" w:eastAsia="Courier New" w:hAnsi="Courier New"/>
+          <w:sz w:val="22"/>
+          <w:szCs w:val="22"/>
+        </w:rPr>
+        <w:t xml:space="preserve">-type</w:t>
+      </w:r>
+      <w:r>
+        <w:rPr>
+          <w:rFonts w:ascii="Times New Roman" w:cs="Times New Roman" w:eastAsia="Times New Roman" w:hAnsi="Times New Roman"/>
+          <w:sz w:val="28"/>
+          <w:szCs w:val="28"/>
+        </w:rPr>
+        <w:t xml:space="preserve">, </w:t>
+      </w:r>
+      <w:r>
+        <w:rPr>
+          <w:rFonts w:ascii="Courier New" w:cs="Courier New" w:eastAsia="Courier New" w:hAnsi="Courier New"/>
+          <w:sz w:val="22"/>
+          <w:szCs w:val="22"/>
+        </w:rPr>
+        <w:t xml:space="preserve">-score</w:t>
+      </w:r>
+      <w:r>
+        <w:rPr>
+          <w:rFonts w:ascii="Times New Roman" w:cs="Times New Roman" w:eastAsia="Times New Roman" w:hAnsi="Times New Roman"/>
+          <w:sz w:val="28"/>
+          <w:szCs w:val="28"/>
+        </w:rPr>
+        <w:t xml:space="preserve">, </w:t>
+      </w:r>
+      <w:r>
+        <w:rPr>
+          <w:rFonts w:ascii="Courier New" w:cs="Courier New" w:eastAsia="Courier New" w:hAnsi="Courier New"/>
+          <w:sz w:val="22"/>
+          <w:szCs w:val="22"/>
+        </w:rPr>
+        <w:t xml:space="preserve">-weight</w:t>
+      </w:r>
+      <w:r>
+        <w:rPr>
+          <w:rFonts w:ascii="Times New Roman" w:cs="Times New Roman" w:eastAsia="Times New Roman" w:hAnsi="Times New Roman"/>
+          <w:sz w:val="28"/>
+          <w:szCs w:val="28"/>
+        </w:rPr>
+        <w:t xml:space="preserve">).</w:t>
+      </w:r>
+    </w:p>
+    <w:p>
+      <w:pPr>
+        <w:spacing w:after="0" w:before="60" w:line="360" w:lineRule="auto"/>
+        <w:ind w:left="566"/>
+      </w:pPr>
+      <w:r>
+        <w:rPr>
+          <w:rFonts w:ascii="Times New Roman" w:cs="Times New Roman" w:eastAsia="Times New Roman" w:hAnsi="Times New Roman"/>
+          <w:sz w:val="28"/>
+          <w:szCs w:val="28"/>
+        </w:rPr>
+        <w:t xml:space="preserve">• </w:t>
+      </w:r>
+      <w:r>
+        <w:rPr>
+          <w:rFonts w:ascii="Times New Roman" w:cs="Times New Roman" w:eastAsia="Times New Roman" w:hAnsi="Times New Roman"/>
+          <w:sz w:val="28"/>
+          <w:szCs w:val="28"/>
+        </w:rPr>
+        <w:t xml:space="preserve">Hệ thống trả về danh sách → </w:t>
+      </w:r>
+      <w:r>
+        <w:rPr>
           <w:rFonts w:ascii="Courier New" w:cs="Courier New" w:eastAsia="Courier New" w:hAnsi="Courier New"/>
           <w:sz w:val="22"/>
           <w:szCs w:val="22"/>
@@ -6148,13 +6918,13 @@
           <w:sz w:val="28"/>
           <w:szCs w:val="28"/>
         </w:rPr>
-        <w:t xml:space="preserve"> — danh sách lớp học phần đã đăng ký kèm điểm tổng kết (hiển thị và chọn để xem chi tiết)</w:t>
+        <w:t xml:space="preserve"> hiển thị các lớp kèm điểm tổng kết tương ứng.</w:t>
       </w:r>
     </w:p>
     <w:p>
       <w:pPr>
         <w:spacing w:after="0" w:before="60" w:line="360" w:lineRule="auto"/>
-        <w:ind w:left="963"/>
+        <w:ind w:left="566"/>
       </w:pPr>
       <w:r>
         <w:rPr>
@@ -6166,6 +6936,14 @@
       </w:r>
       <w:r>
         <w:rPr>
+          <w:rFonts w:ascii="Times New Roman" w:cs="Times New Roman" w:eastAsia="Times New Roman" w:hAnsi="Times New Roman"/>
+          <w:sz w:val="28"/>
+          <w:szCs w:val="28"/>
+        </w:rPr>
+        <w:t xml:space="preserve">SV chọn học kỳ qua </w:t>
+      </w:r>
+      <w:r>
+        <w:rPr>
           <w:rFonts w:ascii="Courier New" w:cs="Courier New" w:eastAsia="Courier New" w:hAnsi="Courier New"/>
           <w:sz w:val="22"/>
           <w:szCs w:val="22"/>
@@ -6178,13 +6956,45 @@
           <w:sz w:val="28"/>
           <w:szCs w:val="28"/>
         </w:rPr>
-        <w:t xml:space="preserve"> — bộ lọc học kỳ (dropdown)</w:t>
+        <w:t xml:space="preserve"> → hệ thống lọc và hiển thị chi tiết điểm theo kỳ → cần chức năng </w:t>
+      </w:r>
+      <w:r>
+        <w:rPr>
+          <w:rFonts w:ascii="Courier New" w:cs="Courier New" w:eastAsia="Courier New" w:hAnsi="Courier New"/>
+          <w:sz w:val="22"/>
+          <w:szCs w:val="22"/>
+        </w:rPr>
+        <w:t xml:space="preserve">viewGradeBySemester()</w:t>
+      </w:r>
+      <w:r>
+        <w:rPr>
+          <w:rFonts w:ascii="Times New Roman" w:cs="Times New Roman" w:eastAsia="Times New Roman" w:hAnsi="Times New Roman"/>
+          <w:sz w:val="28"/>
+          <w:szCs w:val="28"/>
+        </w:rPr>
+        <w:t xml:space="preserve"> → chức năng này là hành động của đối tượng thực thể </w:t>
+      </w:r>
+      <w:r>
+        <w:rPr>
+          <w:rFonts w:ascii="Courier New" w:cs="Courier New" w:eastAsia="Courier New" w:hAnsi="Courier New"/>
+          <w:sz w:val="22"/>
+          <w:szCs w:val="22"/>
+        </w:rPr>
+        <w:t xml:space="preserve">Grade</w:t>
+      </w:r>
+      <w:r>
+        <w:rPr>
+          <w:rFonts w:ascii="Times New Roman" w:cs="Times New Roman" w:eastAsia="Times New Roman" w:hAnsi="Times New Roman"/>
+          <w:sz w:val="28"/>
+          <w:szCs w:val="28"/>
+        </w:rPr>
+        <w:t xml:space="preserve">.</w:t>
       </w:r>
     </w:p>
     <w:p>
       <w:pPr>
         <w:spacing w:after="0" w:before="60" w:line="360" w:lineRule="auto"/>
-        <w:ind w:left="963"/>
+        <w:ind w:left="566"/>
       </w:pPr>
       <w:r>
         <w:rPr>
@@ -6196,6 +7006,14 @@
       </w:r>
       <w:r>
         <w:rPr>
+          <w:rFonts w:ascii="Times New Roman" w:cs="Times New Roman" w:eastAsia="Times New Roman" w:hAnsi="Times New Roman"/>
+          <w:sz w:val="28"/>
+          <w:szCs w:val="28"/>
+        </w:rPr>
+        <w:t xml:space="preserve">Hệ thống trả về kết quả → </w:t>
+      </w:r>
+      <w:r>
+        <w:rPr>
           <w:rFonts w:ascii="Courier New" w:cs="Courier New" w:eastAsia="Courier New" w:hAnsi="Courier New"/>
           <w:sz w:val="22"/>
           <w:szCs w:val="22"/>
@@ -6208,195 +7026,7 @@
           <w:sz w:val="28"/>
           <w:szCs w:val="28"/>
         </w:rPr>
-        <w:t xml:space="preserve"> — bảng chi tiết các đầu điểm theo kỳ học</w:t>
-      </w:r>
-    </w:p>
-    <w:p>
-      <w:pPr>
-        <w:spacing w:after="0" w:before="60" w:line="360" w:lineRule="auto"/>
-        <w:ind w:left="566"/>
-      </w:pPr>
-      <w:r>
-        <w:rPr>
-          <w:rFonts w:ascii="Times New Roman" w:cs="Times New Roman" w:eastAsia="Times New Roman" w:hAnsi="Times New Roman"/>
-          <w:sz w:val="28"/>
-          <w:szCs w:val="28"/>
-        </w:rPr>
-        <w:t xml:space="preserve">• </w:t>
-      </w:r>
-      <w:r>
-        <w:rPr>
-          <w:rFonts w:ascii="Times New Roman" w:cs="Times New Roman" w:eastAsia="Times New Roman" w:hAnsi="Times New Roman"/>
-          <w:sz w:val="28"/>
-          <w:szCs w:val="28"/>
-        </w:rPr>
-        <w:t xml:space="preserve">SV mở trang → </w:t>
-      </w:r>
-      <w:r>
-        <w:rPr>
-          <w:rFonts w:ascii="Courier New" w:cs="Courier New" w:eastAsia="Courier New" w:hAnsi="Courier New"/>
-          <w:sz w:val="22"/>
-          <w:szCs w:val="22"/>
-        </w:rPr>
-        <w:t xml:space="preserve">GradeView</w:t>
-      </w:r>
-      <w:r>
-        <w:rPr>
-          <w:rFonts w:ascii="Times New Roman" w:cs="Times New Roman" w:eastAsia="Times New Roman" w:hAnsi="Times New Roman"/>
-          <w:sz w:val="28"/>
-          <w:szCs w:val="28"/>
-        </w:rPr>
-        <w:t xml:space="preserve"> gọi </w:t>
-      </w:r>
-      <w:r>
-        <w:rPr>
-          <w:rFonts w:ascii="Courier New" w:cs="Courier New" w:eastAsia="Courier New" w:hAnsi="Courier New"/>
-          <w:sz w:val="22"/>
-          <w:szCs w:val="22"/>
-        </w:rPr>
-        <w:t xml:space="preserve">viewGrade()</w:t>
-      </w:r>
-      <w:r>
-        <w:rPr>
-          <w:rFonts w:ascii="Times New Roman" w:cs="Times New Roman" w:eastAsia="Times New Roman" w:hAnsi="Times New Roman"/>
-          <w:sz w:val="28"/>
-          <w:szCs w:val="28"/>
-        </w:rPr>
-        <w:t xml:space="preserve"> của lớp </w:t>
-      </w:r>
-      <w:r>
-        <w:rPr>
-          <w:rFonts w:ascii="Courier New" w:cs="Courier New" w:eastAsia="Courier New" w:hAnsi="Courier New"/>
-          <w:sz w:val="22"/>
-          <w:szCs w:val="22"/>
-        </w:rPr>
-        <w:t xml:space="preserve">Grade</w:t>
-      </w:r>
-      <w:r>
-        <w:rPr>
-          <w:rFonts w:ascii="Times New Roman" w:cs="Times New Roman" w:eastAsia="Times New Roman" w:hAnsi="Times New Roman"/>
-          <w:sz w:val="28"/>
-          <w:szCs w:val="28"/>
-        </w:rPr>
-        <w:t xml:space="preserve">; kết quả hiển thị ở </w:t>
-      </w:r>
-      <w:r>
-        <w:rPr>
-          <w:rFonts w:ascii="Courier New" w:cs="Courier New" w:eastAsia="Courier New" w:hAnsi="Courier New"/>
-          <w:sz w:val="22"/>
-          <w:szCs w:val="22"/>
-        </w:rPr>
-        <w:t xml:space="preserve">outsubCourseList</w:t>
-      </w:r>
-      <w:r>
-        <w:rPr>
-          <w:rFonts w:ascii="Times New Roman" w:cs="Times New Roman" w:eastAsia="Times New Roman" w:hAnsi="Times New Roman"/>
-          <w:sz w:val="28"/>
-          <w:szCs w:val="28"/>
-        </w:rPr>
-        <w:t xml:space="preserve">.</w:t>
-      </w:r>
-    </w:p>
-    <w:p>
-      <w:pPr>
-        <w:spacing w:after="0" w:before="60" w:line="360" w:lineRule="auto"/>
-        <w:ind w:left="566"/>
-      </w:pPr>
-      <w:r>
-        <w:rPr>
-          <w:rFonts w:ascii="Times New Roman" w:cs="Times New Roman" w:eastAsia="Times New Roman" w:hAnsi="Times New Roman"/>
-          <w:sz w:val="28"/>
-          <w:szCs w:val="28"/>
-        </w:rPr>
-        <w:t xml:space="preserve">• </w:t>
-      </w:r>
-      <w:r>
-        <w:rPr>
-          <w:rFonts w:ascii="Times New Roman" w:cs="Times New Roman" w:eastAsia="Times New Roman" w:hAnsi="Times New Roman"/>
-          <w:sz w:val="28"/>
-          <w:szCs w:val="28"/>
-        </w:rPr>
-        <w:t xml:space="preserve">SV chọn học kỳ qua </w:t>
-      </w:r>
-      <w:r>
-        <w:rPr>
-          <w:rFonts w:ascii="Courier New" w:cs="Courier New" w:eastAsia="Courier New" w:hAnsi="Courier New"/>
-          <w:sz w:val="22"/>
-          <w:szCs w:val="22"/>
-        </w:rPr>
-        <w:t xml:space="preserve">inSemester</w:t>
-      </w:r>
-      <w:r>
-        <w:rPr>
-          <w:rFonts w:ascii="Times New Roman" w:cs="Times New Roman" w:eastAsia="Times New Roman" w:hAnsi="Times New Roman"/>
-          <w:sz w:val="28"/>
-          <w:szCs w:val="28"/>
-        </w:rPr>
-        <w:t xml:space="preserve"> → </w:t>
-      </w:r>
-      <w:r>
-        <w:rPr>
-          <w:rFonts w:ascii="Courier New" w:cs="Courier New" w:eastAsia="Courier New" w:hAnsi="Courier New"/>
-          <w:sz w:val="22"/>
-          <w:szCs w:val="22"/>
-        </w:rPr>
-        <w:t xml:space="preserve">GradeView</w:t>
-      </w:r>
-      <w:r>
-        <w:rPr>
-          <w:rFonts w:ascii="Times New Roman" w:cs="Times New Roman" w:eastAsia="Times New Roman" w:hAnsi="Times New Roman"/>
-          <w:sz w:val="28"/>
-          <w:szCs w:val="28"/>
-        </w:rPr>
-        <w:t xml:space="preserve"> gọi </w:t>
-      </w:r>
-      <w:r>
-        <w:rPr>
-          <w:rFonts w:ascii="Courier New" w:cs="Courier New" w:eastAsia="Courier New" w:hAnsi="Courier New"/>
-          <w:sz w:val="22"/>
-          <w:szCs w:val="22"/>
-        </w:rPr>
-        <w:t xml:space="preserve">viewGradeBySemester()</w:t>
-      </w:r>
-      <w:r>
-        <w:rPr>
-          <w:rFonts w:ascii="Times New Roman" w:cs="Times New Roman" w:eastAsia="Times New Roman" w:hAnsi="Times New Roman"/>
-          <w:sz w:val="28"/>
-          <w:szCs w:val="28"/>
-        </w:rPr>
-        <w:t xml:space="preserve"> của lớp </w:t>
-      </w:r>
-      <w:r>
-        <w:rPr>
-          <w:rFonts w:ascii="Courier New" w:cs="Courier New" w:eastAsia="Courier New" w:hAnsi="Courier New"/>
-          <w:sz w:val="22"/>
-          <w:szCs w:val="22"/>
-        </w:rPr>
-        <w:t xml:space="preserve">Grade</w:t>
-      </w:r>
-      <w:r>
-        <w:rPr>
-          <w:rFonts w:ascii="Times New Roman" w:cs="Times New Roman" w:eastAsia="Times New Roman" w:hAnsi="Times New Roman"/>
-          <w:sz w:val="28"/>
-          <w:szCs w:val="28"/>
-        </w:rPr>
-        <w:t xml:space="preserve">; kết quả hiển thị ở </w:t>
-      </w:r>
-      <w:r>
-        <w:rPr>
-          <w:rFonts w:ascii="Courier New" w:cs="Courier New" w:eastAsia="Courier New" w:hAnsi="Courier New"/>
-          <w:sz w:val="22"/>
-          <w:szCs w:val="22"/>
-        </w:rPr>
-        <w:t xml:space="preserve">outGradeDetail</w:t>
-      </w:r>
-      <w:r>
-        <w:rPr>
-          <w:rFonts w:ascii="Times New Roman" w:cs="Times New Roman" w:eastAsia="Times New Roman" w:hAnsi="Times New Roman"/>
-          <w:sz w:val="28"/>
-          <w:szCs w:val="28"/>
-        </w:rPr>
-        <w:t xml:space="preserve">.</w:t>
+        <w:t xml:space="preserve"> hiển thị bảng các đầu điểm (thường xuyên, giữa kỳ, cuối kỳ, tổng kết) của học kỳ được chọn.</w:t>
       </w:r>
     </w:p>
     <w:p>
@@ -6412,7 +7042,7 @@
       <w:r>
         <w:drawing>
           <wp:inline distT="0" distB="0" distL="0" distR="0">
-            <wp:extent cx="5048250" cy="2266950"/>
+            <wp:extent cx="5048250" cy="1895475"/>
             <wp:effectExtent t="0" r="0" b="0" l="0"/>
             <wp:docPr id="1" name="" descr="" title=""/>
             <wp:cNvGraphicFramePr>
@@ -6437,7 +7067,7 @@
                   <pic:spPr bwMode="auto">
                     <a:xfrm>
                       <a:off x="0" y="0"/>
-                      <a:ext cx="5048250" cy="2266950"/>
+                      <a:ext cx="5048250" cy="1895475"/>
                     </a:xfrm>
                     <a:prstGeom prst="rect">
                       <a:avLst/>
@@ -6538,7 +7168,77 @@
           <w:sz w:val="28"/>
           <w:szCs w:val="28"/>
         </w:rPr>
-        <w:t xml:space="preserve">GV vào giao diện nhập điểm → đề xuất lớp </w:t>
+        <w:t xml:space="preserve">Sau khi đăng nhập thành công, hệ thống hiển thị giao diện chính của giảng viên → đề xuất lớp </w:t>
+      </w:r>
+      <w:r>
+        <w:rPr>
+          <w:rFonts w:ascii="Courier New" w:cs="Courier New" w:eastAsia="Courier New" w:hAnsi="Courier New"/>
+          <w:sz w:val="22"/>
+          <w:szCs w:val="22"/>
+        </w:rPr>
+        <w:t xml:space="preserve">LecturerHomeView</w:t>
+      </w:r>
+      <w:r>
+        <w:rPr>
+          <w:rFonts w:ascii="Times New Roman" w:cs="Times New Roman" w:eastAsia="Times New Roman" w:hAnsi="Times New Roman"/>
+          <w:sz w:val="28"/>
+          <w:szCs w:val="28"/>
+        </w:rPr>
+        <w:t xml:space="preserve">, có ít nhất nút nhập điểm (</w:t>
+      </w:r>
+      <w:r>
+        <w:rPr>
+          <w:rFonts w:ascii="Courier New" w:cs="Courier New" w:eastAsia="Courier New" w:hAnsi="Courier New"/>
+          <w:sz w:val="22"/>
+          <w:szCs w:val="22"/>
+        </w:rPr>
+        <w:t xml:space="preserve">-subEnterGrade</w:t>
+      </w:r>
+      <w:r>
+        <w:rPr>
+          <w:rFonts w:ascii="Times New Roman" w:cs="Times New Roman" w:eastAsia="Times New Roman" w:hAnsi="Times New Roman"/>
+          <w:sz w:val="28"/>
+          <w:szCs w:val="28"/>
+        </w:rPr>
+        <w:t xml:space="preserve">).</w:t>
+      </w:r>
+    </w:p>
+    <w:p>
+      <w:pPr>
+        <w:spacing w:after="0" w:before="60" w:line="360" w:lineRule="auto"/>
+        <w:ind w:left="566"/>
+      </w:pPr>
+      <w:r>
+        <w:rPr>
+          <w:rFonts w:ascii="Times New Roman" w:cs="Times New Roman" w:eastAsia="Times New Roman" w:hAnsi="Times New Roman"/>
+          <w:sz w:val="28"/>
+          <w:szCs w:val="28"/>
+        </w:rPr>
+        <w:t xml:space="preserve">• </w:t>
+      </w:r>
+      <w:r>
+        <w:rPr>
+          <w:rFonts w:ascii="Times New Roman" w:cs="Times New Roman" w:eastAsia="Times New Roman" w:hAnsi="Times New Roman"/>
+          <w:sz w:val="28"/>
+          <w:szCs w:val="28"/>
+        </w:rPr>
+        <w:t xml:space="preserve">GV click vào </w:t>
+      </w:r>
+      <w:r>
+        <w:rPr>
+          <w:rFonts w:ascii="Courier New" w:cs="Courier New" w:eastAsia="Courier New" w:hAnsi="Courier New"/>
+          <w:sz w:val="22"/>
+          <w:szCs w:val="22"/>
+        </w:rPr>
+        <w:t xml:space="preserve">subEnterGrade</w:t>
+      </w:r>
+      <w:r>
+        <w:rPr>
+          <w:rFonts w:ascii="Times New Roman" w:cs="Times New Roman" w:eastAsia="Times New Roman" w:hAnsi="Times New Roman"/>
+          <w:sz w:val="28"/>
+          <w:szCs w:val="28"/>
+        </w:rPr>
+        <w:t xml:space="preserve"> → giao diện nhập/sửa điểm hiện lên → đề xuất lớp </w:t>
       </w:r>
       <w:r>
         <w:rPr>
@@ -6554,13 +7254,93 @@
           <w:sz w:val="28"/>
           <w:szCs w:val="28"/>
         </w:rPr>
-        <w:t xml:space="preserve"> với:</w:t>
+        <w:t xml:space="preserve">, giao diện này chứa: ô nhập từ khóa tìm lớp học phần (</w:t>
+      </w:r>
+      <w:r>
+        <w:rPr>
+          <w:rFonts w:ascii="Courier New" w:cs="Courier New" w:eastAsia="Courier New" w:hAnsi="Courier New"/>
+          <w:sz w:val="22"/>
+          <w:szCs w:val="22"/>
+        </w:rPr>
+        <w:t xml:space="preserve">-inClassSection</w:t>
+      </w:r>
+      <w:r>
+        <w:rPr>
+          <w:rFonts w:ascii="Times New Roman" w:cs="Times New Roman" w:eastAsia="Times New Roman" w:hAnsi="Times New Roman"/>
+          <w:sz w:val="28"/>
+          <w:szCs w:val="28"/>
+        </w:rPr>
+        <w:t xml:space="preserve">), nút tìm kiếm (</w:t>
+      </w:r>
+      <w:r>
+        <w:rPr>
+          <w:rFonts w:ascii="Courier New" w:cs="Courier New" w:eastAsia="Courier New" w:hAnsi="Courier New"/>
+          <w:sz w:val="22"/>
+          <w:szCs w:val="22"/>
+        </w:rPr>
+        <w:t xml:space="preserve">-subSearch</w:t>
+      </w:r>
+      <w:r>
+        <w:rPr>
+          <w:rFonts w:ascii="Times New Roman" w:cs="Times New Roman" w:eastAsia="Times New Roman" w:hAnsi="Times New Roman"/>
+          <w:sz w:val="28"/>
+          <w:szCs w:val="28"/>
+        </w:rPr>
+        <w:t xml:space="preserve">), bảng kết quả lớp học phần có thể chọn (</w:t>
+      </w:r>
+      <w:r>
+        <w:rPr>
+          <w:rFonts w:ascii="Courier New" w:cs="Courier New" w:eastAsia="Courier New" w:hAnsi="Courier New"/>
+          <w:sz w:val="22"/>
+          <w:szCs w:val="22"/>
+        </w:rPr>
+        <w:t xml:space="preserve">-outsubListClass</w:t>
+      </w:r>
+      <w:r>
+        <w:rPr>
+          <w:rFonts w:ascii="Times New Roman" w:cs="Times New Roman" w:eastAsia="Times New Roman" w:hAnsi="Times New Roman"/>
+          <w:sz w:val="28"/>
+          <w:szCs w:val="28"/>
+        </w:rPr>
+        <w:t xml:space="preserve">), bảng nhập điểm hiển thị điểm hiện tại và cho phép sửa inline (</w:t>
+      </w:r>
+      <w:r>
+        <w:rPr>
+          <w:rFonts w:ascii="Courier New" w:cs="Courier New" w:eastAsia="Courier New" w:hAnsi="Courier New"/>
+          <w:sz w:val="22"/>
+          <w:szCs w:val="22"/>
+        </w:rPr>
+        <w:t xml:space="preserve">-inoutGrades</w:t>
+      </w:r>
+      <w:r>
+        <w:rPr>
+          <w:rFonts w:ascii="Times New Roman" w:cs="Times New Roman" w:eastAsia="Times New Roman" w:hAnsi="Times New Roman"/>
+          <w:sz w:val="28"/>
+          <w:szCs w:val="28"/>
+        </w:rPr>
+        <w:t xml:space="preserve">) và nút xác nhận nộp điểm (</w:t>
+      </w:r>
+      <w:r>
+        <w:rPr>
+          <w:rFonts w:ascii="Courier New" w:cs="Courier New" w:eastAsia="Courier New" w:hAnsi="Courier New"/>
+          <w:sz w:val="22"/>
+          <w:szCs w:val="22"/>
+        </w:rPr>
+        <w:t xml:space="preserve">-subSubmitGrades</w:t>
+      </w:r>
+      <w:r>
+        <w:rPr>
+          <w:rFonts w:ascii="Times New Roman" w:cs="Times New Roman" w:eastAsia="Times New Roman" w:hAnsi="Times New Roman"/>
+          <w:sz w:val="28"/>
+          <w:szCs w:val="28"/>
+        </w:rPr>
+        <w:t xml:space="preserve">).</w:t>
       </w:r>
     </w:p>
     <w:p>
       <w:pPr>
         <w:spacing w:after="0" w:before="60" w:line="360" w:lineRule="auto"/>
-        <w:ind w:left="963"/>
+        <w:ind w:left="566"/>
       </w:pPr>
       <w:r>
         <w:rPr>
@@ -6572,25 +7352,113 @@
       </w:r>
       <w:r>
         <w:rPr>
-          <w:rFonts w:ascii="Courier New" w:cs="Courier New" w:eastAsia="Courier New" w:hAnsi="Courier New"/>
-          <w:sz w:val="22"/>
-          <w:szCs w:val="22"/>
-        </w:rPr>
-        <w:t xml:space="preserve">inClassSection</w:t>
-      </w:r>
-      <w:r>
-        <w:rPr>
-          <w:rFonts w:ascii="Times New Roman" w:cs="Times New Roman" w:eastAsia="Times New Roman" w:hAnsi="Times New Roman"/>
-          <w:sz w:val="28"/>
-          <w:szCs w:val="28"/>
-        </w:rPr>
-        <w:t xml:space="preserve"> — ô nhập từ khóa tìm lớp học phần</w:t>
+          <w:rFonts w:ascii="Times New Roman" w:cs="Times New Roman" w:eastAsia="Times New Roman" w:hAnsi="Times New Roman"/>
+          <w:sz w:val="28"/>
+          <w:szCs w:val="28"/>
+        </w:rPr>
+        <w:t xml:space="preserve">GV nhập từ khóa và click </w:t>
+      </w:r>
+      <w:r>
+        <w:rPr>
+          <w:rFonts w:ascii="Courier New" w:cs="Courier New" w:eastAsia="Courier New" w:hAnsi="Courier New"/>
+          <w:sz w:val="22"/>
+          <w:szCs w:val="22"/>
+        </w:rPr>
+        <w:t xml:space="preserve">subSearch</w:t>
+      </w:r>
+      <w:r>
+        <w:rPr>
+          <w:rFonts w:ascii="Times New Roman" w:cs="Times New Roman" w:eastAsia="Times New Roman" w:hAnsi="Times New Roman"/>
+          <w:sz w:val="28"/>
+          <w:szCs w:val="28"/>
+        </w:rPr>
+        <w:t xml:space="preserve"> → hệ thống tra cứu lớp học phần → cần chức năng </w:t>
+      </w:r>
+      <w:r>
+        <w:rPr>
+          <w:rFonts w:ascii="Courier New" w:cs="Courier New" w:eastAsia="Courier New" w:hAnsi="Courier New"/>
+          <w:sz w:val="22"/>
+          <w:szCs w:val="22"/>
+        </w:rPr>
+        <w:t xml:space="preserve">searchClassSection()</w:t>
+      </w:r>
+      <w:r>
+        <w:rPr>
+          <w:rFonts w:ascii="Times New Roman" w:cs="Times New Roman" w:eastAsia="Times New Roman" w:hAnsi="Times New Roman"/>
+          <w:sz w:val="28"/>
+          <w:szCs w:val="28"/>
+        </w:rPr>
+        <w:t xml:space="preserve"> → chức năng này là hành động của đối tượng thực thể </w:t>
+      </w:r>
+      <w:r>
+        <w:rPr>
+          <w:rFonts w:ascii="Courier New" w:cs="Courier New" w:eastAsia="Courier New" w:hAnsi="Courier New"/>
+          <w:sz w:val="22"/>
+          <w:szCs w:val="22"/>
+        </w:rPr>
+        <w:t xml:space="preserve">Class</w:t>
+      </w:r>
+      <w:r>
+        <w:rPr>
+          <w:rFonts w:ascii="Times New Roman" w:cs="Times New Roman" w:eastAsia="Times New Roman" w:hAnsi="Times New Roman"/>
+          <w:sz w:val="28"/>
+          <w:szCs w:val="28"/>
+        </w:rPr>
+        <w:t xml:space="preserve"> (lớp này sở hữu các thuộc tính </w:t>
+      </w:r>
+      <w:r>
+        <w:rPr>
+          <w:rFonts w:ascii="Courier New" w:cs="Courier New" w:eastAsia="Courier New" w:hAnsi="Courier New"/>
+          <w:sz w:val="22"/>
+          <w:szCs w:val="22"/>
+        </w:rPr>
+        <w:t xml:space="preserve">-classId</w:t>
+      </w:r>
+      <w:r>
+        <w:rPr>
+          <w:rFonts w:ascii="Times New Roman" w:cs="Times New Roman" w:eastAsia="Times New Roman" w:hAnsi="Times New Roman"/>
+          <w:sz w:val="28"/>
+          <w:szCs w:val="28"/>
+        </w:rPr>
+        <w:t xml:space="preserve">, </w:t>
+      </w:r>
+      <w:r>
+        <w:rPr>
+          <w:rFonts w:ascii="Courier New" w:cs="Courier New" w:eastAsia="Courier New" w:hAnsi="Courier New"/>
+          <w:sz w:val="22"/>
+          <w:szCs w:val="22"/>
+        </w:rPr>
+        <w:t xml:space="preserve">-name</w:t>
+      </w:r>
+      <w:r>
+        <w:rPr>
+          <w:rFonts w:ascii="Times New Roman" w:cs="Times New Roman" w:eastAsia="Times New Roman" w:hAnsi="Times New Roman"/>
+          <w:sz w:val="28"/>
+          <w:szCs w:val="28"/>
+        </w:rPr>
+        <w:t xml:space="preserve">, </w:t>
+      </w:r>
+      <w:r>
+        <w:rPr>
+          <w:rFonts w:ascii="Courier New" w:cs="Courier New" w:eastAsia="Courier New" w:hAnsi="Courier New"/>
+          <w:sz w:val="22"/>
+          <w:szCs w:val="22"/>
+        </w:rPr>
+        <w:t xml:space="preserve">-courseId</w:t>
+      </w:r>
+      <w:r>
+        <w:rPr>
+          <w:rFonts w:ascii="Times New Roman" w:cs="Times New Roman" w:eastAsia="Times New Roman" w:hAnsi="Times New Roman"/>
+          <w:sz w:val="28"/>
+          <w:szCs w:val="28"/>
+        </w:rPr>
+        <w:t xml:space="preserve">).</w:t>
       </w:r>
     </w:p>
     <w:p>
       <w:pPr>
         <w:spacing w:after="0" w:before="60" w:line="360" w:lineRule="auto"/>
-        <w:ind w:left="963"/>
+        <w:ind w:left="566"/>
       </w:pPr>
       <w:r>
         <w:rPr>
@@ -6602,6 +7470,14 @@
       </w:r>
       <w:r>
         <w:rPr>
+          <w:rFonts w:ascii="Times New Roman" w:cs="Times New Roman" w:eastAsia="Times New Roman" w:hAnsi="Times New Roman"/>
+          <w:sz w:val="28"/>
+          <w:szCs w:val="28"/>
+        </w:rPr>
+        <w:t xml:space="preserve">GV chọn lớp trong </w:t>
+      </w:r>
+      <w:r>
+        <w:rPr>
           <w:rFonts w:ascii="Courier New" w:cs="Courier New" w:eastAsia="Courier New" w:hAnsi="Courier New"/>
           <w:sz w:val="22"/>
           <w:szCs w:val="22"/>
@@ -6614,13 +7490,29 @@
           <w:sz w:val="28"/>
           <w:szCs w:val="28"/>
         </w:rPr>
-        <w:t xml:space="preserve"> — bảng kết quả lớp học phần (hiển thị và chọn)</w:t>
+        <w:t xml:space="preserve"> → hệ thống tải bảng sinh viên kèm điểm hiện tại vào </w:t>
+      </w:r>
+      <w:r>
+        <w:rPr>
+          <w:rFonts w:ascii="Courier New" w:cs="Courier New" w:eastAsia="Courier New" w:hAnsi="Courier New"/>
+          <w:sz w:val="22"/>
+          <w:szCs w:val="22"/>
+        </w:rPr>
+        <w:t xml:space="preserve">inoutGrades</w:t>
+      </w:r>
+      <w:r>
+        <w:rPr>
+          <w:rFonts w:ascii="Times New Roman" w:cs="Times New Roman" w:eastAsia="Times New Roman" w:hAnsi="Times New Roman"/>
+          <w:sz w:val="28"/>
+          <w:szCs w:val="28"/>
+        </w:rPr>
+        <w:t xml:space="preserve">.</w:t>
       </w:r>
     </w:p>
     <w:p>
       <w:pPr>
         <w:spacing w:after="0" w:before="60" w:line="360" w:lineRule="auto"/>
-        <w:ind w:left="963"/>
+        <w:ind w:left="566"/>
       </w:pPr>
       <w:r>
         <w:rPr>
@@ -6632,6 +7524,14 @@
       </w:r>
       <w:r>
         <w:rPr>
+          <w:rFonts w:ascii="Times New Roman" w:cs="Times New Roman" w:eastAsia="Times New Roman" w:hAnsi="Times New Roman"/>
+          <w:sz w:val="28"/>
+          <w:szCs w:val="28"/>
+        </w:rPr>
+        <w:t xml:space="preserve">GV nhập điểm mới vào các ô trong </w:t>
+      </w:r>
+      <w:r>
+        <w:rPr>
           <w:rFonts w:ascii="Courier New" w:cs="Courier New" w:eastAsia="Courier New" w:hAnsi="Courier New"/>
           <w:sz w:val="22"/>
           <w:szCs w:val="22"/>
@@ -6644,13 +7544,125 @@
           <w:sz w:val="28"/>
           <w:szCs w:val="28"/>
         </w:rPr>
-        <w:t xml:space="preserve"> — bảng nhập điểm (hiển thị điểm hiện tại và cho phép nhập/sửa inline)</w:t>
+        <w:t xml:space="preserve"> và click </w:t>
+      </w:r>
+      <w:r>
+        <w:rPr>
+          <w:rFonts w:ascii="Courier New" w:cs="Courier New" w:eastAsia="Courier New" w:hAnsi="Courier New"/>
+          <w:sz w:val="22"/>
+          <w:szCs w:val="22"/>
+        </w:rPr>
+        <w:t xml:space="preserve">subSubmitGrades</w:t>
+      </w:r>
+      <w:r>
+        <w:rPr>
+          <w:rFonts w:ascii="Times New Roman" w:cs="Times New Roman" w:eastAsia="Times New Roman" w:hAnsi="Times New Roman"/>
+          <w:sz w:val="28"/>
+          <w:szCs w:val="28"/>
+        </w:rPr>
+        <w:t xml:space="preserve"> → hệ thống lưu điểm → cần chức năng </w:t>
+      </w:r>
+      <w:r>
+        <w:rPr>
+          <w:rFonts w:ascii="Courier New" w:cs="Courier New" w:eastAsia="Courier New" w:hAnsi="Courier New"/>
+          <w:sz w:val="22"/>
+          <w:szCs w:val="22"/>
+        </w:rPr>
+        <w:t xml:space="preserve">enterGrade()</w:t>
+      </w:r>
+      <w:r>
+        <w:rPr>
+          <w:rFonts w:ascii="Times New Roman" w:cs="Times New Roman" w:eastAsia="Times New Roman" w:hAnsi="Times New Roman"/>
+          <w:sz w:val="28"/>
+          <w:szCs w:val="28"/>
+        </w:rPr>
+        <w:t xml:space="preserve"> → chức năng này là hành động của đối tượng thực thể </w:t>
+      </w:r>
+      <w:r>
+        <w:rPr>
+          <w:rFonts w:ascii="Courier New" w:cs="Courier New" w:eastAsia="Courier New" w:hAnsi="Courier New"/>
+          <w:sz w:val="22"/>
+          <w:szCs w:val="22"/>
+        </w:rPr>
+        <w:t xml:space="preserve">Grade</w:t>
+      </w:r>
+      <w:r>
+        <w:rPr>
+          <w:rFonts w:ascii="Times New Roman" w:cs="Times New Roman" w:eastAsia="Times New Roman" w:hAnsi="Times New Roman"/>
+          <w:sz w:val="28"/>
+          <w:szCs w:val="28"/>
+        </w:rPr>
+        <w:t xml:space="preserve"> (lớp này sở hữu các thuộc tính </w:t>
+      </w:r>
+      <w:r>
+        <w:rPr>
+          <w:rFonts w:ascii="Courier New" w:cs="Courier New" w:eastAsia="Courier New" w:hAnsi="Courier New"/>
+          <w:sz w:val="22"/>
+          <w:szCs w:val="22"/>
+        </w:rPr>
+        <w:t xml:space="preserve">-enrollmentId</w:t>
+      </w:r>
+      <w:r>
+        <w:rPr>
+          <w:rFonts w:ascii="Times New Roman" w:cs="Times New Roman" w:eastAsia="Times New Roman" w:hAnsi="Times New Roman"/>
+          <w:sz w:val="28"/>
+          <w:szCs w:val="28"/>
+        </w:rPr>
+        <w:t xml:space="preserve">, </w:t>
+      </w:r>
+      <w:r>
+        <w:rPr>
+          <w:rFonts w:ascii="Courier New" w:cs="Courier New" w:eastAsia="Courier New" w:hAnsi="Courier New"/>
+          <w:sz w:val="22"/>
+          <w:szCs w:val="22"/>
+        </w:rPr>
+        <w:t xml:space="preserve">-type</w:t>
+      </w:r>
+      <w:r>
+        <w:rPr>
+          <w:rFonts w:ascii="Times New Roman" w:cs="Times New Roman" w:eastAsia="Times New Roman" w:hAnsi="Times New Roman"/>
+          <w:sz w:val="28"/>
+          <w:szCs w:val="28"/>
+        </w:rPr>
+        <w:t xml:space="preserve">, </w:t>
+      </w:r>
+      <w:r>
+        <w:rPr>
+          <w:rFonts w:ascii="Courier New" w:cs="Courier New" w:eastAsia="Courier New" w:hAnsi="Courier New"/>
+          <w:sz w:val="22"/>
+          <w:szCs w:val="22"/>
+        </w:rPr>
+        <w:t xml:space="preserve">-score</w:t>
+      </w:r>
+      <w:r>
+        <w:rPr>
+          <w:rFonts w:ascii="Times New Roman" w:cs="Times New Roman" w:eastAsia="Times New Roman" w:hAnsi="Times New Roman"/>
+          <w:sz w:val="28"/>
+          <w:szCs w:val="28"/>
+        </w:rPr>
+        <w:t xml:space="preserve">, </w:t>
+      </w:r>
+      <w:r>
+        <w:rPr>
+          <w:rFonts w:ascii="Courier New" w:cs="Courier New" w:eastAsia="Courier New" w:hAnsi="Courier New"/>
+          <w:sz w:val="22"/>
+          <w:szCs w:val="22"/>
+        </w:rPr>
+        <w:t xml:space="preserve">-weight</w:t>
+      </w:r>
+      <w:r>
+        <w:rPr>
+          <w:rFonts w:ascii="Times New Roman" w:cs="Times New Roman" w:eastAsia="Times New Roman" w:hAnsi="Times New Roman"/>
+          <w:sz w:val="28"/>
+          <w:szCs w:val="28"/>
+        </w:rPr>
+        <w:t xml:space="preserve">).</w:t>
       </w:r>
     </w:p>
     <w:p>
       <w:pPr>
         <w:spacing w:after="0" w:before="60" w:line="360" w:lineRule="auto"/>
-        <w:ind w:left="963"/>
+        <w:ind w:left="566"/>
       </w:pPr>
       <w:r>
         <w:rPr>
@@ -6662,6 +7674,68 @@
       </w:r>
       <w:r>
         <w:rPr>
+          <w:rFonts w:ascii="Times New Roman" w:cs="Times New Roman" w:eastAsia="Times New Roman" w:hAnsi="Times New Roman"/>
+          <w:sz w:val="28"/>
+          <w:szCs w:val="28"/>
+        </w:rPr>
+        <w:t xml:space="preserve">Hệ thống thông báo nộp điểm thành công và tải lại </w:t>
+      </w:r>
+      <w:r>
+        <w:rPr>
+          <w:rFonts w:ascii="Courier New" w:cs="Courier New" w:eastAsia="Courier New" w:hAnsi="Courier New"/>
+          <w:sz w:val="22"/>
+          <w:szCs w:val="22"/>
+        </w:rPr>
+        <w:t xml:space="preserve">inoutGrades</w:t>
+      </w:r>
+      <w:r>
+        <w:rPr>
+          <w:rFonts w:ascii="Times New Roman" w:cs="Times New Roman" w:eastAsia="Times New Roman" w:hAnsi="Times New Roman"/>
+          <w:sz w:val="28"/>
+          <w:szCs w:val="28"/>
+        </w:rPr>
+        <w:t xml:space="preserve"> thông qua hàm </w:t>
+      </w:r>
+      <w:r>
+        <w:rPr>
+          <w:rFonts w:ascii="Courier New" w:cs="Courier New" w:eastAsia="Courier New" w:hAnsi="Courier New"/>
+          <w:sz w:val="22"/>
+          <w:szCs w:val="22"/>
+        </w:rPr>
+        <w:t xml:space="preserve">enterGrade()</w:t>
+      </w:r>
+      <w:r>
+        <w:rPr>
+          <w:rFonts w:ascii="Times New Roman" w:cs="Times New Roman" w:eastAsia="Times New Roman" w:hAnsi="Times New Roman"/>
+          <w:sz w:val="28"/>
+          <w:szCs w:val="28"/>
+        </w:rPr>
+        <w:t xml:space="preserve">.</w:t>
+      </w:r>
+    </w:p>
+    <w:p>
+      <w:pPr>
+        <w:spacing w:after="0" w:before="60" w:line="360" w:lineRule="auto"/>
+        <w:ind w:left="566"/>
+      </w:pPr>
+      <w:r>
+        <w:rPr>
+          <w:rFonts w:ascii="Times New Roman" w:cs="Times New Roman" w:eastAsia="Times New Roman" w:hAnsi="Times New Roman"/>
+          <w:sz w:val="28"/>
+          <w:szCs w:val="28"/>
+        </w:rPr>
+        <w:t xml:space="preserve">• </w:t>
+      </w:r>
+      <w:r>
+        <w:rPr>
+          <w:rFonts w:ascii="Times New Roman" w:cs="Times New Roman" w:eastAsia="Times New Roman" w:hAnsi="Times New Roman"/>
+          <w:sz w:val="28"/>
+          <w:szCs w:val="28"/>
+        </w:rPr>
+        <w:t xml:space="preserve">Khi GV sửa điểm đã nhập, click </w:t>
+      </w:r>
+      <w:r>
+        <w:rPr>
           <w:rFonts w:ascii="Courier New" w:cs="Courier New" w:eastAsia="Courier New" w:hAnsi="Courier New"/>
           <w:sz w:val="22"/>
           <w:szCs w:val="22"/>
@@ -6674,7 +7748,39 @@
           <w:sz w:val="28"/>
           <w:szCs w:val="28"/>
         </w:rPr>
-        <w:t xml:space="preserve"> — nút "Xác nhận nộp điểm"</w:t>
+        <w:t xml:space="preserve"> → hệ thống cập nhật điểm → cần chức năng </w:t>
+      </w:r>
+      <w:r>
+        <w:rPr>
+          <w:rFonts w:ascii="Courier New" w:cs="Courier New" w:eastAsia="Courier New" w:hAnsi="Courier New"/>
+          <w:sz w:val="22"/>
+          <w:szCs w:val="22"/>
+        </w:rPr>
+        <w:t xml:space="preserve">editGrade()</w:t>
+      </w:r>
+      <w:r>
+        <w:rPr>
+          <w:rFonts w:ascii="Times New Roman" w:cs="Times New Roman" w:eastAsia="Times New Roman" w:hAnsi="Times New Roman"/>
+          <w:sz w:val="28"/>
+          <w:szCs w:val="28"/>
+        </w:rPr>
+        <w:t xml:space="preserve"> của đối tượng thực thể </w:t>
+      </w:r>
+      <w:r>
+        <w:rPr>
+          <w:rFonts w:ascii="Courier New" w:cs="Courier New" w:eastAsia="Courier New" w:hAnsi="Courier New"/>
+          <w:sz w:val="22"/>
+          <w:szCs w:val="22"/>
+        </w:rPr>
+        <w:t xml:space="preserve">Grade</w:t>
+      </w:r>
+      <w:r>
+        <w:rPr>
+          <w:rFonts w:ascii="Times New Roman" w:cs="Times New Roman" w:eastAsia="Times New Roman" w:hAnsi="Times New Roman"/>
+          <w:sz w:val="28"/>
+          <w:szCs w:val="28"/>
+        </w:rPr>
+        <w:t xml:space="preserve">.</w:t>
       </w:r>
     </w:p>
     <w:p>
@@ -6696,23 +7802,7 @@
           <w:sz w:val="28"/>
           <w:szCs w:val="28"/>
         </w:rPr>
-        <w:t xml:space="preserve">GV nhập từ khóa vào </w:t>
-      </w:r>
-      <w:r>
-        <w:rPr>
-          <w:rFonts w:ascii="Courier New" w:cs="Courier New" w:eastAsia="Courier New" w:hAnsi="Courier New"/>
-          <w:sz w:val="22"/>
-          <w:szCs w:val="22"/>
-        </w:rPr>
-        <w:t xml:space="preserve">inClassSection</w:t>
-      </w:r>
-      <w:r>
-        <w:rPr>
-          <w:rFonts w:ascii="Times New Roman" w:cs="Times New Roman" w:eastAsia="Times New Roman" w:hAnsi="Times New Roman"/>
-          <w:sz w:val="28"/>
-          <w:szCs w:val="28"/>
-        </w:rPr>
-        <w:t xml:space="preserve"> và nhấn tìm → </w:t>
+        <w:t xml:space="preserve">Hệ thống thông báo cập nhật điểm thành công và quay về </w:t>
       </w:r>
       <w:r>
         <w:rPr>
@@ -6728,233 +7818,7 @@
           <w:sz w:val="28"/>
           <w:szCs w:val="28"/>
         </w:rPr>
-        <w:t xml:space="preserve"> gọi </w:t>
-      </w:r>
-      <w:r>
-        <w:rPr>
-          <w:rFonts w:ascii="Courier New" w:cs="Courier New" w:eastAsia="Courier New" w:hAnsi="Courier New"/>
-          <w:sz w:val="22"/>
-          <w:szCs w:val="22"/>
-        </w:rPr>
-        <w:t xml:space="preserve">searchClassSection()</w:t>
-      </w:r>
-      <w:r>
-        <w:rPr>
-          <w:rFonts w:ascii="Times New Roman" w:cs="Times New Roman" w:eastAsia="Times New Roman" w:hAnsi="Times New Roman"/>
-          <w:sz w:val="28"/>
-          <w:szCs w:val="28"/>
-        </w:rPr>
-        <w:t xml:space="preserve"> của lớp </w:t>
-      </w:r>
-      <w:r>
-        <w:rPr>
-          <w:rFonts w:ascii="Courier New" w:cs="Courier New" w:eastAsia="Courier New" w:hAnsi="Courier New"/>
-          <w:sz w:val="22"/>
-          <w:szCs w:val="22"/>
-        </w:rPr>
-        <w:t xml:space="preserve">Class</w:t>
-      </w:r>
-      <w:r>
-        <w:rPr>
-          <w:rFonts w:ascii="Times New Roman" w:cs="Times New Roman" w:eastAsia="Times New Roman" w:hAnsi="Times New Roman"/>
-          <w:sz w:val="28"/>
-          <w:szCs w:val="28"/>
-        </w:rPr>
-        <w:t xml:space="preserve">; kết quả hiển thị ở </w:t>
-      </w:r>
-      <w:r>
-        <w:rPr>
-          <w:rFonts w:ascii="Courier New" w:cs="Courier New" w:eastAsia="Courier New" w:hAnsi="Courier New"/>
-          <w:sz w:val="22"/>
-          <w:szCs w:val="22"/>
-        </w:rPr>
-        <w:t xml:space="preserve">outsubListClass</w:t>
-      </w:r>
-      <w:r>
-        <w:rPr>
-          <w:rFonts w:ascii="Times New Roman" w:cs="Times New Roman" w:eastAsia="Times New Roman" w:hAnsi="Times New Roman"/>
-          <w:sz w:val="28"/>
-          <w:szCs w:val="28"/>
-        </w:rPr>
         <w:t xml:space="preserve">.</w:t>
-      </w:r>
-    </w:p>
-    <w:p>
-      <w:pPr>
-        <w:spacing w:after="0" w:before="60" w:line="360" w:lineRule="auto"/>
-        <w:ind w:left="566"/>
-      </w:pPr>
-      <w:r>
-        <w:rPr>
-          <w:rFonts w:ascii="Times New Roman" w:cs="Times New Roman" w:eastAsia="Times New Roman" w:hAnsi="Times New Roman"/>
-          <w:sz w:val="28"/>
-          <w:szCs w:val="28"/>
-        </w:rPr>
-        <w:t xml:space="preserve">• </w:t>
-      </w:r>
-      <w:r>
-        <w:rPr>
-          <w:rFonts w:ascii="Times New Roman" w:cs="Times New Roman" w:eastAsia="Times New Roman" w:hAnsi="Times New Roman"/>
-          <w:sz w:val="28"/>
-          <w:szCs w:val="28"/>
-        </w:rPr>
-        <w:t xml:space="preserve">GV chọn lớp → hệ thống tải bảng SV vào </w:t>
-      </w:r>
-      <w:r>
-        <w:rPr>
-          <w:rFonts w:ascii="Courier New" w:cs="Courier New" w:eastAsia="Courier New" w:hAnsi="Courier New"/>
-          <w:sz w:val="22"/>
-          <w:szCs w:val="22"/>
-        </w:rPr>
-        <w:t xml:space="preserve">inoutGrades</w:t>
-      </w:r>
-      <w:r>
-        <w:rPr>
-          <w:rFonts w:ascii="Times New Roman" w:cs="Times New Roman" w:eastAsia="Times New Roman" w:hAnsi="Times New Roman"/>
-          <w:sz w:val="28"/>
-          <w:szCs w:val="28"/>
-        </w:rPr>
-        <w:t xml:space="preserve">.</w:t>
-      </w:r>
-    </w:p>
-    <w:p>
-      <w:pPr>
-        <w:spacing w:after="0" w:before="60" w:line="360" w:lineRule="auto"/>
-        <w:ind w:left="566"/>
-      </w:pPr>
-      <w:r>
-        <w:rPr>
-          <w:rFonts w:ascii="Times New Roman" w:cs="Times New Roman" w:eastAsia="Times New Roman" w:hAnsi="Times New Roman"/>
-          <w:sz w:val="28"/>
-          <w:szCs w:val="28"/>
-        </w:rPr>
-        <w:t xml:space="preserve">• </w:t>
-      </w:r>
-      <w:r>
-        <w:rPr>
-          <w:rFonts w:ascii="Times New Roman" w:cs="Times New Roman" w:eastAsia="Times New Roman" w:hAnsi="Times New Roman"/>
-          <w:sz w:val="28"/>
-          <w:szCs w:val="28"/>
-        </w:rPr>
-        <w:t xml:space="preserve">GV nhập/sửa điểm trong </w:t>
-      </w:r>
-      <w:r>
-        <w:rPr>
-          <w:rFonts w:ascii="Courier New" w:cs="Courier New" w:eastAsia="Courier New" w:hAnsi="Courier New"/>
-          <w:sz w:val="22"/>
-          <w:szCs w:val="22"/>
-        </w:rPr>
-        <w:t xml:space="preserve">inoutGrades</w:t>
-      </w:r>
-      <w:r>
-        <w:rPr>
-          <w:rFonts w:ascii="Times New Roman" w:cs="Times New Roman" w:eastAsia="Times New Roman" w:hAnsi="Times New Roman"/>
-          <w:sz w:val="28"/>
-          <w:szCs w:val="28"/>
-        </w:rPr>
-        <w:t xml:space="preserve"> và nhấn </w:t>
-      </w:r>
-      <w:r>
-        <w:rPr>
-          <w:rFonts w:ascii="Courier New" w:cs="Courier New" w:eastAsia="Courier New" w:hAnsi="Courier New"/>
-          <w:sz w:val="22"/>
-          <w:szCs w:val="22"/>
-        </w:rPr>
-        <w:t xml:space="preserve">subSubmitGrades</w:t>
-      </w:r>
-      <w:r>
-        <w:rPr>
-          <w:rFonts w:ascii="Times New Roman" w:cs="Times New Roman" w:eastAsia="Times New Roman" w:hAnsi="Times New Roman"/>
-          <w:sz w:val="28"/>
-          <w:szCs w:val="28"/>
-        </w:rPr>
-        <w:t xml:space="preserve"> → </w:t>
-      </w:r>
-      <w:r>
-        <w:rPr>
-          <w:rFonts w:ascii="Courier New" w:cs="Courier New" w:eastAsia="Courier New" w:hAnsi="Courier New"/>
-          <w:sz w:val="22"/>
-          <w:szCs w:val="22"/>
-        </w:rPr>
-        <w:t xml:space="preserve">GradeEntryView</w:t>
-      </w:r>
-      <w:r>
-        <w:rPr>
-          <w:rFonts w:ascii="Times New Roman" w:cs="Times New Roman" w:eastAsia="Times New Roman" w:hAnsi="Times New Roman"/>
-          <w:sz w:val="28"/>
-          <w:szCs w:val="28"/>
-        </w:rPr>
-        <w:t xml:space="preserve"> gọi </w:t>
-      </w:r>
-      <w:r>
-        <w:rPr>
-          <w:rFonts w:ascii="Courier New" w:cs="Courier New" w:eastAsia="Courier New" w:hAnsi="Courier New"/>
-          <w:sz w:val="22"/>
-          <w:szCs w:val="22"/>
-        </w:rPr>
-        <w:t xml:space="preserve">enterGrade()</w:t>
-      </w:r>
-      <w:r>
-        <w:rPr>
-          <w:rFonts w:ascii="Times New Roman" w:cs="Times New Roman" w:eastAsia="Times New Roman" w:hAnsi="Times New Roman"/>
-          <w:sz w:val="28"/>
-          <w:szCs w:val="28"/>
-        </w:rPr>
-        <w:t xml:space="preserve"> hoặc </w:t>
-      </w:r>
-      <w:r>
-        <w:rPr>
-          <w:rFonts w:ascii="Courier New" w:cs="Courier New" w:eastAsia="Courier New" w:hAnsi="Courier New"/>
-          <w:sz w:val="22"/>
-          <w:szCs w:val="22"/>
-        </w:rPr>
-        <w:t xml:space="preserve">editGrade()</w:t>
-      </w:r>
-      <w:r>
-        <w:rPr>
-          <w:rFonts w:ascii="Times New Roman" w:cs="Times New Roman" w:eastAsia="Times New Roman" w:hAnsi="Times New Roman"/>
-          <w:sz w:val="28"/>
-          <w:szCs w:val="28"/>
-        </w:rPr>
-        <w:t xml:space="preserve"> của lớp </w:t>
-      </w:r>
-      <w:r>
-        <w:rPr>
-          <w:rFonts w:ascii="Courier New" w:cs="Courier New" w:eastAsia="Courier New" w:hAnsi="Courier New"/>
-          <w:sz w:val="22"/>
-          <w:szCs w:val="22"/>
-        </w:rPr>
-        <w:t xml:space="preserve">Grade</w:t>
-      </w:r>
-      <w:r>
-        <w:rPr>
-          <w:rFonts w:ascii="Times New Roman" w:cs="Times New Roman" w:eastAsia="Times New Roman" w:hAnsi="Times New Roman"/>
-          <w:sz w:val="28"/>
-          <w:szCs w:val="28"/>
-        </w:rPr>
-        <w:t xml:space="preserve">.</w:t>
-      </w:r>
-    </w:p>
-    <w:p>
-      <w:pPr>
-        <w:spacing w:after="0" w:before="60" w:line="360" w:lineRule="auto"/>
-        <w:ind w:left="566"/>
-      </w:pPr>
-      <w:r>
-        <w:rPr>
-          <w:rFonts w:ascii="Times New Roman" w:cs="Times New Roman" w:eastAsia="Times New Roman" w:hAnsi="Times New Roman"/>
-          <w:sz w:val="28"/>
-          <w:szCs w:val="28"/>
-        </w:rPr>
-        <w:t xml:space="preserve">• </w:t>
-      </w:r>
-      <w:r>
-        <w:rPr>
-          <w:rFonts w:ascii="Times New Roman" w:cs="Times New Roman" w:eastAsia="Times New Roman" w:hAnsi="Times New Roman"/>
-          <w:sz w:val="28"/>
-          <w:szCs w:val="28"/>
-        </w:rPr>
-        <w:t xml:space="preserve">Hệ thống lưu và thông báo thành công.</w:t>
       </w:r>
     </w:p>
     <w:p>
@@ -6970,7 +7834,7 @@
       <w:r>
         <w:drawing>
           <wp:inline distT="0" distB="0" distL="0" distR="0">
-            <wp:extent cx="5048250" cy="3333750"/>
+            <wp:extent cx="5048250" cy="3076575"/>
             <wp:effectExtent t="0" r="0" b="0" l="0"/>
             <wp:docPr id="1" name="" descr="" title=""/>
             <wp:cNvGraphicFramePr>
@@ -6995,7 +7859,7 @@
                   <pic:spPr bwMode="auto">
                     <a:xfrm>
                       <a:off x="0" y="0"/>
-                      <a:ext cx="5048250" cy="3333750"/>
+                      <a:ext cx="5048250" cy="3076575"/>
                     </a:xfrm>
                     <a:prstGeom prst="rect">
                       <a:avLst/>

</xml_diff>